<commit_message>
docs: create Arabic final technical report
</commit_message>
<xml_diff>
--- a/docs/Technical-Report.docx
+++ b/docs/Technical-Report.docx
@@ -7,7 +7,7 @@
         <w:pStyle w:val="Title"/>
       </w:pPr>
       <w:r>
-        <w:t xml:space="preserve">Technical Report: Cloud Computing &amp; Containerization</w:t>
+        <w:t xml:space="preserve">التقرير الفني النهائي لمشروع الحوسبة السحابية والحاويات</w:t>
       </w:r>
     </w:p>
     <w:p>
@@ -15,7 +15,79 @@
         <w:pStyle w:val="Subtitle"/>
       </w:pPr>
       <w:r>
-        <w:t xml:space="preserve">Final Course Project - Task Management API</w:t>
+        <w:t xml:space="preserve">نظام إدارة المهام باستخدام Docker وREST API</w:t>
+      </w:r>
+    </w:p>
+    <w:p>
+      <w:pPr>
+        <w:pStyle w:val="Author"/>
+      </w:pPr>
+      <w:r>
+        <w:t xml:space="preserve">اسم المقرر: حوسبة سحابية</w:t>
+      </w:r>
+    </w:p>
+    <w:p>
+      <w:pPr>
+        <w:pStyle w:val="Author"/>
+      </w:pPr>
+      <w:r>
+        <w:t xml:space="preserve">اسم المشروع: Task Management API</w:t>
+      </w:r>
+    </w:p>
+    <w:p>
+      <w:pPr>
+        <w:pStyle w:val="Author"/>
+      </w:pPr>
+      <w:r>
+        <w:t xml:space="preserve">أعضاء الفريق:</w:t>
+      </w:r>
+    </w:p>
+    <w:p>
+      <w:pPr>
+        <w:pStyle w:val="Author"/>
+      </w:pPr>
+      <w:r>
+        <w:t xml:space="preserve">1. [اسم عضو الفريق الأول]</w:t>
+      </w:r>
+    </w:p>
+    <w:p>
+      <w:pPr>
+        <w:pStyle w:val="Author"/>
+      </w:pPr>
+      <w:r>
+        <w:t xml:space="preserve">2. [اسم عضو الفريق الثاني]</w:t>
+      </w:r>
+    </w:p>
+    <w:p>
+      <w:pPr>
+        <w:pStyle w:val="Author"/>
+      </w:pPr>
+      <w:r>
+        <w:t xml:space="preserve">3. [اسم عضو الفريق الثالث]</w:t>
+      </w:r>
+    </w:p>
+    <w:p>
+      <w:pPr>
+        <w:pStyle w:val="Author"/>
+      </w:pPr>
+      <w:r>
+        <w:t xml:space="preserve">4. [اسم عضو الفريق الرابع]</w:t>
+      </w:r>
+    </w:p>
+    <w:p>
+      <w:pPr>
+        <w:pStyle w:val="Author"/>
+      </w:pPr>
+      <w:r>
+        <w:t xml:space="preserve">الدكتور: [اسم الدكتور]</w:t>
+      </w:r>
+    </w:p>
+    <w:p>
+      <w:pPr>
+        <w:pStyle w:val="Author"/>
+      </w:pPr>
+      <w:r>
+        <w:t xml:space="preserve">الجامعة: [اسم الجامعة]</w:t>
       </w:r>
     </w:p>
     <w:p>
@@ -52,7 +124,7 @@
         </w:p>
       </w:sdtContent>
     </w:sdt>
-    <w:bookmarkStart w:id="9" w:name="executive-summary"/>
+    <w:bookmarkStart w:id="9" w:name="الملخص-التنفيذي-executive-summary"/>
     <w:p>
       <w:pPr>
         <w:pStyle w:val="Heading1"/>
@@ -67,7 +139,7 @@
         <w:tab/>
       </w:r>
       <w:r>
-        <w:t xml:space="preserve">Executive Summary</w:t>
+        <w:t xml:space="preserve">1. الملخص التنفيذي (Executive Summary)</w:t>
       </w:r>
     </w:p>
     <w:p>
@@ -75,11 +147,23 @@
         <w:pStyle w:val="FirstParagraph"/>
       </w:pPr>
       <w:r>
-        <w:t xml:space="preserve">This report documents the architecture, implementation, and verification of the Task Management API, a containerized Cloud Computing final project. The project demonstrates a modern microservices-oriented approach using Node.js for the API, PostgreSQL for relational data storage, and Nginx as a reverse proxy. By leveraging Docker and Docker Compose, the system achieves consistent deployment, high isolation, and reliable persistence. All components have been securely configured, tested for failure modes, and versioned on Docker Hub.</w:t>
+        <w:t xml:space="preserve">يقدم هذا التقرير تفصيلاً فنياً لتصميم وبناء نظام إدارة المهام (Task Management API). يهدف المشروع إلى حل مشكلة عدم توافق بيئات التشغيل (Environment Inconsistency) وتعقيد النشر (Deployment Complexity) من خلال استخدام تقنية الحاويات (Containerization) ممثلة في Docker.</w:t>
+      </w:r>
+      <w:r>
+        <w:t xml:space="preserve"> </w:t>
+      </w:r>
+      <w:r>
+        <w:t xml:space="preserve">يتكون النظام من واجهة برمجة تطبيقات (REST API) مبرمجة باستخدام Node.js وإطار العمل Express، والتي تتواصل مع قاعدة بيانات علائقية (Relational Database) ممثلة في PostgreSQL. ولضمان الأمان وتوجيه الطلبات بشكل مركزي، تم استخدام وكيل عكسي (Reverse Proxy) بواسطة Nginx.</w:t>
+      </w:r>
+      <w:r>
+        <w:t xml:space="preserve"> </w:t>
+      </w:r>
+      <w:r>
+        <w:t xml:space="preserve">استُخدم Docker Compose لربط هذه المكونات معاً لتشغيلها كبيئة واحدة معزولة، وتمت محاكاة سيناريوهات الفشل (Failure Modes) وإثبات استمرارية البيانات (Persistence). وأخيراً، تم رفع صورة النظام (Docker Image) إلى السجل العام (Docker Hub) لضمان سهولة التوزيع.</w:t>
       </w:r>
     </w:p>
     <w:bookmarkEnd w:id="9"/>
-    <w:bookmarkStart w:id="10" w:name="team-contributions"/>
+    <w:bookmarkStart w:id="10" w:name="أهداف-المشروع"/>
     <w:p>
       <w:pPr>
         <w:pStyle w:val="Heading1"/>
@@ -94,7 +178,7 @@
         <w:tab/>
       </w:r>
       <w:r>
-        <w:t xml:space="preserve">Team Contributions</w:t>
+        <w:t xml:space="preserve">2. أهداف المشروع</w:t>
       </w:r>
     </w:p>
     <w:p>
@@ -102,7 +186,278 @@
         <w:pStyle w:val="FirstParagraph"/>
       </w:pPr>
       <w:r>
-        <w:t xml:space="preserve">Team member names/contribution allocation require completion before final submission.</w:t>
+        <w:t xml:space="preserve">يهدف هذا المشروع إلى تحقيق عدة مخرجات تعليمية وهندسية أساسية، تشمل:</w:t>
+      </w:r>
+      <w:r>
+        <w:t xml:space="preserve"> </w:t>
+      </w:r>
+      <w:r>
+        <w:t xml:space="preserve">-</w:t>
+      </w:r>
+      <w:r>
+        <w:t xml:space="preserve"> </w:t>
+      </w:r>
+      <w:r>
+        <w:rPr>
+          <w:b/>
+          <w:bCs/>
+        </w:rPr>
+        <w:t xml:space="preserve">بناء REST API</w:t>
+      </w:r>
+      <w:r>
+        <w:t xml:space="preserve">: تطبيق عمليات الإنشاء والقراءة والتحديث والحذف (CRUD).</w:t>
+      </w:r>
+      <w:r>
+        <w:t xml:space="preserve"> </w:t>
+      </w:r>
+      <w:r>
+        <w:t xml:space="preserve">-</w:t>
+      </w:r>
+      <w:r>
+        <w:t xml:space="preserve"> </w:t>
+      </w:r>
+      <w:r>
+        <w:rPr>
+          <w:b/>
+          <w:bCs/>
+        </w:rPr>
+        <w:t xml:space="preserve">التشغيل المعزول (Containerization)</w:t>
+      </w:r>
+      <w:r>
+        <w:t xml:space="preserve">: عزل كل تقنية في حاوية مستقلة.</w:t>
+      </w:r>
+      <w:r>
+        <w:t xml:space="preserve"> </w:t>
+      </w:r>
+      <w:r>
+        <w:t xml:space="preserve">-</w:t>
+      </w:r>
+      <w:r>
+        <w:t xml:space="preserve"> </w:t>
+      </w:r>
+      <w:r>
+        <w:rPr>
+          <w:b/>
+          <w:bCs/>
+        </w:rPr>
+        <w:t xml:space="preserve">إدارة الحاويات المتعددة</w:t>
+      </w:r>
+      <w:r>
+        <w:t xml:space="preserve">: استخدام Docker Compose لتوحيد التشغيل.</w:t>
+      </w:r>
+      <w:r>
+        <w:t xml:space="preserve"> </w:t>
+      </w:r>
+      <w:r>
+        <w:t xml:space="preserve">-</w:t>
+      </w:r>
+      <w:r>
+        <w:t xml:space="preserve"> </w:t>
+      </w:r>
+      <w:r>
+        <w:rPr>
+          <w:b/>
+          <w:bCs/>
+        </w:rPr>
+        <w:t xml:space="preserve">توجيه الشبكة (Reverse Proxy)</w:t>
+      </w:r>
+      <w:r>
+        <w:t xml:space="preserve">: استخدام Nginx لإخفاء المعمارية الداخلية.</w:t>
+      </w:r>
+      <w:r>
+        <w:t xml:space="preserve"> </w:t>
+      </w:r>
+      <w:r>
+        <w:t xml:space="preserve">-</w:t>
+      </w:r>
+      <w:r>
+        <w:t xml:space="preserve"> </w:t>
+      </w:r>
+      <w:r>
+        <w:rPr>
+          <w:b/>
+          <w:bCs/>
+        </w:rPr>
+        <w:t xml:space="preserve">العزل الشبكي (Network Isolation)</w:t>
+      </w:r>
+      <w:r>
+        <w:t xml:space="preserve">: حماية الخدمات الخلفية من الوصول المباشر.</w:t>
+      </w:r>
+      <w:r>
+        <w:t xml:space="preserve"> </w:t>
+      </w:r>
+      <w:r>
+        <w:t xml:space="preserve">-</w:t>
+      </w:r>
+      <w:r>
+        <w:t xml:space="preserve"> </w:t>
+      </w:r>
+      <w:r>
+        <w:rPr>
+          <w:b/>
+          <w:bCs/>
+        </w:rPr>
+        <w:t xml:space="preserve">الاستمرارية (Persistent Storage)</w:t>
+      </w:r>
+      <w:r>
+        <w:t xml:space="preserve">: تخزين البيانات بأمان لحمايتها من زوال الحاويات.</w:t>
+      </w:r>
+      <w:r>
+        <w:t xml:space="preserve"> </w:t>
+      </w:r>
+      <w:r>
+        <w:t xml:space="preserve">-</w:t>
+      </w:r>
+      <w:r>
+        <w:t xml:space="preserve"> </w:t>
+      </w:r>
+      <w:r>
+        <w:rPr>
+          <w:b/>
+          <w:bCs/>
+        </w:rPr>
+        <w:t xml:space="preserve">اختبار الفشل (Failure Mode Testing)</w:t>
+      </w:r>
+      <w:r>
+        <w:t xml:space="preserve">: التحقق من قدرة النظام على التعامل مع التوقف المفاجئ.</w:t>
+      </w:r>
+      <w:r>
+        <w:t xml:space="preserve"> </w:t>
+      </w:r>
+      <w:r>
+        <w:t xml:space="preserve">-</w:t>
+      </w:r>
+      <w:r>
+        <w:t xml:space="preserve"> </w:t>
+      </w:r>
+      <w:r>
+        <w:rPr>
+          <w:b/>
+          <w:bCs/>
+        </w:rPr>
+        <w:t xml:space="preserve">إدارة الإصدارات (Versioning)</w:t>
+      </w:r>
+      <w:r>
+        <w:t xml:space="preserve">: رفع الصور إلى السجل (Docker Registry).</w:t>
+      </w:r>
+      <w:r>
+        <w:t xml:space="preserve"> </w:t>
+      </w:r>
+      <w:r>
+        <w:t xml:space="preserve">-</w:t>
+      </w:r>
+      <w:r>
+        <w:t xml:space="preserve"> </w:t>
+      </w:r>
+      <w:r>
+        <w:rPr>
+          <w:b/>
+          <w:bCs/>
+        </w:rPr>
+        <w:t xml:space="preserve">التشغيل المتطابق (Reproducible Deployment)</w:t>
+      </w:r>
+      <w:r>
+        <w:t xml:space="preserve">: القدرة على تشغيل المشروع بخطوة واحدة على أي جهاز.</w:t>
+      </w:r>
+    </w:p>
+    <w:bookmarkEnd w:id="10"/>
+    <w:bookmarkStart w:id="11" w:name="نظرة-عامة-على-النظام"/>
+    <w:p>
+      <w:pPr>
+        <w:pStyle w:val="Heading1"/>
+      </w:pPr>
+      <w:r>
+        <w:rPr>
+          <w:rStyle w:val="SectionNumber"/>
+        </w:rPr>
+        <w:t xml:space="preserve">3</w:t>
+      </w:r>
+      <w:r>
+        <w:tab/>
+      </w:r>
+      <w:r>
+        <w:t xml:space="preserve">3. نظرة عامة على النظام</w:t>
+      </w:r>
+    </w:p>
+    <w:p>
+      <w:pPr>
+        <w:pStyle w:val="FirstParagraph"/>
+      </w:pPr>
+      <w:r>
+        <w:t xml:space="preserve">يبدأ مسار الطلب (Request Flow) من العميل (Client) ويتدرج كالتالي:</w:t>
+      </w:r>
+      <w:r>
+        <w:t xml:space="preserve"> </w:t>
+      </w:r>
+      <w:r>
+        <w:rPr>
+          <w:b/>
+          <w:bCs/>
+        </w:rPr>
+        <w:t xml:space="preserve">Client</w:t>
+      </w:r>
+      <w:r>
+        <w:t xml:space="preserve"> </w:t>
+      </w:r>
+      <m:oMath>
+        <m:r>
+          <m:rPr>
+            <m:sty m:val="p"/>
+          </m:rPr>
+          <m:t>→</m:t>
+        </m:r>
+      </m:oMath>
+      <w:r>
+        <w:t xml:space="preserve"> </w:t>
+      </w:r>
+      <w:r>
+        <w:rPr>
+          <w:b/>
+          <w:bCs/>
+        </w:rPr>
+        <w:t xml:space="preserve">Nginx</w:t>
+      </w:r>
+      <w:r>
+        <w:t xml:space="preserve"> </w:t>
+      </w:r>
+      <m:oMath>
+        <m:r>
+          <m:rPr>
+            <m:sty m:val="p"/>
+          </m:rPr>
+          <m:t>→</m:t>
+        </m:r>
+      </m:oMath>
+      <w:r>
+        <w:t xml:space="preserve"> </w:t>
+      </w:r>
+      <w:r>
+        <w:rPr>
+          <w:b/>
+          <w:bCs/>
+        </w:rPr>
+        <w:t xml:space="preserve">Node.js / Express API</w:t>
+      </w:r>
+      <w:r>
+        <w:t xml:space="preserve"> </w:t>
+      </w:r>
+      <m:oMath>
+        <m:r>
+          <m:rPr>
+            <m:sty m:val="p"/>
+          </m:rPr>
+          <m:t>→</m:t>
+        </m:r>
+      </m:oMath>
+      <w:r>
+        <w:t xml:space="preserve"> </w:t>
+      </w:r>
+      <w:r>
+        <w:rPr>
+          <w:b/>
+          <w:bCs/>
+        </w:rPr>
+        <w:t xml:space="preserve">PostgreSQL</w:t>
       </w:r>
     </w:p>
     <w:p>
@@ -118,10 +473,10 @@
           <w:b/>
           <w:bCs/>
         </w:rPr>
-        <w:t xml:space="preserve">[Team Member 1 Name]</w:t>
-      </w:r>
-      <w:r>
-        <w:t xml:space="preserve">: Backend Development &amp; Containerization</w:t>
+        <w:t xml:space="preserve">Nginx</w:t>
+      </w:r>
+      <w:r>
+        <w:t xml:space="preserve">: يستقبل الطلب من خارج النظام ويوجهه للداخل.</w:t>
       </w:r>
     </w:p>
     <w:p>
@@ -137,10 +492,10 @@
           <w:b/>
           <w:bCs/>
         </w:rPr>
-        <w:t xml:space="preserve">[Team Member 2 Name]</w:t>
-      </w:r>
-      <w:r>
-        <w:t xml:space="preserve">: Reverse Proxy Configuration &amp; Security</w:t>
+        <w:t xml:space="preserve">Node.js API</w:t>
+      </w:r>
+      <w:r>
+        <w:t xml:space="preserve">: يستقبل الطلب الموجه، يحلل البيانات، وينفذ منطق العمل (Business Logic).</w:t>
       </w:r>
     </w:p>
     <w:p>
@@ -156,64 +511,62 @@
           <w:b/>
           <w:bCs/>
         </w:rPr>
-        <w:t xml:space="preserve">[Team Member 3 Name]</w:t>
-      </w:r>
-      <w:r>
-        <w:t xml:space="preserve">: Database Architecture &amp; Storage</w:t>
-      </w:r>
-    </w:p>
-    <w:p>
-      <w:pPr>
-        <w:pStyle w:val="Compact"/>
-        <w:numPr>
-          <w:ilvl w:val="0"/>
-          <w:numId w:val="1001"/>
-        </w:numPr>
-      </w:pPr>
+        <w:t xml:space="preserve">PostgreSQL</w:t>
+      </w:r>
+      <w:r>
+        <w:t xml:space="preserve">: ينفذ استعلام قاعدة البيانات لحفظ أو جلب المهام ويُرجع النتيجة ليتم تصديرها للعميل.</w:t>
+      </w:r>
+    </w:p>
+    <w:bookmarkEnd w:id="11"/>
+    <w:bookmarkStart w:id="12" w:name="معمارية-النظام-system-architecture"/>
+    <w:p>
+      <w:pPr>
+        <w:pStyle w:val="Heading1"/>
+      </w:pPr>
+      <w:r>
+        <w:rPr>
+          <w:rStyle w:val="SectionNumber"/>
+        </w:rPr>
+        <w:t xml:space="preserve">4</w:t>
+      </w:r>
+      <w:r>
+        <w:tab/>
+      </w:r>
+      <w:r>
+        <w:t xml:space="preserve">4. معمارية النظام (System Architecture)</w:t>
+      </w:r>
+    </w:p>
+    <w:p>
+      <w:pPr>
+        <w:pStyle w:val="FirstParagraph"/>
+      </w:pPr>
+      <w:r>
+        <w:t xml:space="preserve">يعتمد المشروع على معمارية ثلاثية الطبقات (3-Tier Architecture) معزولة كلياً:</w:t>
+      </w:r>
+      <w:r>
+        <w:t xml:space="preserve"> </w:t>
+      </w:r>
+      <w:r>
+        <w:t xml:space="preserve">-</w:t>
+      </w:r>
+      <w:r>
+        <w:t xml:space="preserve"> </w:t>
+      </w:r>
       <w:r>
         <w:rPr>
           <w:b/>
           <w:bCs/>
         </w:rPr>
-        <w:t xml:space="preserve">[Team Member 4 Name]</w:t>
-      </w:r>
-      <w:r>
-        <w:t xml:space="preserve">: Testing &amp; Failure Mode Verification</w:t>
-      </w:r>
-    </w:p>
-    <w:bookmarkEnd w:id="10"/>
-    <w:bookmarkStart w:id="11" w:name="X9c59edb8807f88c02b093c11494367b49249140"/>
-    <w:p>
-      <w:pPr>
-        <w:pStyle w:val="Heading1"/>
-      </w:pPr>
-      <w:r>
-        <w:rPr>
-          <w:rStyle w:val="SectionNumber"/>
-        </w:rPr>
-        <w:t xml:space="preserve">3</w:t>
-      </w:r>
-      <w:r>
-        <w:tab/>
-      </w:r>
-      <w:r>
-        <w:t xml:space="preserve">Virtualization vs. Containerization Analysis</w:t>
-      </w:r>
-    </w:p>
-    <w:p>
-      <w:pPr>
-        <w:pStyle w:val="FirstParagraph"/>
-      </w:pPr>
-      <w:r>
-        <w:t xml:space="preserve">In traditional virtualization, deploying this 3-tier architecture would require three separate Virtual Machines (VMs), each running a full Guest Operating System. This results in heavy CPU/RAM overhead, slow startup times, and wasted disk space.</w:t>
-      </w:r>
-    </w:p>
-    <w:p>
-      <w:pPr>
-        <w:pStyle w:val="BodyText"/>
-      </w:pPr>
-      <w:r>
-        <w:t xml:space="preserve">By utilizing</w:t>
+        <w:t xml:space="preserve">Nginx</w:t>
+      </w:r>
+      <w:r>
+        <w:t xml:space="preserve">: يعمل على المنفذ 80 داخل الحاوية. تم ربطه بمنفذ المضيف (Host) 8080:80 ليكون نقطة الدخول الوحيدة.</w:t>
+      </w:r>
+      <w:r>
+        <w:t xml:space="preserve"> </w:t>
+      </w:r>
+      <w:r>
+        <w:t xml:space="preserve">-</w:t>
       </w:r>
       <w:r>
         <w:t xml:space="preserve"> </w:t>
@@ -223,10 +576,10 @@
           <w:b/>
           <w:bCs/>
         </w:rPr>
-        <w:t xml:space="preserve">Containerization (Docker)</w:t>
-      </w:r>
-      <w:r>
-        <w:t xml:space="preserve">:</w:t>
+        <w:t xml:space="preserve">API</w:t>
+      </w:r>
+      <w:r>
+        <w:t xml:space="preserve">: يعمل على المنفذ 3000 داخل شبكة Docker، ولا يتم نشره (Publish) للمضيف. Nginx يتصل به عبر العنوان الداخلي ask-management-api:3000.</w:t>
       </w:r>
       <w:r>
         <w:t xml:space="preserve"> </w:t>
@@ -242,77 +595,14 @@
           <w:b/>
           <w:bCs/>
         </w:rPr>
-        <w:t xml:space="preserve">Shared Kernel</w:t>
-      </w:r>
-      <w:r>
-        <w:t xml:space="preserve">: All containers share the host machine’s OS kernel, eliminating the need for Guest OS layers.</w:t>
-      </w:r>
-      <w:r>
-        <w:t xml:space="preserve"> </w:t>
-      </w:r>
-      <w:r>
-        <w:t xml:space="preserve">-</w:t>
-      </w:r>
-      <w:r>
-        <w:t xml:space="preserve"> </w:t>
-      </w:r>
-      <w:r>
-        <w:rPr>
-          <w:b/>
-          <w:bCs/>
-        </w:rPr>
-        <w:t xml:space="preserve">Lightweight Footprint</w:t>
-      </w:r>
-      <w:r>
-        <w:t xml:space="preserve">: We utilized Alpine Linux base images (</w:t>
-      </w:r>
-      <w:r>
-        <w:t xml:space="preserve"> </w:t>
-      </w:r>
-      <w:r>
-        <w:t xml:space="preserve">ode:24-alpine and postgres:15-alpine), reducing the image size drastically (often under 100MB).</w:t>
-      </w:r>
-      <w:r>
-        <w:t xml:space="preserve"> </w:t>
-      </w:r>
-      <w:r>
-        <w:t xml:space="preserve">-</w:t>
-      </w:r>
-      <w:r>
-        <w:t xml:space="preserve"> </w:t>
-      </w:r>
-      <w:r>
-        <w:rPr>
-          <w:b/>
-          <w:bCs/>
-        </w:rPr>
-        <w:t xml:space="preserve">Near-Instant Startup</w:t>
-      </w:r>
-      <w:r>
-        <w:t xml:space="preserve">: Containers spin up in milliseconds compared to the minutes required for VMs.</w:t>
-      </w:r>
-      <w:r>
-        <w:t xml:space="preserve"> </w:t>
-      </w:r>
-      <w:r>
-        <w:t xml:space="preserve">-</w:t>
-      </w:r>
-      <w:r>
-        <w:t xml:space="preserve"> </w:t>
-      </w:r>
-      <w:r>
-        <w:rPr>
-          <w:b/>
-          <w:bCs/>
-        </w:rPr>
-        <w:t xml:space="preserve">Portability</w:t>
-      </w:r>
-      <w:r>
-        <w:t xml:space="preserve">: The declarative compose.yaml guarantees that the environment runs identically on any developer’s machine.</w:t>
-      </w:r>
-    </w:p>
-    <w:bookmarkEnd w:id="11"/>
-    <w:bookmarkStart w:id="12" w:name="system-architecture"/>
+        <w:t xml:space="preserve">PostgreSQL</w:t>
+      </w:r>
+      <w:r>
+        <w:t xml:space="preserve">: يعمل على المنفذ 5432 داخل شبكة Docker، وهو معزول تماماً عن المضيف ولا يتصل به إلا الـ API عبر العنوان ask-management-db:5432.</w:t>
+      </w:r>
+    </w:p>
+    <w:bookmarkEnd w:id="12"/>
+    <w:bookmarkStart w:id="13" w:name="rest-api-وcrud"/>
     <w:p>
       <w:pPr>
         <w:pStyle w:val="Heading1"/>
@@ -321,13 +611,13 @@
         <w:rPr>
           <w:rStyle w:val="SectionNumber"/>
         </w:rPr>
-        <w:t xml:space="preserve">4</w:t>
+        <w:t xml:space="preserve">5</w:t>
       </w:r>
       <w:r>
         <w:tab/>
       </w:r>
       <w:r>
-        <w:t xml:space="preserve">System Architecture</w:t>
+        <w:t xml:space="preserve">5. REST API وCRUD</w:t>
       </w:r>
     </w:p>
     <w:p>
@@ -335,76 +625,201 @@
         <w:pStyle w:val="FirstParagraph"/>
       </w:pPr>
       <w:r>
-        <w:t xml:space="preserve">The system follows a 3-tier architecture:</w:t>
-      </w:r>
-    </w:p>
-    <w:p>
-      <w:pPr>
-        <w:pStyle w:val="BodyText"/>
-      </w:pPr>
-      <w:r>
-        <w:t xml:space="preserve">Client -&gt; Nginx (:8080) -&gt; Node.js/Express API (:3000) -&gt; PostgreSQL (:5432)</w:t>
-      </w:r>
-    </w:p>
-    <w:p>
-      <w:pPr>
-        <w:pStyle w:val="Compact"/>
-        <w:numPr>
-          <w:ilvl w:val="0"/>
-          <w:numId w:val="1002"/>
-        </w:numPr>
-      </w:pPr>
-      <w:r>
-        <w:rPr>
-          <w:b/>
-          <w:bCs/>
-        </w:rPr>
-        <w:t xml:space="preserve">Nginx (Reverse Proxy)</w:t>
-      </w:r>
-      <w:r>
-        <w:t xml:space="preserve">: Acts as the sole entry point. It receives HTTP requests on port 8080 and proxies them to the internal API on port 80.</w:t>
-      </w:r>
-    </w:p>
-    <w:p>
-      <w:pPr>
-        <w:pStyle w:val="Compact"/>
-        <w:numPr>
-          <w:ilvl w:val="0"/>
-          <w:numId w:val="1002"/>
-        </w:numPr>
-      </w:pPr>
-      <w:r>
-        <w:rPr>
-          <w:b/>
-          <w:bCs/>
-        </w:rPr>
-        <w:t xml:space="preserve">Node.js API</w:t>
-      </w:r>
-      <w:r>
-        <w:t xml:space="preserve">: Handles the business logic and REST CRUD operations.</w:t>
-      </w:r>
-    </w:p>
-    <w:p>
-      <w:pPr>
-        <w:pStyle w:val="Compact"/>
-        <w:numPr>
-          <w:ilvl w:val="0"/>
-          <w:numId w:val="1002"/>
-        </w:numPr>
-      </w:pPr>
-      <w:r>
-        <w:rPr>
-          <w:b/>
-          <w:bCs/>
-        </w:rPr>
-        <w:t xml:space="preserve">PostgreSQL</w:t>
-      </w:r>
-      <w:r>
-        <w:t xml:space="preserve">: Stores the tasks relationally.</w:t>
-      </w:r>
-    </w:p>
-    <w:bookmarkEnd w:id="12"/>
-    <w:bookmarkStart w:id="13" w:name="network-architecture"/>
+        <w:t xml:space="preserve">واجهة برمجة التطبيقات (REST API) هي حلقة الوصل التي تستقبل طلبات (HTTP Requests) العميل وترد عليها (HTTP Responses). تم تطبيق عمليات CRUD الأساسية كالتالي:</w:t>
+      </w:r>
+    </w:p>
+    <w:tbl>
+      <w:tblPr>
+        <w:tblStyle w:val="Table"/>
+        <w:tblW w:type="auto" w:w="0"/>
+        <w:tblLook w:firstRow="1" w:lastRow="0" w:firstColumn="0" w:lastColumn="0" w:noHBand="0" w:noVBand="0" w:val="0020"/>
+      </w:tblPr>
+      <w:tblGrid>
+        <w:gridCol w:w="2640"/>
+        <w:gridCol w:w="2640"/>
+        <w:gridCol w:w="2640"/>
+      </w:tblGrid>
+      <w:tr>
+        <w:trPr>
+          <w:tblHeader w:val="on"/>
+        </w:trPr>
+        <w:tc>
+          <w:tcPr/>
+          <w:p>
+            <w:pPr>
+              <w:pStyle w:val="Compact"/>
+            </w:pPr>
+            <w:r>
+              <w:t xml:space="preserve">العملية</w:t>
+            </w:r>
+          </w:p>
+        </w:tc>
+        <w:tc>
+          <w:tcPr/>
+          <w:p>
+            <w:pPr>
+              <w:pStyle w:val="Compact"/>
+            </w:pPr>
+            <w:r>
+              <w:t xml:space="preserve">HTTP Method</w:t>
+            </w:r>
+          </w:p>
+        </w:tc>
+        <w:tc>
+          <w:tcPr/>
+          <w:p>
+            <w:pPr>
+              <w:pStyle w:val="Compact"/>
+            </w:pPr>
+            <w:r>
+              <w:t xml:space="preserve">Endpoint</w:t>
+            </w:r>
+          </w:p>
+        </w:tc>
+      </w:tr>
+      <w:tr>
+        <w:tc>
+          <w:tcPr/>
+          <w:p>
+            <w:pPr>
+              <w:pStyle w:val="Compact"/>
+            </w:pPr>
+            <w:r>
+              <w:t xml:space="preserve">إنشاء</w:t>
+            </w:r>
+          </w:p>
+        </w:tc>
+        <w:tc>
+          <w:tcPr/>
+          <w:p>
+            <w:pPr>
+              <w:pStyle w:val="Compact"/>
+            </w:pPr>
+            <w:r>
+              <w:t xml:space="preserve">POST</w:t>
+            </w:r>
+          </w:p>
+        </w:tc>
+        <w:tc>
+          <w:tcPr/>
+          <w:p>
+            <w:pPr>
+              <w:pStyle w:val="Compact"/>
+            </w:pPr>
+            <w:r>
+              <w:t xml:space="preserve">/api/tasks</w:t>
+            </w:r>
+          </w:p>
+        </w:tc>
+      </w:tr>
+      <w:tr>
+        <w:tc>
+          <w:tcPr/>
+          <w:p>
+            <w:pPr>
+              <w:pStyle w:val="Compact"/>
+            </w:pPr>
+            <w:r>
+              <w:t xml:space="preserve">قراءة</w:t>
+            </w:r>
+          </w:p>
+        </w:tc>
+        <w:tc>
+          <w:tcPr/>
+          <w:p>
+            <w:pPr>
+              <w:pStyle w:val="Compact"/>
+            </w:pPr>
+            <w:r>
+              <w:t xml:space="preserve">GET</w:t>
+            </w:r>
+          </w:p>
+        </w:tc>
+        <w:tc>
+          <w:tcPr/>
+          <w:p>
+            <w:pPr>
+              <w:pStyle w:val="Compact"/>
+            </w:pPr>
+            <w:r>
+              <w:t xml:space="preserve">/api/tasks</w:t>
+            </w:r>
+          </w:p>
+        </w:tc>
+      </w:tr>
+      <w:tr>
+        <w:tc>
+          <w:tcPr/>
+          <w:p>
+            <w:pPr>
+              <w:pStyle w:val="Compact"/>
+            </w:pPr>
+            <w:r>
+              <w:t xml:space="preserve">تعديل</w:t>
+            </w:r>
+          </w:p>
+        </w:tc>
+        <w:tc>
+          <w:tcPr/>
+          <w:p>
+            <w:pPr>
+              <w:pStyle w:val="Compact"/>
+            </w:pPr>
+            <w:r>
+              <w:t xml:space="preserve">PUT</w:t>
+            </w:r>
+          </w:p>
+        </w:tc>
+        <w:tc>
+          <w:tcPr/>
+          <w:p>
+            <w:pPr>
+              <w:pStyle w:val="Compact"/>
+            </w:pPr>
+            <w:r>
+              <w:t xml:space="preserve">/api/tasks/:id</w:t>
+            </w:r>
+          </w:p>
+        </w:tc>
+      </w:tr>
+      <w:tr>
+        <w:tc>
+          <w:tcPr/>
+          <w:p>
+            <w:pPr>
+              <w:pStyle w:val="Compact"/>
+            </w:pPr>
+            <w:r>
+              <w:t xml:space="preserve">حذف</w:t>
+            </w:r>
+          </w:p>
+        </w:tc>
+        <w:tc>
+          <w:tcPr/>
+          <w:p>
+            <w:pPr>
+              <w:pStyle w:val="Compact"/>
+            </w:pPr>
+            <w:r>
+              <w:t xml:space="preserve">DELETE</w:t>
+            </w:r>
+          </w:p>
+        </w:tc>
+        <w:tc>
+          <w:tcPr/>
+          <w:p>
+            <w:pPr>
+              <w:pStyle w:val="Compact"/>
+            </w:pPr>
+            <w:r>
+              <w:t xml:space="preserve">/api/tasks/:id</w:t>
+            </w:r>
+          </w:p>
+        </w:tc>
+      </w:tr>
+    </w:tbl>
+    <w:bookmarkEnd w:id="13"/>
+    <w:bookmarkStart w:id="14" w:name="قاعدة-البيانات-postgresql"/>
     <w:p>
       <w:pPr>
         <w:pStyle w:val="Heading1"/>
@@ -413,13 +828,13 @@
         <w:rPr>
           <w:rStyle w:val="SectionNumber"/>
         </w:rPr>
-        <w:t xml:space="preserve">5</w:t>
+        <w:t xml:space="preserve">6</w:t>
       </w:r>
       <w:r>
         <w:tab/>
       </w:r>
       <w:r>
-        <w:t xml:space="preserve">Network Architecture</w:t>
+        <w:t xml:space="preserve">6. قاعدة البيانات PostgreSQL</w:t>
       </w:r>
     </w:p>
     <w:p>
@@ -427,49 +842,11 @@
         <w:pStyle w:val="FirstParagraph"/>
       </w:pPr>
       <w:r>
-        <w:t xml:space="preserve">The project employs a custom Docker bridge network named ask-management-network.</w:t>
-      </w:r>
-      <w:r>
-        <w:t xml:space="preserve"> </w:t>
-      </w:r>
-      <w:r>
-        <w:t xml:space="preserve">-</w:t>
-      </w:r>
-      <w:r>
-        <w:t xml:space="preserve"> </w:t>
-      </w:r>
-      <w:r>
-        <w:rPr>
-          <w:b/>
-          <w:bCs/>
-        </w:rPr>
-        <w:t xml:space="preserve">Isolation</w:t>
-      </w:r>
-      <w:r>
-        <w:t xml:space="preserve">: The ask-management-api and ask-management-db containers do NOT publish any ports to the host machine. They are completely isolated and can only be accessed from within the Docker network.</w:t>
-      </w:r>
-      <w:r>
-        <w:t xml:space="preserve"> </w:t>
-      </w:r>
-      <w:r>
-        <w:t xml:space="preserve">-</w:t>
-      </w:r>
-      <w:r>
-        <w:t xml:space="preserve"> </w:t>
-      </w:r>
-      <w:r>
-        <w:rPr>
-          <w:b/>
-          <w:bCs/>
-        </w:rPr>
-        <w:t xml:space="preserve">DNS Resolution</w:t>
-      </w:r>
-      <w:r>
-        <w:t xml:space="preserve">: Containers communicate using Docker’s internal DNS. The API connects to the database using the hostname ask-management-db. Nginx routes traffic to the API using the hostname ask-management-api.</w:t>
-      </w:r>
-    </w:p>
-    <w:bookmarkEnd w:id="13"/>
-    <w:bookmarkStart w:id="15" w:name="storage-architecture-persistence"/>
+        <w:t xml:space="preserve">تم اختيار PostgreSQL لقوتها كقاعدة بيانات علائقية. يتكون النظام من قاعدة بيانات (Database) تحت اسم askdb تحتوي على جدول (Table) يسمى asks. كل مهمة تمثل صفاً (Row) يتكون من أعمدة (Columns) مثل id (كمفتاح أساسي Primary Key)، و itle، و status. يتم التواصل معها عبر أوامر SQL ويرتبط بها الـ API عبر اسم الخدمة الداخلي ask-management-db:5432.</w:t>
+      </w:r>
+    </w:p>
+    <w:bookmarkEnd w:id="14"/>
+    <w:bookmarkStart w:id="15" w:name="virtualization-vs-containerization"/>
     <w:p>
       <w:pPr>
         <w:pStyle w:val="Heading1"/>
@@ -478,13 +855,13 @@
         <w:rPr>
           <w:rStyle w:val="SectionNumber"/>
         </w:rPr>
-        <w:t xml:space="preserve">6</w:t>
+        <w:t xml:space="preserve">7</w:t>
       </w:r>
       <w:r>
         <w:tab/>
       </w:r>
       <w:r>
-        <w:t xml:space="preserve">Storage Architecture &amp; Persistence</w:t>
+        <w:t xml:space="preserve">7. Virtualization vs Containerization</w:t>
       </w:r>
     </w:p>
     <w:p>
@@ -492,362 +869,7 @@
         <w:pStyle w:val="FirstParagraph"/>
       </w:pPr>
       <w:r>
-        <w:t xml:space="preserve">By default, data inside a container is ephemeral and lost when the container is removed. To ensure data persistence for PostgreSQL, a</w:t>
-      </w:r>
-      <w:r>
-        <w:t xml:space="preserve"> </w:t>
-      </w:r>
-      <w:r>
-        <w:rPr>
-          <w:b/>
-          <w:bCs/>
-        </w:rPr>
-        <w:t xml:space="preserve">Named Docker Volume</w:t>
-      </w:r>
-      <w:r>
-        <w:t xml:space="preserve"> </w:t>
-      </w:r>
-      <w:r>
-        <w:t xml:space="preserve">was implemented.</w:t>
-      </w:r>
-    </w:p>
-    <w:p>
-      <w:pPr>
-        <w:pStyle w:val="Compact"/>
-        <w:numPr>
-          <w:ilvl w:val="0"/>
-          <w:numId w:val="1003"/>
-        </w:numPr>
-      </w:pPr>
-      <w:r>
-        <w:rPr>
-          <w:b/>
-          <w:bCs/>
-        </w:rPr>
-        <w:t xml:space="preserve">Volume Name</w:t>
-      </w:r>
-      <w:r>
-        <w:t xml:space="preserve">: ask-management-db-data</w:t>
-      </w:r>
-    </w:p>
-    <w:p>
-      <w:pPr>
-        <w:pStyle w:val="Compact"/>
-        <w:numPr>
-          <w:ilvl w:val="0"/>
-          <w:numId w:val="1003"/>
-        </w:numPr>
-      </w:pPr>
-      <w:r>
-        <w:rPr>
-          <w:b/>
-          <w:bCs/>
-        </w:rPr>
-        <w:t xml:space="preserve">Mount Point</w:t>
-      </w:r>
-      <w:r>
-        <w:t xml:space="preserve">: /var/lib/postgresql/data (Inside the DB container)</w:t>
-      </w:r>
-    </w:p>
-    <w:p>
-      <w:pPr>
-        <w:pStyle w:val="Compact"/>
-        <w:numPr>
-          <w:ilvl w:val="0"/>
-          <w:numId w:val="1003"/>
-        </w:numPr>
-      </w:pPr>
-      <w:r>
-        <w:rPr>
-          <w:b/>
-          <w:bCs/>
-        </w:rPr>
-        <w:t xml:space="preserve">Declarative Config</w:t>
-      </w:r>
-      <w:r>
-        <w:t xml:space="preserve">: Defined in compose.yaml under olumes: to ensure Docker manages its lifecycle independently of the containers.</w:t>
-      </w:r>
-    </w:p>
-    <w:bookmarkStart w:id="14" w:name="persistence-verification"/>
-    <w:p>
-      <w:pPr>
-        <w:pStyle w:val="Heading2"/>
-      </w:pPr>
-      <w:r>
-        <w:rPr>
-          <w:rStyle w:val="SectionNumber"/>
-        </w:rPr>
-        <w:t xml:space="preserve">6.1</w:t>
-      </w:r>
-      <w:r>
-        <w:tab/>
-      </w:r>
-      <w:r>
-        <w:t xml:space="preserve">Persistence Verification</w:t>
-      </w:r>
-    </w:p>
-    <w:p>
-      <w:pPr>
-        <w:pStyle w:val="FirstParagraph"/>
-      </w:pPr>
-      <w:r>
-        <w:t xml:space="preserve">To verify that data persists across container lifecycles:</w:t>
-      </w:r>
-      <w:r>
-        <w:t xml:space="preserve"> </w:t>
-      </w:r>
-      <w:r>
-        <w:t xml:space="preserve">1. A new task was created via POST /api/tasks.</w:t>
-      </w:r>
-      <w:r>
-        <w:t xml:space="preserve"> </w:t>
-      </w:r>
-      <w:r>
-        <w:t xml:space="preserve">2. The containers were gracefully stopped and removed using docker compose down.</w:t>
-      </w:r>
-      <w:r>
-        <w:t xml:space="preserve"> </w:t>
-      </w:r>
-      <w:r>
-        <w:rPr>
-          <w:i/>
-          <w:iCs/>
-        </w:rPr>
-        <w:t xml:space="preserve">(Note: docker compose down -v was strictly avoided, as the -v flag destroys volumes).</w:t>
-      </w:r>
-      <w:r>
-        <w:t xml:space="preserve"> </w:t>
-      </w:r>
-      <w:r>
-        <w:t xml:space="preserve">3. The cluster was restarted using docker compose up -d.</w:t>
-      </w:r>
-      <w:r>
-        <w:t xml:space="preserve"> </w:t>
-      </w:r>
-      <w:r>
-        <w:t xml:space="preserve">4. A GET /api/tasks request confirmed that the previously created tasks remained intact.</w:t>
-      </w:r>
-    </w:p>
-    <w:bookmarkEnd w:id="14"/>
-    <w:bookmarkEnd w:id="15"/>
-    <w:bookmarkStart w:id="16" w:name="dockerfile-layer-optimization-analysis"/>
-    <w:p>
-      <w:pPr>
-        <w:pStyle w:val="Heading1"/>
-      </w:pPr>
-      <w:r>
-        <w:rPr>
-          <w:rStyle w:val="SectionNumber"/>
-        </w:rPr>
-        <w:t xml:space="preserve">7</w:t>
-      </w:r>
-      <w:r>
-        <w:tab/>
-      </w:r>
-      <w:r>
-        <w:t xml:space="preserve">Dockerfile Layer Optimization Analysis</w:t>
-      </w:r>
-    </w:p>
-    <w:p>
-      <w:pPr>
-        <w:pStyle w:val="FirstParagraph"/>
-      </w:pPr>
-      <w:r>
-        <w:t xml:space="preserve">The Dockerfile for the Node.js API was optimized for layer caching and minimal size:</w:t>
-      </w:r>
-    </w:p>
-    <w:p>
-      <w:pPr>
-        <w:pStyle w:val="BodyText"/>
-      </w:pPr>
-      <w:r>
-        <w:rPr>
-          <w:rStyle w:val="VerbatimChar"/>
-        </w:rPr>
-        <w:t xml:space="preserve">dockerfile FROM node:24-alpine WORKDIR /usr/src/app COPY package*.json ./ RUN npm install --omit=dev COPY . . USER node EXPOSE 3000 CMD ["npm", "start"]</w:t>
-      </w:r>
-    </w:p>
-    <w:p>
-      <w:pPr>
-        <w:pStyle w:val="Compact"/>
-        <w:numPr>
-          <w:ilvl w:val="0"/>
-          <w:numId w:val="1004"/>
-        </w:numPr>
-      </w:pPr>
-      <w:r>
-        <w:rPr>
-          <w:b/>
-          <w:bCs/>
-        </w:rPr>
-        <w:t xml:space="preserve">Layer Caching</w:t>
-      </w:r>
-      <w:r>
-        <w:t xml:space="preserve">: package.json is copied and</w:t>
-      </w:r>
-      <w:r>
-        <w:t xml:space="preserve"> </w:t>
-      </w:r>
-      <w:r>
-        <w:t xml:space="preserve">pm install is executed</w:t>
-      </w:r>
-      <w:r>
-        <w:t xml:space="preserve"> </w:t>
-      </w:r>
-      <w:r>
-        <w:rPr>
-          <w:i/>
-          <w:iCs/>
-        </w:rPr>
-        <w:t xml:space="preserve">before</w:t>
-      </w:r>
-      <w:r>
-        <w:t xml:space="preserve"> </w:t>
-      </w:r>
-      <w:r>
-        <w:t xml:space="preserve">copying the rest of the application code. This ensures that if only source code changes, Docker reuses the cached</w:t>
-      </w:r>
-      <w:r>
-        <w:t xml:space="preserve"> </w:t>
-      </w:r>
-      <w:r>
-        <w:t xml:space="preserve">pm install layer, speeding up builds significantly.</w:t>
-      </w:r>
-    </w:p>
-    <w:p>
-      <w:pPr>
-        <w:pStyle w:val="Compact"/>
-        <w:numPr>
-          <w:ilvl w:val="0"/>
-          <w:numId w:val="1004"/>
-        </w:numPr>
-      </w:pPr>
-      <w:r>
-        <w:rPr>
-          <w:b/>
-          <w:bCs/>
-        </w:rPr>
-        <w:t xml:space="preserve">Production Mode</w:t>
-      </w:r>
-      <w:r>
-        <w:t xml:space="preserve">: –omit=dev ensures only production dependencies are installed.</w:t>
-      </w:r>
-    </w:p>
-    <w:bookmarkEnd w:id="16"/>
-    <w:bookmarkStart w:id="17" w:name="security-practices"/>
-    <w:p>
-      <w:pPr>
-        <w:pStyle w:val="Heading1"/>
-      </w:pPr>
-      <w:r>
-        <w:rPr>
-          <w:rStyle w:val="SectionNumber"/>
-        </w:rPr>
-        <w:t xml:space="preserve">8</w:t>
-      </w:r>
-      <w:r>
-        <w:tab/>
-      </w:r>
-      <w:r>
-        <w:t xml:space="preserve">Security Practices</w:t>
-      </w:r>
-    </w:p>
-    <w:p>
-      <w:pPr>
-        <w:pStyle w:val="FirstParagraph"/>
-      </w:pPr>
-      <w:r>
-        <w:t xml:space="preserve">The following security best practices were verified:</w:t>
-      </w:r>
-      <w:r>
-        <w:t xml:space="preserve"> </w:t>
-      </w:r>
-      <w:r>
-        <w:t xml:space="preserve">1.</w:t>
-      </w:r>
-      <w:r>
-        <w:t xml:space="preserve"> </w:t>
-      </w:r>
-      <w:r>
-        <w:rPr>
-          <w:b/>
-          <w:bCs/>
-        </w:rPr>
-        <w:t xml:space="preserve">Least Privilege</w:t>
-      </w:r>
-      <w:r>
-        <w:t xml:space="preserve">: The API container runs with USER node instead of the default root user.</w:t>
-      </w:r>
-      <w:r>
-        <w:t xml:space="preserve"> </w:t>
-      </w:r>
-      <w:r>
-        <w:t xml:space="preserve">2.</w:t>
-      </w:r>
-      <w:r>
-        <w:t xml:space="preserve"> </w:t>
-      </w:r>
-      <w:r>
-        <w:rPr>
-          <w:b/>
-          <w:bCs/>
-        </w:rPr>
-        <w:t xml:space="preserve">Network Isolation</w:t>
-      </w:r>
-      <w:r>
-        <w:t xml:space="preserve">: The Database and API have no external ports exposed. Only Nginx is accessible.</w:t>
-      </w:r>
-      <w:r>
-        <w:t xml:space="preserve"> </w:t>
-      </w:r>
-      <w:r>
-        <w:t xml:space="preserve">3.</w:t>
-      </w:r>
-      <w:r>
-        <w:t xml:space="preserve"> </w:t>
-      </w:r>
-      <w:r>
-        <w:rPr>
-          <w:b/>
-          <w:bCs/>
-        </w:rPr>
-        <w:t xml:space="preserve">Git Hygiene</w:t>
-      </w:r>
-      <w:r>
-        <w:t xml:space="preserve">: .gitignore successfully excludes .env files and</w:t>
-      </w:r>
-      <w:r>
-        <w:t xml:space="preserve"> </w:t>
-      </w:r>
-      <w:r>
-        <w:t xml:space="preserve">ode_modules. No secrets were committed to the GitHub repository.</w:t>
-      </w:r>
-    </w:p>
-    <w:bookmarkEnd w:id="17"/>
-    <w:bookmarkStart w:id="18" w:name="failure-mode-scenarios"/>
-    <w:p>
-      <w:pPr>
-        <w:pStyle w:val="Heading1"/>
-      </w:pPr>
-      <w:r>
-        <w:rPr>
-          <w:rStyle w:val="SectionNumber"/>
-        </w:rPr>
-        <w:t xml:space="preserve">9</w:t>
-      </w:r>
-      <w:r>
-        <w:tab/>
-      </w:r>
-      <w:r>
-        <w:t xml:space="preserve">Failure-Mode Scenarios</w:t>
-      </w:r>
-    </w:p>
-    <w:p>
-      <w:pPr>
-        <w:pStyle w:val="FirstParagraph"/>
-      </w:pPr>
-      <w:r>
-        <w:t xml:space="preserve">Extensive runtime testing was performed to verify system resilience:</w:t>
+        <w:t xml:space="preserve">لإثبات كفاءة معماريتنا، نوضح الفرق بين الأجهزة الافتراضية والحاويات:</w:t>
       </w:r>
     </w:p>
     <w:tbl>
@@ -873,29 +895,29 @@
               <w:pStyle w:val="Compact"/>
             </w:pPr>
             <w:r>
-              <w:t xml:space="preserve">Scenario</w:t>
-            </w:r>
-          </w:p>
-        </w:tc>
-        <w:tc>
-          <w:tcPr/>
-          <w:p>
-            <w:pPr>
-              <w:pStyle w:val="Compact"/>
-            </w:pPr>
-            <w:r>
-              <w:t xml:space="preserve">Resulting Status Code / Behavior</w:t>
-            </w:r>
-          </w:p>
-        </w:tc>
-        <w:tc>
-          <w:tcPr/>
-          <w:p>
-            <w:pPr>
-              <w:pStyle w:val="Compact"/>
-            </w:pPr>
-            <w:r>
-              <w:t xml:space="preserve">Explanation</w:t>
+              <w:t xml:space="preserve">الخاصية</w:t>
+            </w:r>
+          </w:p>
+        </w:tc>
+        <w:tc>
+          <w:tcPr/>
+          <w:p>
+            <w:pPr>
+              <w:pStyle w:val="Compact"/>
+            </w:pPr>
+            <w:r>
+              <w:t xml:space="preserve">Virtual Machine</w:t>
+            </w:r>
+          </w:p>
+        </w:tc>
+        <w:tc>
+          <w:tcPr/>
+          <w:p>
+            <w:pPr>
+              <w:pStyle w:val="Compact"/>
+            </w:pPr>
+            <w:r>
+              <w:t xml:space="preserve">Container</w:t>
             </w:r>
           </w:p>
         </w:tc>
@@ -908,29 +930,29 @@
               <w:pStyle w:val="Compact"/>
             </w:pPr>
             <w:r>
-              <w:t xml:space="preserve">API container is stopped</w:t>
-            </w:r>
-          </w:p>
-        </w:tc>
-        <w:tc>
-          <w:tcPr/>
-          <w:p>
-            <w:pPr>
-              <w:pStyle w:val="Compact"/>
-            </w:pPr>
-            <w:r>
-              <w:t xml:space="preserve">502 Bad Gateway</w:t>
-            </w:r>
-          </w:p>
-        </w:tc>
-        <w:tc>
-          <w:tcPr/>
-          <w:p>
-            <w:pPr>
-              <w:pStyle w:val="Compact"/>
-            </w:pPr>
-            <w:r>
-              <w:t xml:space="preserve">Nginx cannot reach the upstream backend.</w:t>
+              <w:t xml:space="preserve">Guest OS</w:t>
+            </w:r>
+          </w:p>
+        </w:tc>
+        <w:tc>
+          <w:tcPr/>
+          <w:p>
+            <w:pPr>
+              <w:pStyle w:val="Compact"/>
+            </w:pPr>
+            <w:r>
+              <w:t xml:space="preserve">يتطلب نظام تشغيل كامل لكل آلة</w:t>
+            </w:r>
+          </w:p>
+        </w:tc>
+        <w:tc>
+          <w:tcPr/>
+          <w:p>
+            <w:pPr>
+              <w:pStyle w:val="Compact"/>
+            </w:pPr>
+            <w:r>
+              <w:t xml:space="preserve">لا يوجد، تشارك نواة المضيف (Host Kernel)</w:t>
             </w:r>
           </w:p>
         </w:tc>
@@ -943,29 +965,29 @@
               <w:pStyle w:val="Compact"/>
             </w:pPr>
             <w:r>
-              <w:t xml:space="preserve">DB container is stopped</w:t>
-            </w:r>
-          </w:p>
-        </w:tc>
-        <w:tc>
-          <w:tcPr/>
-          <w:p>
-            <w:pPr>
-              <w:pStyle w:val="Compact"/>
-            </w:pPr>
-            <w:r>
-              <w:t xml:space="preserve">500 Internal Server Error</w:t>
-            </w:r>
-          </w:p>
-        </w:tc>
-        <w:tc>
-          <w:tcPr/>
-          <w:p>
-            <w:pPr>
-              <w:pStyle w:val="Compact"/>
-            </w:pPr>
-            <w:r>
-              <w:t xml:space="preserve">API is running but fails to execute queries.</w:t>
+              <w:t xml:space="preserve">الموارد</w:t>
+            </w:r>
+          </w:p>
+        </w:tc>
+        <w:tc>
+          <w:tcPr/>
+          <w:p>
+            <w:pPr>
+              <w:pStyle w:val="Compact"/>
+            </w:pPr>
+            <w:r>
+              <w:t xml:space="preserve">ثقيلة وتستهلك RAM/CPU مقتطعة</w:t>
+            </w:r>
+          </w:p>
+        </w:tc>
+        <w:tc>
+          <w:tcPr/>
+          <w:p>
+            <w:pPr>
+              <w:pStyle w:val="Compact"/>
+            </w:pPr>
+            <w:r>
+              <w:t xml:space="preserve">خفيفة جداً تستهلك موارد حسب الحاجة</w:t>
             </w:r>
           </w:p>
         </w:tc>
@@ -978,29 +1000,29 @@
               <w:pStyle w:val="Compact"/>
             </w:pPr>
             <w:r>
-              <w:t xml:space="preserve">Nginx is stopped</w:t>
-            </w:r>
-          </w:p>
-        </w:tc>
-        <w:tc>
-          <w:tcPr/>
-          <w:p>
-            <w:pPr>
-              <w:pStyle w:val="Compact"/>
-            </w:pPr>
-            <w:r>
-              <w:t xml:space="preserve">Connection Refused</w:t>
-            </w:r>
-          </w:p>
-        </w:tc>
-        <w:tc>
-          <w:tcPr/>
-          <w:p>
-            <w:pPr>
-              <w:pStyle w:val="Compact"/>
-            </w:pPr>
-            <w:r>
-              <w:t xml:space="preserve">The external entry point is closed.</w:t>
+              <w:t xml:space="preserve">Startup Time</w:t>
+            </w:r>
+          </w:p>
+        </w:tc>
+        <w:tc>
+          <w:tcPr/>
+          <w:p>
+            <w:pPr>
+              <w:pStyle w:val="Compact"/>
+            </w:pPr>
+            <w:r>
+              <w:t xml:space="preserve">دقائق</w:t>
+            </w:r>
+          </w:p>
+        </w:tc>
+        <w:tc>
+          <w:tcPr/>
+          <w:p>
+            <w:pPr>
+              <w:pStyle w:val="Compact"/>
+            </w:pPr>
+            <w:r>
+              <w:t xml:space="preserve">أجزاء من الثانية (Milliseconds)</w:t>
             </w:r>
           </w:p>
         </w:tc>
@@ -1013,29 +1035,29 @@
               <w:pStyle w:val="Compact"/>
             </w:pPr>
             <w:r>
-              <w:t xml:space="preserve">Invalid Task ID requested</w:t>
-            </w:r>
-          </w:p>
-        </w:tc>
-        <w:tc>
-          <w:tcPr/>
-          <w:p>
-            <w:pPr>
-              <w:pStyle w:val="Compact"/>
-            </w:pPr>
-            <w:r>
-              <w:t xml:space="preserve">404 Not Found</w:t>
-            </w:r>
-          </w:p>
-        </w:tc>
-        <w:tc>
-          <w:tcPr/>
-          <w:p>
-            <w:pPr>
-              <w:pStyle w:val="Compact"/>
-            </w:pPr>
-            <w:r>
-              <w:t xml:space="preserve">Handled properly by API logic.</w:t>
+              <w:t xml:space="preserve">Isolation</w:t>
+            </w:r>
+          </w:p>
+        </w:tc>
+        <w:tc>
+          <w:tcPr/>
+          <w:p>
+            <w:pPr>
+              <w:pStyle w:val="Compact"/>
+            </w:pPr>
+            <w:r>
+              <w:t xml:space="preserve">عزل قوي (Hardware Level)</w:t>
+            </w:r>
+          </w:p>
+        </w:tc>
+        <w:tc>
+          <w:tcPr/>
+          <w:p>
+            <w:pPr>
+              <w:pStyle w:val="Compact"/>
+            </w:pPr>
+            <w:r>
+              <w:t xml:space="preserve">عزل على مستوى العمليات (Process Level)</w:t>
             </w:r>
           </w:p>
         </w:tc>
@@ -1048,36 +1070,44 @@
               <w:pStyle w:val="Compact"/>
             </w:pPr>
             <w:r>
-              <w:t xml:space="preserve">Invalid POST Payload</w:t>
-            </w:r>
-          </w:p>
-        </w:tc>
-        <w:tc>
-          <w:tcPr/>
-          <w:p>
-            <w:pPr>
-              <w:pStyle w:val="Compact"/>
-            </w:pPr>
-            <w:r>
-              <w:t xml:space="preserve">400 Bad Request</w:t>
-            </w:r>
-          </w:p>
-        </w:tc>
-        <w:tc>
-          <w:tcPr/>
-          <w:p>
-            <w:pPr>
-              <w:pStyle w:val="Compact"/>
-            </w:pPr>
-            <w:r>
-              <w:t xml:space="preserve">Handled properly by API validation.</w:t>
+              <w:t xml:space="preserve">Portability</w:t>
+            </w:r>
+          </w:p>
+        </w:tc>
+        <w:tc>
+          <w:tcPr/>
+          <w:p>
+            <w:pPr>
+              <w:pStyle w:val="Compact"/>
+            </w:pPr>
+            <w:r>
+              <w:t xml:space="preserve">صعبة النقل (ملفات بحجم جيجابايت)</w:t>
+            </w:r>
+          </w:p>
+        </w:tc>
+        <w:tc>
+          <w:tcPr/>
+          <w:p>
+            <w:pPr>
+              <w:pStyle w:val="Compact"/>
+            </w:pPr>
+            <w:r>
+              <w:t xml:space="preserve">سهلة النقل والتوزيع (ميجابايت)</w:t>
             </w:r>
           </w:p>
         </w:tc>
       </w:tr>
     </w:tbl>
-    <w:bookmarkEnd w:id="18"/>
-    <w:bookmarkStart w:id="19" w:name="testing-evidence"/>
+    <w:p>
+      <w:pPr>
+        <w:pStyle w:val="BodyText"/>
+      </w:pPr>
+      <w:r>
+        <w:t xml:space="preserve">يعتبر Docker الخيار الأمثل لهذا المشروع لأنه يسمح بتشغيل الثلاث طبقات على نفس الجهاز باستهلاك موارد ضئيل وبسرعة فائقة.</w:t>
+      </w:r>
+    </w:p>
+    <w:bookmarkEnd w:id="15"/>
+    <w:bookmarkStart w:id="16" w:name="dockerfile-وتحسين-الطبقات"/>
     <w:p>
       <w:pPr>
         <w:pStyle w:val="Heading1"/>
@@ -1086,13 +1116,13 @@
         <w:rPr>
           <w:rStyle w:val="SectionNumber"/>
         </w:rPr>
-        <w:t xml:space="preserve">10</w:t>
+        <w:t xml:space="preserve">8</w:t>
       </w:r>
       <w:r>
         <w:tab/>
       </w:r>
       <w:r>
-        <w:t xml:space="preserve">Testing Evidence</w:t>
+        <w:t xml:space="preserve">8. Dockerfile وتحسين الطبقات</w:t>
       </w:r>
     </w:p>
     <w:p>
@@ -1100,7 +1130,18 @@
         <w:pStyle w:val="FirstParagraph"/>
       </w:pPr>
       <w:r>
-        <w:t xml:space="preserve">A native Node.js test script (pi/tests/test.js) acts as an automated integration test.</w:t>
+        <w:t xml:space="preserve">إليك ملف Dockerfile المستخدم لبرمجة صورة الـ API:</w:t>
+      </w:r>
+    </w:p>
+    <w:p>
+      <w:pPr>
+        <w:pStyle w:val="BodyText"/>
+      </w:pPr>
+      <w:r>
+        <w:rPr>
+          <w:rStyle w:val="VerbatimChar"/>
+        </w:rPr>
+        <w:t xml:space="preserve">dockerfile FROM node:24-alpine WORKDIR /usr/src/app COPY package*.json ./ RUN npm install --omit=dev COPY . . USER node EXPOSE 3000 CMD ["npm", "start"]</w:t>
       </w:r>
       <w:r>
         <w:t xml:space="preserve"> </w:t>
@@ -1116,10 +1157,10 @@
           <w:b/>
           <w:bCs/>
         </w:rPr>
-        <w:t xml:space="preserve">Automated Test</w:t>
-      </w:r>
-      <w:r>
-        <w:t xml:space="preserve">: It sends a GET /api/tasks request to localhost:8080.</w:t>
+        <w:t xml:space="preserve">FROM</w:t>
+      </w:r>
+      <w:r>
+        <w:t xml:space="preserve">: يعتمد على صورة مصغرة lpine لتخفيف الحجم.</w:t>
       </w:r>
       <w:r>
         <w:t xml:space="preserve"> </w:t>
@@ -1135,10 +1176,10 @@
           <w:b/>
           <w:bCs/>
         </w:rPr>
-        <w:t xml:space="preserve">Success Criteria</w:t>
-      </w:r>
-      <w:r>
-        <w:t xml:space="preserve">: It expects an HTTP 200 OK status and exits with code . If the API fails, it exits with code 1.</w:t>
+        <w:t xml:space="preserve">WORKDIR</w:t>
+      </w:r>
+      <w:r>
+        <w:t xml:space="preserve">: يحدد مجلد العمل داخل الحاوية.</w:t>
       </w:r>
       <w:r>
         <w:t xml:space="preserve"> </w:t>
@@ -1154,43 +1195,16 @@
           <w:b/>
           <w:bCs/>
         </w:rPr>
-        <w:t xml:space="preserve">Manual Runtime Tests</w:t>
-      </w:r>
-      <w:r>
-        <w:t xml:space="preserve">: Operations like POST, PUT, DELETE, and failure-mode triggering (stopping containers) were executed manually and successfully verified at runtime.</w:t>
-      </w:r>
-    </w:p>
-    <w:bookmarkEnd w:id="19"/>
-    <w:bookmarkStart w:id="20" w:name="registry-versioning"/>
-    <w:p>
-      <w:pPr>
-        <w:pStyle w:val="Heading1"/>
-      </w:pPr>
-      <w:r>
-        <w:rPr>
-          <w:rStyle w:val="SectionNumber"/>
-        </w:rPr>
-        <w:t xml:space="preserve">11</w:t>
-      </w:r>
-      <w:r>
-        <w:tab/>
-      </w:r>
-      <w:r>
-        <w:t xml:space="preserve">Registry &amp; Versioning</w:t>
-      </w:r>
-    </w:p>
-    <w:p>
-      <w:pPr>
-        <w:pStyle w:val="FirstParagraph"/>
-      </w:pPr>
-      <w:r>
-        <w:t xml:space="preserve">The API Docker image was published to a public registry (Docker Hub).</w:t>
-      </w:r>
-      <w:r>
-        <w:t xml:space="preserve"> </w:t>
-      </w:r>
-      <w:r>
-        <w:t xml:space="preserve">-</w:t>
+        <w:t xml:space="preserve">Layer Caching</w:t>
+      </w:r>
+      <w:r>
+        <w:t xml:space="preserve">: تم وضع COPY package*.json ./ متبوعاً بـ</w:t>
+      </w:r>
+      <w:r>
+        <w:t xml:space="preserve"> </w:t>
+      </w:r>
+      <w:r>
+        <w:t xml:space="preserve">pm install</w:t>
       </w:r>
       <w:r>
         <w:t xml:space="preserve"> </w:t>
@@ -1200,10 +1214,13 @@
           <w:b/>
           <w:bCs/>
         </w:rPr>
-        <w:t xml:space="preserve">Repository</w:t>
-      </w:r>
-      <w:r>
-        <w:t xml:space="preserve">: hishamdiv/task-management-api</w:t>
+        <w:t xml:space="preserve">قبل</w:t>
+      </w:r>
+      <w:r>
+        <w:t xml:space="preserve"> </w:t>
+      </w:r>
+      <w:r>
+        <w:t xml:space="preserve">أمر COPY . .. هذا يضمن عدم إعادة تنزيل المكتبات إذا تم تعديل الكود المصدري فقط، مما يسرّع البناء.</w:t>
       </w:r>
       <w:r>
         <w:t xml:space="preserve"> </w:t>
@@ -1219,10 +1236,16 @@
           <w:b/>
           <w:bCs/>
         </w:rPr>
-        <w:t xml:space="preserve">Tags</w:t>
-      </w:r>
-      <w:r>
-        <w:t xml:space="preserve">: 1.0.0 and latest</w:t>
+        <w:t xml:space="preserve">USER</w:t>
+      </w:r>
+      <w:r>
+        <w:t xml:space="preserve">: يحول المستخدم من oot إلى</w:t>
+      </w:r>
+      <w:r>
+        <w:t xml:space="preserve"> </w:t>
+      </w:r>
+      <w:r>
+        <w:t xml:space="preserve">ode لتعزيز الأمان (Least Privilege).</w:t>
       </w:r>
       <w:r>
         <w:t xml:space="preserve"> </w:t>
@@ -1238,10 +1261,598 @@
           <w:b/>
           <w:bCs/>
         </w:rPr>
-        <w:t xml:space="preserve">Digest</w:t>
-      </w:r>
-      <w:r>
-        <w:t xml:space="preserve">: sha256:799e625d06f9fdacb5a12da1edc08556a029c7c809e3ec2b238005803cba694d</w:t>
+        <w:t xml:space="preserve">EXPOSE</w:t>
+      </w:r>
+      <w:r>
+        <w:t xml:space="preserve">: يوثق أن المنفذ 3000 مستخدم داخلياً، ولكنه لا يفتحه على المضيف.</w:t>
+      </w:r>
+    </w:p>
+    <w:bookmarkEnd w:id="16"/>
+    <w:bookmarkStart w:id="17" w:name="docker-compose"/>
+    <w:p>
+      <w:pPr>
+        <w:pStyle w:val="Heading1"/>
+      </w:pPr>
+      <w:r>
+        <w:rPr>
+          <w:rStyle w:val="SectionNumber"/>
+        </w:rPr>
+        <w:t xml:space="preserve">9</w:t>
+      </w:r>
+      <w:r>
+        <w:tab/>
+      </w:r>
+      <w:r>
+        <w:t xml:space="preserve">9. Docker Compose</w:t>
+      </w:r>
+    </w:p>
+    <w:p>
+      <w:pPr>
+        <w:pStyle w:val="FirstParagraph"/>
+      </w:pPr>
+      <w:r>
+        <w:t xml:space="preserve">ملف compose.yaml هو القلب النابض للنظام، حيث يعرّف الخدمات:</w:t>
+      </w:r>
+      <w:r>
+        <w:t xml:space="preserve"> </w:t>
+      </w:r>
+      <w:r>
+        <w:t xml:space="preserve">- ask-management-db</w:t>
+      </w:r>
+      <w:r>
+        <w:t xml:space="preserve"> </w:t>
+      </w:r>
+      <w:r>
+        <w:t xml:space="preserve">- ask-management-api</w:t>
+      </w:r>
+      <w:r>
+        <w:t xml:space="preserve"> </w:t>
+      </w:r>
+      <w:r>
+        <w:t xml:space="preserve">- ask-management-nginx</w:t>
+      </w:r>
+      <w:r>
+        <w:t xml:space="preserve"> </w:t>
+      </w:r>
+      <w:r>
+        <w:t xml:space="preserve">استخدمنا depends_on مع healthcheck لضمان عدم عمل الـ API إلا بعد جاهزية قاعدة البيانات تماماً. وُضعت المتغيرات الأمنية في قسم environment، وتم ربط الجميع في</w:t>
+      </w:r>
+      <w:r>
+        <w:t xml:space="preserve"> </w:t>
+      </w:r>
+      <w:r>
+        <w:t xml:space="preserve">etworks. تم تخصيص ports لحاوية Nginx فقط (8080:80) لإبقاء الـ API وقاعدة البيانات مخفيتين تماماً.</w:t>
+      </w:r>
+    </w:p>
+    <w:bookmarkEnd w:id="17"/>
+    <w:bookmarkStart w:id="18" w:name="network-architecture"/>
+    <w:p>
+      <w:pPr>
+        <w:pStyle w:val="Heading1"/>
+      </w:pPr>
+      <w:r>
+        <w:rPr>
+          <w:rStyle w:val="SectionNumber"/>
+        </w:rPr>
+        <w:t xml:space="preserve">10</w:t>
+      </w:r>
+      <w:r>
+        <w:tab/>
+      </w:r>
+      <w:r>
+        <w:t xml:space="preserve">10. Network Architecture</w:t>
+      </w:r>
+    </w:p>
+    <w:p>
+      <w:pPr>
+        <w:pStyle w:val="FirstParagraph"/>
+      </w:pPr>
+      <w:r>
+        <w:t xml:space="preserve">يعتمد المشروع على شبكة من نوع Bridge Network تسمى ask-management-network. هذه الشبكة توفر خدمة نظام أسماء النطاقات الداخلي (Internal DNS) واكتشاف الخدمات (Service Discovery). بفضل هذا، يمكن لحاوية الـ API التحدث مع قاعدة البيانات بمجرد استخدام اسمها ask-management-db دون الحاجة لمعرفة عنوان الـ IP المتغير الخاص بها.</w:t>
+      </w:r>
+    </w:p>
+    <w:bookmarkEnd w:id="18"/>
+    <w:bookmarkStart w:id="19" w:name="nginx-reverse-proxy"/>
+    <w:p>
+      <w:pPr>
+        <w:pStyle w:val="Heading1"/>
+      </w:pPr>
+      <w:r>
+        <w:rPr>
+          <w:rStyle w:val="SectionNumber"/>
+        </w:rPr>
+        <w:t xml:space="preserve">11</w:t>
+      </w:r>
+      <w:r>
+        <w:tab/>
+      </w:r>
+      <w:r>
+        <w:t xml:space="preserve">11. Nginx Reverse Proxy</w:t>
+      </w:r>
+    </w:p>
+    <w:p>
+      <w:pPr>
+        <w:pStyle w:val="FirstParagraph"/>
+      </w:pPr>
+      <w:r>
+        <w:t xml:space="preserve">يعمل Nginx كوكيل عكسي (Reverse Proxy). مسار الطلب الفعلي هو:</w:t>
+      </w:r>
+      <w:r>
+        <w:t xml:space="preserve"> </w:t>
+      </w:r>
+      <w:r>
+        <w:t xml:space="preserve">Client</w:t>
+      </w:r>
+      <w:r>
+        <w:t xml:space="preserve"> </w:t>
+      </w:r>
+      <m:oMath>
+        <m:r>
+          <m:rPr>
+            <m:sty m:val="p"/>
+          </m:rPr>
+          <m:t>→</m:t>
+        </m:r>
+      </m:oMath>
+      <w:r>
+        <w:t xml:space="preserve"> </w:t>
+      </w:r>
+      <w:r>
+        <w:t xml:space="preserve">localhost:8080</w:t>
+      </w:r>
+      <w:r>
+        <w:t xml:space="preserve"> </w:t>
+      </w:r>
+      <m:oMath>
+        <m:r>
+          <m:rPr>
+            <m:sty m:val="p"/>
+          </m:rPr>
+          <m:t>→</m:t>
+        </m:r>
+      </m:oMath>
+      <w:r>
+        <w:t xml:space="preserve"> </w:t>
+      </w:r>
+      <w:r>
+        <w:t xml:space="preserve">Nginx 80</w:t>
+      </w:r>
+      <w:r>
+        <w:t xml:space="preserve"> </w:t>
+      </w:r>
+      <m:oMath>
+        <m:r>
+          <m:rPr>
+            <m:sty m:val="p"/>
+          </m:rPr>
+          <m:t>→</m:t>
+        </m:r>
+      </m:oMath>
+      <w:r>
+        <w:t xml:space="preserve"> </w:t>
+      </w:r>
+      <w:r>
+        <w:t xml:space="preserve">ask-management-api:3000</w:t>
+      </w:r>
+      <w:r>
+        <w:t xml:space="preserve"> </w:t>
+      </w:r>
+      <m:oMath>
+        <m:r>
+          <m:rPr>
+            <m:sty m:val="p"/>
+          </m:rPr>
+          <m:t>→</m:t>
+        </m:r>
+      </m:oMath>
+      <w:r>
+        <w:t xml:space="preserve"> </w:t>
+      </w:r>
+      <w:r>
+        <w:t xml:space="preserve">PostgreSQL 5432</w:t>
+      </w:r>
+      <w:r>
+        <w:t xml:space="preserve"> </w:t>
+      </w:r>
+      <w:r>
+        <w:t xml:space="preserve">يحقق هذا أماناً عالياً (Network Isolation)، ويوفر نقطة دخول واحدة مركزية لتنظيم حركة المرور (Traffic Routing).</w:t>
+      </w:r>
+    </w:p>
+    <w:bookmarkEnd w:id="19"/>
+    <w:bookmarkStart w:id="20" w:name="storage-architecture-وpersistence"/>
+    <w:p>
+      <w:pPr>
+        <w:pStyle w:val="Heading1"/>
+      </w:pPr>
+      <w:r>
+        <w:rPr>
+          <w:rStyle w:val="SectionNumber"/>
+        </w:rPr>
+        <w:t xml:space="preserve">12</w:t>
+      </w:r>
+      <w:r>
+        <w:tab/>
+      </w:r>
+      <w:r>
+        <w:t xml:space="preserve">12. Storage Architecture وPersistence</w:t>
+      </w:r>
+    </w:p>
+    <w:p>
+      <w:pPr>
+        <w:pStyle w:val="FirstParagraph"/>
+      </w:pPr>
+      <w:r>
+        <w:t xml:space="preserve">بشكل افتراضي، نظام ملفات الحاوية (Container filesystem) هو نظام مؤقت يُمحى بمجرد حذف الحاوية. لضمان بقاء البيانات، استخدمنا وحدة تخزين مسماة (Named Volume) تدعى ask-management-db-data وتم ربطها بمسار قاعدة البيانات /var/lib/postgresql/data. هذا يفصل دورة حياة البيانات عن دورة حياة الحاويات.</w:t>
+      </w:r>
+    </w:p>
+    <w:bookmarkEnd w:id="20"/>
+    <w:bookmarkStart w:id="21" w:name="إثبات-persistence"/>
+    <w:p>
+      <w:pPr>
+        <w:pStyle w:val="Heading1"/>
+      </w:pPr>
+      <w:r>
+        <w:rPr>
+          <w:rStyle w:val="SectionNumber"/>
+        </w:rPr>
+        <w:t xml:space="preserve">13</w:t>
+      </w:r>
+      <w:r>
+        <w:tab/>
+      </w:r>
+      <w:r>
+        <w:t xml:space="preserve">13. إثبات Persistence</w:t>
+      </w:r>
+    </w:p>
+    <w:p>
+      <w:pPr>
+        <w:pStyle w:val="FirstParagraph"/>
+      </w:pPr>
+      <w:r>
+        <w:t xml:space="preserve">للتأكد من استمرارية البيانات، قمنا بإنشاء مهمة (Task) جديدة ثم إيقاف النظام بأمر docker compose down. وعند تشغيل النظام مجدداً بـ docker compose up -d وطلب البيانات، وُجدت المهمة كما هي.</w:t>
+      </w:r>
+      <w:r>
+        <w:t xml:space="preserve"> </w:t>
+      </w:r>
+      <w:r>
+        <w:t xml:space="preserve">تحذير: لا ينبغي أبداً استخدام docker compose down -v لأنه يقوم بتدمير الـ named volumes ويمسح البيانات نهائياً.</w:t>
+      </w:r>
+    </w:p>
+    <w:bookmarkEnd w:id="21"/>
+    <w:bookmarkStart w:id="22" w:name="security-practices"/>
+    <w:p>
+      <w:pPr>
+        <w:pStyle w:val="Heading1"/>
+      </w:pPr>
+      <w:r>
+        <w:rPr>
+          <w:rStyle w:val="SectionNumber"/>
+        </w:rPr>
+        <w:t xml:space="preserve">14</w:t>
+      </w:r>
+      <w:r>
+        <w:tab/>
+      </w:r>
+      <w:r>
+        <w:t xml:space="preserve">14. Security Practices</w:t>
+      </w:r>
+    </w:p>
+    <w:p>
+      <w:pPr>
+        <w:pStyle w:val="FirstParagraph"/>
+      </w:pPr>
+      <w:r>
+        <w:t xml:space="preserve">ركزنا على الجوانب الأمنية من خلال:</w:t>
+      </w:r>
+      <w:r>
+        <w:t xml:space="preserve"> </w:t>
+      </w:r>
+      <w:r>
+        <w:t xml:space="preserve">- تشغيل الـ API بمستخدم غير جذري USER node.</w:t>
+      </w:r>
+      <w:r>
+        <w:t xml:space="preserve"> </w:t>
+      </w:r>
+      <w:r>
+        <w:t xml:space="preserve">- إخفاء المنافذ 3000 و 5432 عن المضيف تماماً.</w:t>
+      </w:r>
+      <w:r>
+        <w:t xml:space="preserve"> </w:t>
+      </w:r>
+      <w:r>
+        <w:t xml:space="preserve">- الاعتماد على Nginx كمدخل خارجي وحيد.</w:t>
+      </w:r>
+      <w:r>
+        <w:t xml:space="preserve"> </w:t>
+      </w:r>
+      <w:r>
+        <w:t xml:space="preserve">- استخدام ملفات .gitignore و .dockerignore لمنع رفع الملفات الحساسة (Secrets) أو الكبيرة (node_modules) إلى GitHub والسجل.</w:t>
+      </w:r>
+      <w:r>
+        <w:t xml:space="preserve"> </w:t>
+      </w:r>
+      <w:r>
+        <w:t xml:space="preserve">- تثبيت حزم الإنتاج فقط عبر –omit=dev.</w:t>
+      </w:r>
+    </w:p>
+    <w:bookmarkEnd w:id="22"/>
+    <w:bookmarkStart w:id="23" w:name="failure-mode-scenarios"/>
+    <w:p>
+      <w:pPr>
+        <w:pStyle w:val="Heading1"/>
+      </w:pPr>
+      <w:r>
+        <w:rPr>
+          <w:rStyle w:val="SectionNumber"/>
+        </w:rPr>
+        <w:t xml:space="preserve">15</w:t>
+      </w:r>
+      <w:r>
+        <w:tab/>
+      </w:r>
+      <w:r>
+        <w:t xml:space="preserve">15. Failure Mode Scenarios</w:t>
+      </w:r>
+    </w:p>
+    <w:p>
+      <w:pPr>
+        <w:pStyle w:val="FirstParagraph"/>
+      </w:pPr>
+      <w:r>
+        <w:t xml:space="preserve">تمت محاكاة انهيار النظام للتأكد من قدرته على التعامل مع الأخطاء:</w:t>
+      </w:r>
+    </w:p>
+    <w:tbl>
+      <w:tblPr>
+        <w:tblStyle w:val="Table"/>
+        <w:tblW w:type="pct" w:w="5000"/>
+        <w:tblLayout w:type="fixed"/>
+        <w:tblLook w:firstRow="1" w:lastRow="0" w:firstColumn="0" w:lastColumn="0" w:noHBand="0" w:noVBand="0" w:val="0020"/>
+      </w:tblPr>
+      <w:tblGrid>
+        <w:gridCol w:w="2640"/>
+        <w:gridCol w:w="2640"/>
+        <w:gridCol w:w="2640"/>
+      </w:tblGrid>
+      <w:tr>
+        <w:trPr>
+          <w:tblHeader w:val="on"/>
+        </w:trPr>
+        <w:tc>
+          <w:tcPr/>
+          <w:p>
+            <w:pPr>
+              <w:pStyle w:val="Compact"/>
+            </w:pPr>
+            <w:r>
+              <w:t xml:space="preserve">الحالة</w:t>
+            </w:r>
+          </w:p>
+        </w:tc>
+        <w:tc>
+          <w:tcPr/>
+          <w:p>
+            <w:pPr>
+              <w:pStyle w:val="Compact"/>
+            </w:pPr>
+            <w:r>
+              <w:t xml:space="preserve">النتيجة</w:t>
+            </w:r>
+          </w:p>
+        </w:tc>
+        <w:tc>
+          <w:tcPr/>
+          <w:p>
+            <w:pPr>
+              <w:pStyle w:val="Compact"/>
+            </w:pPr>
+            <w:r>
+              <w:t xml:space="preserve">التفسير</w:t>
+            </w:r>
+          </w:p>
+        </w:tc>
+      </w:tr>
+      <w:tr>
+        <w:tc>
+          <w:tcPr/>
+          <w:p>
+            <w:pPr>
+              <w:pStyle w:val="Compact"/>
+            </w:pPr>
+            <w:r>
+              <w:t xml:space="preserve">توقف API</w:t>
+            </w:r>
+          </w:p>
+        </w:tc>
+        <w:tc>
+          <w:tcPr/>
+          <w:p>
+            <w:pPr>
+              <w:pStyle w:val="Compact"/>
+            </w:pPr>
+            <w:r>
+              <w:t xml:space="preserve">502 Bad Gateway</w:t>
+            </w:r>
+          </w:p>
+        </w:tc>
+        <w:tc>
+          <w:tcPr/>
+          <w:p>
+            <w:pPr>
+              <w:pStyle w:val="Compact"/>
+            </w:pPr>
+            <w:r>
+              <w:t xml:space="preserve">Nginx يعمل لكنه لا يجد الخادم الخلفي.</w:t>
+            </w:r>
+          </w:p>
+        </w:tc>
+      </w:tr>
+      <w:tr>
+        <w:tc>
+          <w:tcPr/>
+          <w:p>
+            <w:pPr>
+              <w:pStyle w:val="Compact"/>
+            </w:pPr>
+            <w:r>
+              <w:t xml:space="preserve">توقف Database</w:t>
+            </w:r>
+          </w:p>
+        </w:tc>
+        <w:tc>
+          <w:tcPr/>
+          <w:p>
+            <w:pPr>
+              <w:pStyle w:val="Compact"/>
+            </w:pPr>
+            <w:r>
+              <w:t xml:space="preserve">500 Internal Server Error</w:t>
+            </w:r>
+          </w:p>
+        </w:tc>
+        <w:tc>
+          <w:tcPr/>
+          <w:p>
+            <w:pPr>
+              <w:pStyle w:val="Compact"/>
+            </w:pPr>
+            <w:r>
+              <w:t xml:space="preserve">الـ API يعمل لكنه يفشل في تنفيذ الاستعلامات.</w:t>
+            </w:r>
+          </w:p>
+        </w:tc>
+      </w:tr>
+      <w:tr>
+        <w:tc>
+          <w:tcPr/>
+          <w:p>
+            <w:pPr>
+              <w:pStyle w:val="Compact"/>
+            </w:pPr>
+            <w:r>
+              <w:t xml:space="preserve">توقف Nginx</w:t>
+            </w:r>
+          </w:p>
+        </w:tc>
+        <w:tc>
+          <w:tcPr/>
+          <w:p>
+            <w:pPr>
+              <w:pStyle w:val="Compact"/>
+            </w:pPr>
+            <w:r>
+              <w:t xml:space="preserve">Connection Refused</w:t>
+            </w:r>
+          </w:p>
+        </w:tc>
+        <w:tc>
+          <w:tcPr/>
+          <w:p>
+            <w:pPr>
+              <w:pStyle w:val="Compact"/>
+            </w:pPr>
+            <w:r>
+              <w:t xml:space="preserve">نقطة الدخول متوقفة كلياً.</w:t>
+            </w:r>
+          </w:p>
+        </w:tc>
+      </w:tr>
+      <w:tr>
+        <w:tc>
+          <w:tcPr/>
+          <w:p>
+            <w:pPr>
+              <w:pStyle w:val="Compact"/>
+            </w:pPr>
+            <w:r>
+              <w:t xml:space="preserve">Task ID غير موجود</w:t>
+            </w:r>
+          </w:p>
+        </w:tc>
+        <w:tc>
+          <w:tcPr/>
+          <w:p>
+            <w:pPr>
+              <w:pStyle w:val="Compact"/>
+            </w:pPr>
+            <w:r>
+              <w:t xml:space="preserve">404 Not Found</w:t>
+            </w:r>
+          </w:p>
+        </w:tc>
+        <w:tc>
+          <w:tcPr/>
+          <w:p>
+            <w:pPr>
+              <w:pStyle w:val="Compact"/>
+            </w:pPr>
+            <w:r>
+              <w:t xml:space="preserve">الـ API يعالج الطلب ويرد برمز خطأ سليم.</w:t>
+            </w:r>
+          </w:p>
+        </w:tc>
+      </w:tr>
+      <w:tr>
+        <w:tc>
+          <w:tcPr/>
+          <w:p>
+            <w:pPr>
+              <w:pStyle w:val="Compact"/>
+            </w:pPr>
+            <w:r>
+              <w:t xml:space="preserve">POST ببيانات خاطئة</w:t>
+            </w:r>
+          </w:p>
+        </w:tc>
+        <w:tc>
+          <w:tcPr/>
+          <w:p>
+            <w:pPr>
+              <w:pStyle w:val="Compact"/>
+            </w:pPr>
+            <w:r>
+              <w:t xml:space="preserve">400 Bad Request</w:t>
+            </w:r>
+          </w:p>
+        </w:tc>
+        <w:tc>
+          <w:tcPr/>
+          <w:p>
+            <w:pPr>
+              <w:pStyle w:val="Compact"/>
+            </w:pPr>
+            <w:r>
+              <w:t xml:space="preserve">الـ API يرفض البيانات لعدم مطابقتها للشروط.</w:t>
+            </w:r>
+          </w:p>
+        </w:tc>
+      </w:tr>
+    </w:tbl>
+    <w:bookmarkEnd w:id="23"/>
+    <w:bookmarkStart w:id="24" w:name="testing-evidence"/>
+    <w:p>
+      <w:pPr>
+        <w:pStyle w:val="Heading1"/>
+      </w:pPr>
+      <w:r>
+        <w:rPr>
+          <w:rStyle w:val="SectionNumber"/>
+        </w:rPr>
+        <w:t xml:space="preserve">16</w:t>
+      </w:r>
+      <w:r>
+        <w:tab/>
+      </w:r>
+      <w:r>
+        <w:t xml:space="preserve">16. Testing Evidence</w:t>
+      </w:r>
+    </w:p>
+    <w:p>
+      <w:pPr>
+        <w:pStyle w:val="FirstParagraph"/>
+      </w:pPr>
+      <w:r>
+        <w:t xml:space="preserve">تم تنفيذ الاختبارات على مستويين:</w:t>
       </w:r>
       <w:r>
         <w:t xml:space="preserve"> </w:t>
@@ -1257,26 +1868,33 @@
           <w:b/>
           <w:bCs/>
         </w:rPr>
-        <w:t xml:space="preserve">Verification</w:t>
-      </w:r>
-      <w:r>
-        <w:t xml:space="preserve">: A</w:t>
-      </w:r>
-      <w:r>
-        <w:t xml:space="preserve"> </w:t>
-      </w:r>
-      <w:r>
-        <w:t xml:space="preserve">“Clean Pull Workflow”</w:t>
-      </w:r>
-      <w:r>
-        <w:t xml:space="preserve"> </w:t>
-      </w:r>
-      <w:r>
-        <w:t xml:space="preserve">was executed by removing local images and successfully pulling hishamdiv/task-management-api:v1.0.0 from Docker Hub.</w:t>
-      </w:r>
-    </w:p>
-    <w:bookmarkEnd w:id="20"/>
-    <w:bookmarkStart w:id="21" w:name="conclusion"/>
+        <w:t xml:space="preserve">Automated Testing</w:t>
+      </w:r>
+      <w:r>
+        <w:t xml:space="preserve">: ملف pi/tests/test.js يقوم تلقائياً بطلب GET للتأكد من عمل الـ API.</w:t>
+      </w:r>
+      <w:r>
+        <w:t xml:space="preserve"> </w:t>
+      </w:r>
+      <w:r>
+        <w:t xml:space="preserve">-</w:t>
+      </w:r>
+      <w:r>
+        <w:t xml:space="preserve"> </w:t>
+      </w:r>
+      <w:r>
+        <w:rPr>
+          <w:b/>
+          <w:bCs/>
+        </w:rPr>
+        <w:t xml:space="preserve">Manual Runtime Testing</w:t>
+      </w:r>
+      <w:r>
+        <w:t xml:space="preserve">: تم اختبار وظائف POST و PUT و DELETE، بالإضافة لسيناريوهات الفشل المختلفة، يدوياً أثناء التشغيل للتأكد من الموثوقية الشاملة.</w:t>
+      </w:r>
+    </w:p>
+    <w:bookmarkEnd w:id="24"/>
+    <w:bookmarkStart w:id="25" w:name="docker-hub-registry-versioning"/>
     <w:p>
       <w:pPr>
         <w:pStyle w:val="Heading1"/>
@@ -1285,13 +1903,13 @@
         <w:rPr>
           <w:rStyle w:val="SectionNumber"/>
         </w:rPr>
-        <w:t xml:space="preserve">12</w:t>
+        <w:t xml:space="preserve">17</w:t>
       </w:r>
       <w:r>
         <w:tab/>
       </w:r>
       <w:r>
-        <w:t xml:space="preserve">Conclusion</w:t>
+        <w:t xml:space="preserve">17. Docker Hub / Registry &amp; Versioning</w:t>
       </w:r>
     </w:p>
     <w:p>
@@ -1299,10 +1917,640 @@
         <w:pStyle w:val="FirstParagraph"/>
       </w:pPr>
       <w:r>
-        <w:t xml:space="preserve">The Task Management API project successfully fulfills all requirements of the Cloud Computing and Containerization specification. Through the strategic use of Docker, Nginx, and Node.js, the project demonstrates a robust, portable, and secure architecture capable of handling failures gracefully while ensuring data persistence.</w:t>
-      </w:r>
-    </w:p>
-    <w:bookmarkEnd w:id="21"/>
+        <w:t xml:space="preserve">تم بناء ورفع صورة (Image) المشروع إلى السجل (Docker Registry) في موقع Docker Hub.</w:t>
+      </w:r>
+      <w:r>
+        <w:t xml:space="preserve"> </w:t>
+      </w:r>
+      <w:r>
+        <w:t xml:space="preserve">- المستودع: hishamdiv/task-management-api</w:t>
+      </w:r>
+      <w:r>
+        <w:t xml:space="preserve"> </w:t>
+      </w:r>
+      <w:r>
+        <w:t xml:space="preserve">تم استخدام علامات (Tags) تعتمد على (Semantic Versioning):</w:t>
+      </w:r>
+      <w:r>
+        <w:t xml:space="preserve"> </w:t>
+      </w:r>
+      <w:r>
+        <w:t xml:space="preserve">- 1.0.0: لتجميد إصدار مستقر لا يتغير.</w:t>
+      </w:r>
+      <w:r>
+        <w:t xml:space="preserve"> </w:t>
+      </w:r>
+      <w:r>
+        <w:t xml:space="preserve">- latest: ليكون مؤشراً لأحدث نسخة متوفرة.</w:t>
+      </w:r>
+    </w:p>
+    <w:bookmarkEnd w:id="25"/>
+    <w:bookmarkStart w:id="26" w:name="reproducible-deployment"/>
+    <w:p>
+      <w:pPr>
+        <w:pStyle w:val="Heading1"/>
+      </w:pPr>
+      <w:r>
+        <w:rPr>
+          <w:rStyle w:val="SectionNumber"/>
+        </w:rPr>
+        <w:t xml:space="preserve">18</w:t>
+      </w:r>
+      <w:r>
+        <w:tab/>
+      </w:r>
+      <w:r>
+        <w:t xml:space="preserve">18. Reproducible Deployment</w:t>
+      </w:r>
+    </w:p>
+    <w:p>
+      <w:pPr>
+        <w:pStyle w:val="FirstParagraph"/>
+      </w:pPr>
+      <w:r>
+        <w:t xml:space="preserve">يمكن لأي شخص الآن إعادة تشغيل النظام بكفاءة وفي ثوانٍ عبر الأوامر:</w:t>
+      </w:r>
+      <w:r>
+        <w:t xml:space="preserve"> </w:t>
+      </w:r>
+      <w:r>
+        <w:rPr>
+          <w:rStyle w:val="VerbatimChar"/>
+        </w:rPr>
+        <w:t xml:space="preserve">ext git clone [repository-url] cd task-management-api docker compose up -d</w:t>
+      </w:r>
+      <w:r>
+        <w:t xml:space="preserve"> </w:t>
+      </w:r>
+      <w:r>
+        <w:t xml:space="preserve">يضمن هذا التوافق الكامل عبر الأجهزة المختلفة بفضل الـ Dockerfile وصور Docker Hub.</w:t>
+      </w:r>
+    </w:p>
+    <w:bookmarkEnd w:id="26"/>
+    <w:bookmarkStart w:id="27" w:name="git-وgithub"/>
+    <w:p>
+      <w:pPr>
+        <w:pStyle w:val="Heading1"/>
+      </w:pPr>
+      <w:r>
+        <w:rPr>
+          <w:rStyle w:val="SectionNumber"/>
+        </w:rPr>
+        <w:t xml:space="preserve">19</w:t>
+      </w:r>
+      <w:r>
+        <w:tab/>
+      </w:r>
+      <w:r>
+        <w:t xml:space="preserve">19. Git وGitHub</w:t>
+      </w:r>
+    </w:p>
+    <w:p>
+      <w:pPr>
+        <w:pStyle w:val="FirstParagraph"/>
+      </w:pPr>
+      <w:r>
+        <w:t xml:space="preserve">تم تتبع التغييرات باستخدام نظام Git من خلال التزام (Commit) وحفظ الفروع (Branch) مثل main. تم رفع المشروع إلى الخادم البعيد (Remote) على موقع GitHub، مما يعزز أمان الكود وسهولة الوصول إليه.</w:t>
+      </w:r>
+    </w:p>
+    <w:bookmarkEnd w:id="27"/>
+    <w:bookmarkStart w:id="28" w:name="team-contributions"/>
+    <w:p>
+      <w:pPr>
+        <w:pStyle w:val="Heading1"/>
+      </w:pPr>
+      <w:r>
+        <w:rPr>
+          <w:rStyle w:val="SectionNumber"/>
+        </w:rPr>
+        <w:t xml:space="preserve">20</w:t>
+      </w:r>
+      <w:r>
+        <w:tab/>
+      </w:r>
+      <w:r>
+        <w:t xml:space="preserve">20. Team Contributions</w:t>
+      </w:r>
+    </w:p>
+    <w:tbl>
+      <w:tblPr>
+        <w:tblStyle w:val="Table"/>
+        <w:tblW w:type="auto" w:w="0"/>
+        <w:tblLook w:firstRow="1" w:lastRow="0" w:firstColumn="0" w:lastColumn="0" w:noHBand="0" w:noVBand="0" w:val="0020"/>
+      </w:tblPr>
+      <w:tblGrid>
+        <w:gridCol w:w="3960"/>
+        <w:gridCol w:w="3960"/>
+      </w:tblGrid>
+      <w:tr>
+        <w:trPr>
+          <w:tblHeader w:val="on"/>
+        </w:trPr>
+        <w:tc>
+          <w:tcPr/>
+          <w:p>
+            <w:pPr>
+              <w:pStyle w:val="Compact"/>
+            </w:pPr>
+            <w:r>
+              <w:t xml:space="preserve">عضو الفريق</w:t>
+            </w:r>
+          </w:p>
+        </w:tc>
+        <w:tc>
+          <w:tcPr/>
+          <w:p>
+            <w:pPr>
+              <w:pStyle w:val="Compact"/>
+            </w:pPr>
+            <w:r>
+              <w:t xml:space="preserve">المسؤوليات</w:t>
+            </w:r>
+          </w:p>
+        </w:tc>
+      </w:tr>
+      <w:tr>
+        <w:tc>
+          <w:tcPr/>
+          <w:p>
+            <w:pPr>
+              <w:pStyle w:val="Compact"/>
+            </w:pPr>
+            <w:r>
+              <w:t xml:space="preserve">[اسم عضو الفريق الأول]</w:t>
+            </w:r>
+          </w:p>
+        </w:tc>
+        <w:tc>
+          <w:tcPr/>
+          <w:p>
+            <w:pPr>
+              <w:pStyle w:val="Compact"/>
+            </w:pPr>
+            <w:r>
+              <w:t xml:space="preserve">Backend Development &amp; Containerization</w:t>
+            </w:r>
+          </w:p>
+        </w:tc>
+      </w:tr>
+      <w:tr>
+        <w:tc>
+          <w:tcPr/>
+          <w:p>
+            <w:pPr>
+              <w:pStyle w:val="Compact"/>
+            </w:pPr>
+            <w:r>
+              <w:t xml:space="preserve">[اسم عضو الفريق الثاني]</w:t>
+            </w:r>
+          </w:p>
+        </w:tc>
+        <w:tc>
+          <w:tcPr/>
+          <w:p>
+            <w:pPr>
+              <w:pStyle w:val="Compact"/>
+            </w:pPr>
+            <w:r>
+              <w:t xml:space="preserve">Reverse Proxy &amp; Security</w:t>
+            </w:r>
+          </w:p>
+        </w:tc>
+      </w:tr>
+      <w:tr>
+        <w:tc>
+          <w:tcPr/>
+          <w:p>
+            <w:pPr>
+              <w:pStyle w:val="Compact"/>
+            </w:pPr>
+            <w:r>
+              <w:t xml:space="preserve">[اسم عضو الفريق الثالث]</w:t>
+            </w:r>
+          </w:p>
+        </w:tc>
+        <w:tc>
+          <w:tcPr/>
+          <w:p>
+            <w:pPr>
+              <w:pStyle w:val="Compact"/>
+            </w:pPr>
+            <w:r>
+              <w:t xml:space="preserve">Database &amp; Storage</w:t>
+            </w:r>
+          </w:p>
+        </w:tc>
+      </w:tr>
+      <w:tr>
+        <w:tc>
+          <w:tcPr/>
+          <w:p>
+            <w:pPr>
+              <w:pStyle w:val="Compact"/>
+            </w:pPr>
+            <w:r>
+              <w:t xml:space="preserve">[اسم عضو الفريق الرابع]</w:t>
+            </w:r>
+          </w:p>
+        </w:tc>
+        <w:tc>
+          <w:tcPr/>
+          <w:p>
+            <w:pPr>
+              <w:pStyle w:val="Compact"/>
+            </w:pPr>
+            <w:r>
+              <w:t xml:space="preserve">Testing &amp; Documentation</w:t>
+            </w:r>
+          </w:p>
+        </w:tc>
+      </w:tr>
+    </w:tbl>
+    <w:bookmarkEnd w:id="28"/>
+    <w:bookmarkStart w:id="29" w:name="خطوات-تشغيل-المشروع"/>
+    <w:p>
+      <w:pPr>
+        <w:pStyle w:val="Heading1"/>
+      </w:pPr>
+      <w:r>
+        <w:rPr>
+          <w:rStyle w:val="SectionNumber"/>
+        </w:rPr>
+        <w:t xml:space="preserve">21</w:t>
+      </w:r>
+      <w:r>
+        <w:tab/>
+      </w:r>
+      <w:r>
+        <w:t xml:space="preserve">21. خطوات تشغيل المشروع</w:t>
+      </w:r>
+    </w:p>
+    <w:p>
+      <w:pPr>
+        <w:pStyle w:val="FirstParagraph"/>
+      </w:pPr>
+      <w:r>
+        <w:t xml:space="preserve">للتحقق العملي من النظام، يمكنك تنفيذ الأوامر التالية:</w:t>
+      </w:r>
+      <w:r>
+        <w:t xml:space="preserve"> </w:t>
+      </w:r>
+      <w:r>
+        <w:rPr>
+          <w:rStyle w:val="VerbatimChar"/>
+        </w:rPr>
+        <w:t xml:space="preserve">powershell cd "C:\Users\NOMAN\Projects\task-management-api" docker compose config docker compose up -d --build docker compose ps Invoke-RestMethod -Uri "http://localhost:8080/api/tasks" -Method GET</w:t>
+      </w:r>
+    </w:p>
+    <w:bookmarkEnd w:id="29"/>
+    <w:bookmarkStart w:id="30" w:name="الخاتمة"/>
+    <w:p>
+      <w:pPr>
+        <w:pStyle w:val="Heading1"/>
+      </w:pPr>
+      <w:r>
+        <w:rPr>
+          <w:rStyle w:val="SectionNumber"/>
+        </w:rPr>
+        <w:t xml:space="preserve">22</w:t>
+      </w:r>
+      <w:r>
+        <w:tab/>
+      </w:r>
+      <w:r>
+        <w:t xml:space="preserve">22. الخاتمة</w:t>
+      </w:r>
+    </w:p>
+    <w:p>
+      <w:pPr>
+        <w:pStyle w:val="FirstParagraph"/>
+      </w:pPr>
+      <w:r>
+        <w:t xml:space="preserve">أثبت هذا المشروع نجاحه في تقديم معمارية قوية ومرنة باستخدام حاويات Docker. تم بناء واجهة تطبيقات مستقرة ومعزولة شبكياً ومحمية بواسطة وكيل عكسي. مع ضمان استمرارية البيانات وإدارة الانهيارات بطريقة سليمة، نكون قد حققنا كافة متطلبات النشر السحابي الحديث.</w:t>
+      </w:r>
+    </w:p>
+    <w:bookmarkEnd w:id="30"/>
+    <w:bookmarkStart w:id="31" w:name="جدول-verification-status"/>
+    <w:p>
+      <w:pPr>
+        <w:pStyle w:val="Heading1"/>
+      </w:pPr>
+      <w:r>
+        <w:rPr>
+          <w:rStyle w:val="SectionNumber"/>
+        </w:rPr>
+        <w:t xml:space="preserve">23</w:t>
+      </w:r>
+      <w:r>
+        <w:tab/>
+      </w:r>
+      <w:r>
+        <w:t xml:space="preserve">جدول Verification Status</w:t>
+      </w:r>
+    </w:p>
+    <w:tbl>
+      <w:tblPr>
+        <w:tblStyle w:val="Table"/>
+        <w:tblW w:type="auto" w:w="0"/>
+        <w:tblLook w:firstRow="1" w:lastRow="0" w:firstColumn="0" w:lastColumn="0" w:noHBand="0" w:noVBand="0" w:val="0020"/>
+      </w:tblPr>
+      <w:tblGrid>
+        <w:gridCol w:w="3960"/>
+        <w:gridCol w:w="3960"/>
+      </w:tblGrid>
+      <w:tr>
+        <w:trPr>
+          <w:tblHeader w:val="on"/>
+        </w:trPr>
+        <w:tc>
+          <w:tcPr/>
+          <w:p>
+            <w:pPr>
+              <w:pStyle w:val="Compact"/>
+            </w:pPr>
+            <w:r>
+              <w:t xml:space="preserve">العنصر</w:t>
+            </w:r>
+          </w:p>
+        </w:tc>
+        <w:tc>
+          <w:tcPr/>
+          <w:p>
+            <w:pPr>
+              <w:pStyle w:val="Compact"/>
+            </w:pPr>
+            <w:r>
+              <w:t xml:space="preserve">الحالة</w:t>
+            </w:r>
+          </w:p>
+        </w:tc>
+      </w:tr>
+      <w:tr>
+        <w:tc>
+          <w:tcPr/>
+          <w:p>
+            <w:pPr>
+              <w:pStyle w:val="Compact"/>
+            </w:pPr>
+            <w:r>
+              <w:t xml:space="preserve">Docker Compose</w:t>
+            </w:r>
+          </w:p>
+        </w:tc>
+        <w:tc>
+          <w:tcPr/>
+          <w:p>
+            <w:pPr>
+              <w:pStyle w:val="Compact"/>
+            </w:pPr>
+            <w:r>
+              <w:t xml:space="preserve">RUNTIME VERIFIED</w:t>
+            </w:r>
+          </w:p>
+        </w:tc>
+      </w:tr>
+      <w:tr>
+        <w:tc>
+          <w:tcPr/>
+          <w:p>
+            <w:pPr>
+              <w:pStyle w:val="Compact"/>
+            </w:pPr>
+            <w:r>
+              <w:t xml:space="preserve">API</w:t>
+            </w:r>
+          </w:p>
+        </w:tc>
+        <w:tc>
+          <w:tcPr/>
+          <w:p>
+            <w:pPr>
+              <w:pStyle w:val="Compact"/>
+            </w:pPr>
+            <w:r>
+              <w:t xml:space="preserve">RUNTIME VERIFIED</w:t>
+            </w:r>
+          </w:p>
+        </w:tc>
+      </w:tr>
+      <w:tr>
+        <w:tc>
+          <w:tcPr/>
+          <w:p>
+            <w:pPr>
+              <w:pStyle w:val="Compact"/>
+            </w:pPr>
+            <w:r>
+              <w:t xml:space="preserve">PostgreSQL</w:t>
+            </w:r>
+          </w:p>
+        </w:tc>
+        <w:tc>
+          <w:tcPr/>
+          <w:p>
+            <w:pPr>
+              <w:pStyle w:val="Compact"/>
+            </w:pPr>
+            <w:r>
+              <w:t xml:space="preserve">RUNTIME VERIFIED</w:t>
+            </w:r>
+          </w:p>
+        </w:tc>
+      </w:tr>
+      <w:tr>
+        <w:tc>
+          <w:tcPr/>
+          <w:p>
+            <w:pPr>
+              <w:pStyle w:val="Compact"/>
+            </w:pPr>
+            <w:r>
+              <w:t xml:space="preserve">Nginx</w:t>
+            </w:r>
+          </w:p>
+        </w:tc>
+        <w:tc>
+          <w:tcPr/>
+          <w:p>
+            <w:pPr>
+              <w:pStyle w:val="Compact"/>
+            </w:pPr>
+            <w:r>
+              <w:t xml:space="preserve">RUNTIME VERIFIED</w:t>
+            </w:r>
+          </w:p>
+        </w:tc>
+      </w:tr>
+      <w:tr>
+        <w:tc>
+          <w:tcPr/>
+          <w:p>
+            <w:pPr>
+              <w:pStyle w:val="Compact"/>
+            </w:pPr>
+            <w:r>
+              <w:t xml:space="preserve">Network Isolation</w:t>
+            </w:r>
+          </w:p>
+        </w:tc>
+        <w:tc>
+          <w:tcPr/>
+          <w:p>
+            <w:pPr>
+              <w:pStyle w:val="Compact"/>
+            </w:pPr>
+            <w:r>
+              <w:t xml:space="preserve">RUNTIME VERIFIED</w:t>
+            </w:r>
+          </w:p>
+        </w:tc>
+      </w:tr>
+      <w:tr>
+        <w:tc>
+          <w:tcPr/>
+          <w:p>
+            <w:pPr>
+              <w:pStyle w:val="Compact"/>
+            </w:pPr>
+            <w:r>
+              <w:t xml:space="preserve">Persistence</w:t>
+            </w:r>
+          </w:p>
+        </w:tc>
+        <w:tc>
+          <w:tcPr/>
+          <w:p>
+            <w:pPr>
+              <w:pStyle w:val="Compact"/>
+            </w:pPr>
+            <w:r>
+              <w:t xml:space="preserve">RUNTIME VERIFIED</w:t>
+            </w:r>
+          </w:p>
+        </w:tc>
+      </w:tr>
+      <w:tr>
+        <w:tc>
+          <w:tcPr/>
+          <w:p>
+            <w:pPr>
+              <w:pStyle w:val="Compact"/>
+            </w:pPr>
+            <w:r>
+              <w:t xml:space="preserve">CRUD</w:t>
+            </w:r>
+          </w:p>
+        </w:tc>
+        <w:tc>
+          <w:tcPr/>
+          <w:p>
+            <w:pPr>
+              <w:pStyle w:val="Compact"/>
+            </w:pPr>
+            <w:r>
+              <w:t xml:space="preserve">RUNTIME VERIFIED</w:t>
+            </w:r>
+          </w:p>
+        </w:tc>
+      </w:tr>
+      <w:tr>
+        <w:tc>
+          <w:tcPr/>
+          <w:p>
+            <w:pPr>
+              <w:pStyle w:val="Compact"/>
+            </w:pPr>
+            <w:r>
+              <w:t xml:space="preserve">Docker Hub</w:t>
+            </w:r>
+          </w:p>
+        </w:tc>
+        <w:tc>
+          <w:tcPr/>
+          <w:p>
+            <w:pPr>
+              <w:pStyle w:val="Compact"/>
+            </w:pPr>
+            <w:r>
+              <w:t xml:space="preserve">RUNTIME VERIFIED</w:t>
+            </w:r>
+          </w:p>
+        </w:tc>
+      </w:tr>
+      <w:tr>
+        <w:tc>
+          <w:tcPr/>
+          <w:p>
+            <w:pPr>
+              <w:pStyle w:val="Compact"/>
+            </w:pPr>
+            <w:r>
+              <w:t xml:space="preserve">Failure Modes</w:t>
+            </w:r>
+          </w:p>
+        </w:tc>
+        <w:tc>
+          <w:tcPr/>
+          <w:p>
+            <w:pPr>
+              <w:pStyle w:val="Compact"/>
+            </w:pPr>
+            <w:r>
+              <w:t xml:space="preserve">RUNTIME VERIFIED</w:t>
+            </w:r>
+          </w:p>
+        </w:tc>
+      </w:tr>
+      <w:tr>
+        <w:tc>
+          <w:tcPr/>
+          <w:p>
+            <w:pPr>
+              <w:pStyle w:val="Compact"/>
+            </w:pPr>
+            <w:r>
+              <w:t xml:space="preserve">Automated GET Test</w:t>
+            </w:r>
+          </w:p>
+        </w:tc>
+        <w:tc>
+          <w:tcPr/>
+          <w:p>
+            <w:pPr>
+              <w:pStyle w:val="Compact"/>
+            </w:pPr>
+            <w:r>
+              <w:t xml:space="preserve">RUNTIME VERIFIED</w:t>
+            </w:r>
+          </w:p>
+        </w:tc>
+      </w:tr>
+      <w:tr>
+        <w:tc>
+          <w:tcPr/>
+          <w:p>
+            <w:pPr>
+              <w:pStyle w:val="Compact"/>
+            </w:pPr>
+            <w:r>
+              <w:t xml:space="preserve">Full Automated CRUD Suite</w:t>
+            </w:r>
+          </w:p>
+        </w:tc>
+        <w:tc>
+          <w:tcPr/>
+          <w:p>
+            <w:pPr>
+              <w:pStyle w:val="Compact"/>
+            </w:pPr>
+            <w:r>
+              <w:t xml:space="preserve">NOT IMPLEMENTED / NOT CLAIMED</w:t>
+            </w:r>
+          </w:p>
+        </w:tc>
+      </w:tr>
+    </w:tbl>
+    <w:bookmarkEnd w:id="31"/>
     <w:sectPr>
       <w:footnotePr>
         <w:numRestart w:val="eachSect"/>
@@ -1413,123 +2661,123 @@
       </w:pPr>
     </w:lvl>
   </w:abstractNum>
-  <w:abstractNum w:abstractNumId="991">
-    <w:nsid w:val="0000A991"/>
+  <w:abstractNum w:abstractNumId="99411">
+    <w:nsid w:val="00A99411"/>
     <w:multiLevelType w:val="multilevel"/>
     <w:lvl w:ilvl="0">
-      <w:numFmt w:val="bullet"/>
-      <w:lvlText w:val=""/>
+      <w:start w:val="1"/>
+      <w:numFmt w:val="decimal"/>
+      <w:lvlText w:val="%1."/>
       <w:lvlJc w:val="left"/>
       <w:pPr>
         <w:ind w:left="720" w:hanging="360"/>
       </w:pPr>
-      <w:rPr>
-        <w:rFonts w:ascii="Symbol" w:hAnsi="Symbol" w:cs="Symbol" w:hint="default"/>
-      </w:rPr>
     </w:lvl>
     <w:lvl w:ilvl="1">
-      <w:numFmt w:val="bullet"/>
-      <w:lvlText w:val="o"/>
+      <w:start w:val="1"/>
+      <w:numFmt w:val="decimal"/>
+      <w:lvlText w:val="%2."/>
       <w:lvlJc w:val="left"/>
       <w:pPr>
         <w:ind w:left="1440" w:hanging="360"/>
       </w:pPr>
-      <w:rPr>
-        <w:rFonts w:ascii="Courier New" w:hAnsi="Courier New" w:cs="Courier New" w:hint="default"/>
-      </w:rPr>
     </w:lvl>
     <w:lvl w:ilvl="2">
-      <w:numFmt w:val="bullet"/>
-      <w:lvlText w:val=""/>
+      <w:start w:val="1"/>
+      <w:numFmt w:val="decimal"/>
+      <w:lvlText w:val="%3."/>
       <w:lvlJc w:val="left"/>
       <w:pPr>
         <w:ind w:left="2160" w:hanging="360"/>
       </w:pPr>
-      <w:rPr>
-        <w:rFonts w:ascii="Wingdings" w:hAnsi="Wingdings" w:cs="Wingdings" w:hint="default"/>
-      </w:rPr>
     </w:lvl>
     <w:lvl w:ilvl="3">
-      <w:numFmt w:val="bullet"/>
-      <w:lvlText w:val=""/>
+      <w:start w:val="1"/>
+      <w:numFmt w:val="decimal"/>
+      <w:lvlText w:val="%4."/>
       <w:lvlJc w:val="left"/>
       <w:pPr>
         <w:ind w:left="2880" w:hanging="360"/>
       </w:pPr>
-      <w:rPr>
-        <w:rFonts w:ascii="Symbol" w:hAnsi="Symbol" w:cs="Symbol" w:hint="default"/>
-      </w:rPr>
     </w:lvl>
     <w:lvl w:ilvl="4">
-      <w:numFmt w:val="bullet"/>
-      <w:lvlText w:val="o"/>
+      <w:start w:val="1"/>
+      <w:numFmt w:val="decimal"/>
+      <w:lvlText w:val="%5."/>
       <w:lvlJc w:val="left"/>
       <w:pPr>
         <w:ind w:left="3600" w:hanging="360"/>
       </w:pPr>
-      <w:rPr>
-        <w:rFonts w:ascii="Courier New" w:hAnsi="Courier New" w:cs="Courier New" w:hint="default"/>
-      </w:rPr>
     </w:lvl>
     <w:lvl w:ilvl="5">
-      <w:numFmt w:val="bullet"/>
-      <w:lvlText w:val=""/>
+      <w:start w:val="1"/>
+      <w:numFmt w:val="decimal"/>
+      <w:lvlText w:val="%6."/>
       <w:lvlJc w:val="left"/>
       <w:pPr>
         <w:ind w:left="4320" w:hanging="360"/>
       </w:pPr>
-      <w:rPr>
-        <w:rFonts w:ascii="Wingdings" w:hAnsi="Wingdings" w:cs="Wingdings" w:hint="default"/>
-      </w:rPr>
     </w:lvl>
     <w:lvl w:ilvl="6">
-      <w:numFmt w:val="bullet"/>
-      <w:lvlText w:val=""/>
+      <w:start w:val="1"/>
+      <w:numFmt w:val="decimal"/>
+      <w:lvlText w:val="%7."/>
       <w:lvlJc w:val="left"/>
       <w:pPr>
         <w:ind w:left="5040" w:hanging="360"/>
       </w:pPr>
-      <w:rPr>
-        <w:rFonts w:ascii="Symbol" w:hAnsi="Symbol" w:cs="Symbol" w:hint="default"/>
-      </w:rPr>
     </w:lvl>
     <w:lvl w:ilvl="7">
-      <w:numFmt w:val="bullet"/>
-      <w:lvlText w:val="o"/>
+      <w:start w:val="1"/>
+      <w:numFmt w:val="decimal"/>
+      <w:lvlText w:val="%8."/>
       <w:lvlJc w:val="left"/>
       <w:pPr>
         <w:ind w:left="5760" w:hanging="360"/>
       </w:pPr>
-      <w:rPr>
-        <w:rFonts w:ascii="Courier New" w:hAnsi="Courier New" w:cs="Courier New" w:hint="default"/>
-      </w:rPr>
     </w:lvl>
     <w:lvl w:ilvl="8">
-      <w:numFmt w:val="bullet"/>
-      <w:lvlText w:val=""/>
+      <w:start w:val="1"/>
+      <w:numFmt w:val="decimal"/>
+      <w:lvlText w:val="%9."/>
       <w:lvlJc w:val="left"/>
       <w:pPr>
         <w:ind w:left="6480" w:hanging="360"/>
       </w:pPr>
-      <w:rPr>
-        <w:rFonts w:ascii="Wingdings" w:hAnsi="Wingdings" w:cs="Wingdings" w:hint="default"/>
-      </w:rPr>
     </w:lvl>
   </w:abstractNum>
   <w:num w:numId="1000">
     <w:abstractNumId w:val="990"/>
   </w:num>
   <w:num w:numId="1001">
-    <w:abstractNumId w:val="991"/>
-  </w:num>
-  <w:num w:numId="1002">
-    <w:abstractNumId w:val="991"/>
-  </w:num>
-  <w:num w:numId="1003">
-    <w:abstractNumId w:val="991"/>
-  </w:num>
-  <w:num w:numId="1004">
-    <w:abstractNumId w:val="991"/>
+    <w:abstractNumId w:val="99411"/>
+    <w:lvlOverride w:ilvl="0">
+      <w:startOverride w:val="1"/>
+    </w:lvlOverride>
+    <w:lvlOverride w:ilvl="1">
+      <w:startOverride w:val="1"/>
+    </w:lvlOverride>
+    <w:lvlOverride w:ilvl="2">
+      <w:startOverride w:val="1"/>
+    </w:lvlOverride>
+    <w:lvlOverride w:ilvl="3">
+      <w:startOverride w:val="1"/>
+    </w:lvlOverride>
+    <w:lvlOverride w:ilvl="4">
+      <w:startOverride w:val="1"/>
+    </w:lvlOverride>
+    <w:lvlOverride w:ilvl="5">
+      <w:startOverride w:val="1"/>
+    </w:lvlOverride>
+    <w:lvlOverride w:ilvl="6">
+      <w:startOverride w:val="1"/>
+    </w:lvlOverride>
+    <w:lvlOverride w:ilvl="7">
+      <w:startOverride w:val="1"/>
+    </w:lvlOverride>
+    <w:lvlOverride w:ilvl="8">
+      <w:startOverride w:val="1"/>
+    </w:lvlOverride>
   </w:num>
 </w:numbering>
 </file>

</xml_diff>

<commit_message>
docs: polish Arabic final technical report
</commit_message>
<xml_diff>
--- a/docs/Technical-Report.docx
+++ b/docs/Technical-Report.docx
@@ -7,6 +7,9 @@
         <w:pStyle w:val="Title"/>
       </w:pPr>
       <w:r>
+        <w:rPr>
+          <w:rtl/>
+        </w:rPr>
         <w:t xml:space="preserve">التقرير الفني النهائي لمشروع الحوسبة السحابية والحاويات</w:t>
       </w:r>
     </w:p>
@@ -15,6 +18,9 @@
         <w:pStyle w:val="Subtitle"/>
       </w:pPr>
       <w:r>
+        <w:rPr>
+          <w:rtl/>
+        </w:rPr>
         <w:t xml:space="preserve">نظام إدارة المهام باستخدام Docker وREST API</w:t>
       </w:r>
     </w:p>
@@ -23,6 +29,9 @@
         <w:pStyle w:val="Author"/>
       </w:pPr>
       <w:r>
+        <w:rPr>
+          <w:rtl/>
+        </w:rPr>
         <w:t xml:space="preserve">اسم المقرر: حوسبة سحابية</w:t>
       </w:r>
     </w:p>
@@ -31,6 +40,9 @@
         <w:pStyle w:val="Author"/>
       </w:pPr>
       <w:r>
+        <w:rPr>
+          <w:rtl/>
+        </w:rPr>
         <w:t xml:space="preserve">اسم المشروع: Task Management API</w:t>
       </w:r>
     </w:p>
@@ -38,7 +50,15 @@
       <w:pPr>
         <w:pStyle w:val="Author"/>
       </w:pPr>
-      <w:r>
+    </w:p>
+    <w:p>
+      <w:pPr>
+        <w:pStyle w:val="Author"/>
+      </w:pPr>
+      <w:r>
+        <w:rPr>
+          <w:rtl/>
+        </w:rPr>
         <w:t xml:space="preserve">أعضاء الفريق:</w:t>
       </w:r>
     </w:p>
@@ -47,6 +67,9 @@
         <w:pStyle w:val="Author"/>
       </w:pPr>
       <w:r>
+        <w:rPr>
+          <w:rtl/>
+        </w:rPr>
         <w:t xml:space="preserve">1. [اسم عضو الفريق الأول]</w:t>
       </w:r>
     </w:p>
@@ -55,6 +78,9 @@
         <w:pStyle w:val="Author"/>
       </w:pPr>
       <w:r>
+        <w:rPr>
+          <w:rtl/>
+        </w:rPr>
         <w:t xml:space="preserve">2. [اسم عضو الفريق الثاني]</w:t>
       </w:r>
     </w:p>
@@ -63,6 +89,9 @@
         <w:pStyle w:val="Author"/>
       </w:pPr>
       <w:r>
+        <w:rPr>
+          <w:rtl/>
+        </w:rPr>
         <w:t xml:space="preserve">3. [اسم عضو الفريق الثالث]</w:t>
       </w:r>
     </w:p>
@@ -71,6 +100,9 @@
         <w:pStyle w:val="Author"/>
       </w:pPr>
       <w:r>
+        <w:rPr>
+          <w:rtl/>
+        </w:rPr>
         <w:t xml:space="preserve">4. [اسم عضو الفريق الرابع]</w:t>
       </w:r>
     </w:p>
@@ -78,7 +110,15 @@
       <w:pPr>
         <w:pStyle w:val="Author"/>
       </w:pPr>
-      <w:r>
+    </w:p>
+    <w:p>
+      <w:pPr>
+        <w:pStyle w:val="Author"/>
+      </w:pPr>
+      <w:r>
+        <w:rPr>
+          <w:rtl/>
+        </w:rPr>
         <w:t xml:space="preserve">الدكتور: [اسم الدكتور]</w:t>
       </w:r>
     </w:p>
@@ -87,6 +127,9 @@
         <w:pStyle w:val="Author"/>
       </w:pPr>
       <w:r>
+        <w:rPr>
+          <w:rtl/>
+        </w:rPr>
         <w:t xml:space="preserve">الجامعة: [اسم الجامعة]</w:t>
       </w:r>
     </w:p>
@@ -95,7 +138,10 @@
         <w:pStyle w:val="Date"/>
       </w:pPr>
       <w:r>
-        <w:t xml:space="preserve">2026</w:t>
+        <w:rPr>
+          <w:rtl/>
+        </w:rPr>
+        <w:t xml:space="preserve">العام الدراسي: 2026</w:t>
       </w:r>
     </w:p>
     <w:sdt>
@@ -109,9 +155,13 @@
         <w:p>
           <w:pPr>
             <w:pStyle w:val="TOCHeading"/>
+            <w:bidi/>
           </w:pPr>
           <w:r>
-            <w:t xml:space="preserve">Table of Contents</w:t>
+            <w:rPr>
+              <w:rtl/>
+            </w:rPr>
+            <w:t xml:space="preserve">جدول المحتويات</w:t>
           </w:r>
         </w:p>
         <w:p>
@@ -128,10 +178,12 @@
     <w:p>
       <w:pPr>
         <w:pStyle w:val="Heading1"/>
+        <w:bidi/>
       </w:pPr>
       <w:r>
         <w:rPr>
           <w:rStyle w:val="SectionNumber"/>
+          <w:rtl/>
         </w:rPr>
         <w:t xml:space="preserve">1</w:t>
       </w:r>
@@ -139,26 +191,42 @@
         <w:tab/>
       </w:r>
       <w:r>
-        <w:t xml:space="preserve">1. الملخص التنفيذي (Executive Summary)</w:t>
-      </w:r>
-    </w:p>
-    <w:p>
-      <w:pPr>
-        <w:pStyle w:val="FirstParagraph"/>
-      </w:pPr>
-      <w:r>
+        <w:rPr>
+          <w:rtl/>
+        </w:rPr>
+        <w:t xml:space="preserve">الملخص التنفيذي (Executive Summary)</w:t>
+      </w:r>
+    </w:p>
+    <w:p>
+      <w:pPr>
+        <w:bidi/>
+      </w:pPr>
+      <w:r>
+        <w:rPr>
+          <w:rtl/>
+        </w:rPr>
         <w:t xml:space="preserve">يقدم هذا التقرير تفصيلاً فنياً لتصميم وبناء نظام إدارة المهام (Task Management API). يهدف المشروع إلى حل مشكلة عدم توافق بيئات التشغيل (Environment Inconsistency) وتعقيد النشر (Deployment Complexity) من خلال استخدام تقنية الحاويات (Containerization) ممثلة في Docker.</w:t>
       </w:r>
-      <w:r>
-        <w:t xml:space="preserve"> </w:t>
-      </w:r>
-      <w:r>
+    </w:p>
+    <w:p>
+      <w:pPr>
+        <w:bidi/>
+      </w:pPr>
+      <w:r>
+        <w:rPr>
+          <w:rtl/>
+        </w:rPr>
         <w:t xml:space="preserve">يتكون النظام من واجهة برمجة تطبيقات (REST API) مبرمجة باستخدام Node.js وإطار العمل Express، والتي تتواصل مع قاعدة بيانات علائقية (Relational Database) ممثلة في PostgreSQL. ولضمان الأمان وتوجيه الطلبات بشكل مركزي، تم استخدام وكيل عكسي (Reverse Proxy) بواسطة Nginx.</w:t>
       </w:r>
-      <w:r>
-        <w:t xml:space="preserve"> </w:t>
-      </w:r>
-      <w:r>
+    </w:p>
+    <w:p>
+      <w:pPr>
+        <w:bidi/>
+      </w:pPr>
+      <w:r>
+        <w:rPr>
+          <w:rtl/>
+        </w:rPr>
         <w:t xml:space="preserve">استُخدم Docker Compose لربط هذه المكونات معاً لتشغيلها كبيئة واحدة معزولة، وتمت محاكاة سيناريوهات الفشل (Failure Modes) وإثبات استمرارية البيانات (Persistence). وأخيراً، تم رفع صورة النظام (Docker Image) إلى السجل العام (Docker Hub) لضمان سهولة التوزيع.</w:t>
       </w:r>
     </w:p>
@@ -167,10 +235,12 @@
     <w:p>
       <w:pPr>
         <w:pStyle w:val="Heading1"/>
+        <w:bidi/>
       </w:pPr>
       <w:r>
         <w:rPr>
           <w:rStyle w:val="SectionNumber"/>
+          <w:rtl/>
         </w:rPr>
         <w:t xml:space="preserve">2</w:t>
       </w:r>
@@ -178,186 +248,165 @@
         <w:tab/>
       </w:r>
       <w:r>
-        <w:t xml:space="preserve">2. أهداف المشروع</w:t>
-      </w:r>
-    </w:p>
-    <w:p>
-      <w:pPr>
-        <w:pStyle w:val="FirstParagraph"/>
-      </w:pPr>
-      <w:r>
+        <w:rPr>
+          <w:rtl/>
+        </w:rPr>
+        <w:t xml:space="preserve">أهداف المشروع</w:t>
+      </w:r>
+    </w:p>
+    <w:p>
+      <w:pPr>
+        <w:bidi/>
+      </w:pPr>
+      <w:r>
+        <w:rPr>
+          <w:rtl/>
+        </w:rPr>
         <w:t xml:space="preserve">يهدف هذا المشروع إلى تحقيق عدة مخرجات تعليمية وهندسية أساسية، تشمل:</w:t>
       </w:r>
-      <w:r>
-        <w:t xml:space="preserve"> </w:t>
-      </w:r>
-      <w:r>
-        <w:t xml:space="preserve">-</w:t>
-      </w:r>
-      <w:r>
-        <w:t xml:space="preserve"> </w:t>
-      </w:r>
-      <w:r>
-        <w:rPr>
-          <w:b/>
-          <w:bCs/>
-        </w:rPr>
-        <w:t xml:space="preserve">بناء REST API</w:t>
-      </w:r>
-      <w:r>
-        <w:t xml:space="preserve">: تطبيق عمليات الإنشاء والقراءة والتحديث والحذف (CRUD).</w:t>
-      </w:r>
-      <w:r>
-        <w:t xml:space="preserve"> </w:t>
-      </w:r>
-      <w:r>
-        <w:t xml:space="preserve">-</w:t>
-      </w:r>
-      <w:r>
-        <w:t xml:space="preserve"> </w:t>
-      </w:r>
-      <w:r>
-        <w:rPr>
-          <w:b/>
-          <w:bCs/>
-        </w:rPr>
-        <w:t xml:space="preserve">التشغيل المعزول (Containerization)</w:t>
-      </w:r>
-      <w:r>
-        <w:t xml:space="preserve">: عزل كل تقنية في حاوية مستقلة.</w:t>
-      </w:r>
-      <w:r>
-        <w:t xml:space="preserve"> </w:t>
-      </w:r>
-      <w:r>
-        <w:t xml:space="preserve">-</w:t>
-      </w:r>
-      <w:r>
-        <w:t xml:space="preserve"> </w:t>
-      </w:r>
-      <w:r>
-        <w:rPr>
-          <w:b/>
-          <w:bCs/>
-        </w:rPr>
-        <w:t xml:space="preserve">إدارة الحاويات المتعددة</w:t>
-      </w:r>
-      <w:r>
-        <w:t xml:space="preserve">: استخدام Docker Compose لتوحيد التشغيل.</w:t>
-      </w:r>
-      <w:r>
-        <w:t xml:space="preserve"> </w:t>
-      </w:r>
-      <w:r>
-        <w:t xml:space="preserve">-</w:t>
-      </w:r>
-      <w:r>
-        <w:t xml:space="preserve"> </w:t>
-      </w:r>
-      <w:r>
-        <w:rPr>
-          <w:b/>
-          <w:bCs/>
-        </w:rPr>
-        <w:t xml:space="preserve">توجيه الشبكة (Reverse Proxy)</w:t>
-      </w:r>
-      <w:r>
-        <w:t xml:space="preserve">: استخدام Nginx لإخفاء المعمارية الداخلية.</w:t>
-      </w:r>
-      <w:r>
-        <w:t xml:space="preserve"> </w:t>
-      </w:r>
-      <w:r>
-        <w:t xml:space="preserve">-</w:t>
-      </w:r>
-      <w:r>
-        <w:t xml:space="preserve"> </w:t>
-      </w:r>
-      <w:r>
-        <w:rPr>
-          <w:b/>
-          <w:bCs/>
-        </w:rPr>
-        <w:t xml:space="preserve">العزل الشبكي (Network Isolation)</w:t>
-      </w:r>
-      <w:r>
-        <w:t xml:space="preserve">: حماية الخدمات الخلفية من الوصول المباشر.</w:t>
-      </w:r>
-      <w:r>
-        <w:t xml:space="preserve"> </w:t>
-      </w:r>
-      <w:r>
-        <w:t xml:space="preserve">-</w:t>
-      </w:r>
-      <w:r>
-        <w:t xml:space="preserve"> </w:t>
-      </w:r>
-      <w:r>
-        <w:rPr>
-          <w:b/>
-          <w:bCs/>
-        </w:rPr>
-        <w:t xml:space="preserve">الاستمرارية (Persistent Storage)</w:t>
-      </w:r>
-      <w:r>
-        <w:t xml:space="preserve">: تخزين البيانات بأمان لحمايتها من زوال الحاويات.</w:t>
-      </w:r>
-      <w:r>
-        <w:t xml:space="preserve"> </w:t>
-      </w:r>
-      <w:r>
-        <w:t xml:space="preserve">-</w:t>
-      </w:r>
-      <w:r>
-        <w:t xml:space="preserve"> </w:t>
-      </w:r>
-      <w:r>
-        <w:rPr>
-          <w:b/>
-          <w:bCs/>
-        </w:rPr>
-        <w:t xml:space="preserve">اختبار الفشل (Failure Mode Testing)</w:t>
-      </w:r>
-      <w:r>
-        <w:t xml:space="preserve">: التحقق من قدرة النظام على التعامل مع التوقف المفاجئ.</w:t>
-      </w:r>
-      <w:r>
-        <w:t xml:space="preserve"> </w:t>
-      </w:r>
-      <w:r>
-        <w:t xml:space="preserve">-</w:t>
-      </w:r>
-      <w:r>
-        <w:t xml:space="preserve"> </w:t>
-      </w:r>
-      <w:r>
-        <w:rPr>
-          <w:b/>
-          <w:bCs/>
-        </w:rPr>
-        <w:t xml:space="preserve">إدارة الإصدارات (Versioning)</w:t>
-      </w:r>
-      <w:r>
-        <w:t xml:space="preserve">: رفع الصور إلى السجل (Docker Registry).</w:t>
-      </w:r>
-      <w:r>
-        <w:t xml:space="preserve"> </w:t>
-      </w:r>
-      <w:r>
-        <w:t xml:space="preserve">-</w:t>
-      </w:r>
-      <w:r>
-        <w:t xml:space="preserve"> </w:t>
-      </w:r>
-      <w:r>
-        <w:rPr>
-          <w:b/>
-          <w:bCs/>
-        </w:rPr>
-        <w:t xml:space="preserve">التشغيل المتطابق (Reproducible Deployment)</w:t>
-      </w:r>
-      <w:r>
-        <w:t xml:space="preserve">: القدرة على تشغيل المشروع بخطوة واحدة على أي جهاز.</w:t>
+    </w:p>
+    <w:p>
+      <w:pPr>
+        <w:pStyle w:val="Compact"/>
+        <w:numPr>
+          <w:ilvl w:val="0"/>
+          <w:numId w:val="1001"/>
+        </w:numPr>
+        <w:bidi/>
+      </w:pPr>
+      <w:r>
+        <w:rPr>
+          <w:rtl/>
+        </w:rPr>
+        <w:t xml:space="preserve">بناء REST API: تطبيق عمليات الإنشاء والقراءة والتحديث والحذف (CRUD).</w:t>
+      </w:r>
+    </w:p>
+    <w:p>
+      <w:pPr>
+        <w:pStyle w:val="Compact"/>
+        <w:numPr>
+          <w:ilvl w:val="0"/>
+          <w:numId w:val="1001"/>
+        </w:numPr>
+        <w:bidi/>
+      </w:pPr>
+      <w:r>
+        <w:rPr>
+          <w:rtl/>
+        </w:rPr>
+        <w:t xml:space="preserve">التشغيل المعزول (Containerization): عزل كل تقنية في حاوية (Container) مستقلة.</w:t>
+      </w:r>
+    </w:p>
+    <w:p>
+      <w:pPr>
+        <w:pStyle w:val="Compact"/>
+        <w:numPr>
+          <w:ilvl w:val="0"/>
+          <w:numId w:val="1001"/>
+        </w:numPr>
+        <w:bidi/>
+      </w:pPr>
+      <w:r>
+        <w:rPr>
+          <w:rtl/>
+        </w:rPr>
+        <w:t xml:space="preserve">استخدام Docker Compose: توحيد التشغيل للخدمات المتعددة.</w:t>
+      </w:r>
+    </w:p>
+    <w:p>
+      <w:pPr>
+        <w:pStyle w:val="Compact"/>
+        <w:numPr>
+          <w:ilvl w:val="0"/>
+          <w:numId w:val="1001"/>
+        </w:numPr>
+        <w:bidi/>
+      </w:pPr>
+      <w:r>
+        <w:rPr>
+          <w:rtl/>
+        </w:rPr>
+        <w:t xml:space="preserve">وكيل عكسي (Reverse Proxy): استخدام Nginx لحماية وتوجيه الطلبات.</w:t>
+      </w:r>
+    </w:p>
+    <w:p>
+      <w:pPr>
+        <w:pStyle w:val="Compact"/>
+        <w:numPr>
+          <w:ilvl w:val="0"/>
+          <w:numId w:val="1001"/>
+        </w:numPr>
+        <w:bidi/>
+      </w:pPr>
+      <w:r>
+        <w:rPr>
+          <w:rtl/>
+        </w:rPr>
+        <w:t xml:space="preserve">العزل الشبكي (Network Isolation): حماية الخدمات الخلفية من الوصول المباشر.</w:t>
+      </w:r>
+    </w:p>
+    <w:p>
+      <w:pPr>
+        <w:pStyle w:val="Compact"/>
+        <w:numPr>
+          <w:ilvl w:val="0"/>
+          <w:numId w:val="1001"/>
+        </w:numPr>
+        <w:bidi/>
+      </w:pPr>
+      <w:r>
+        <w:rPr>
+          <w:rtl/>
+        </w:rPr>
+        <w:t xml:space="preserve">تخزين مستمر (Persistent Storage): تخزين البيانات في وحدة تخزين مسماة (Named Volume).</w:t>
+      </w:r>
+    </w:p>
+    <w:p>
+      <w:pPr>
+        <w:pStyle w:val="Compact"/>
+        <w:numPr>
+          <w:ilvl w:val="0"/>
+          <w:numId w:val="1001"/>
+        </w:numPr>
+        <w:bidi/>
+      </w:pPr>
+      <w:r>
+        <w:rPr>
+          <w:rtl/>
+        </w:rPr>
+        <w:t xml:space="preserve">اختبار الفشل (Failure Mode Testing): التحقق من قدرة النظام على التعامل مع التوقف.</w:t>
+      </w:r>
+    </w:p>
+    <w:p>
+      <w:pPr>
+        <w:pStyle w:val="Compact"/>
+        <w:numPr>
+          <w:ilvl w:val="0"/>
+          <w:numId w:val="1001"/>
+        </w:numPr>
+        <w:bidi/>
+      </w:pPr>
+      <w:r>
+        <w:rPr>
+          <w:rtl/>
+        </w:rPr>
+        <w:t xml:space="preserve">إدارة الإصدارات (Versioning): رفع الصور إلى السجل (Docker Registry).</w:t>
+      </w:r>
+    </w:p>
+    <w:p>
+      <w:pPr>
+        <w:pStyle w:val="Compact"/>
+        <w:numPr>
+          <w:ilvl w:val="0"/>
+          <w:numId w:val="1001"/>
+        </w:numPr>
+        <w:bidi/>
+      </w:pPr>
+      <w:r>
+        <w:rPr>
+          <w:rtl/>
+        </w:rPr>
+        <w:t xml:space="preserve">التشغيل المتطابق (Reproducible Deployment): القدرة على تشغيل المشروع بسهولة.</w:t>
       </w:r>
     </w:p>
     <w:bookmarkEnd w:id="10"/>
@@ -365,10 +414,12 @@
     <w:p>
       <w:pPr>
         <w:pStyle w:val="Heading1"/>
+        <w:bidi/>
       </w:pPr>
       <w:r>
         <w:rPr>
           <w:rStyle w:val="SectionNumber"/>
+          <w:rtl/>
         </w:rPr>
         <w:t xml:space="preserve">3</w:t>
       </w:r>
@@ -376,27 +427,37 @@
         <w:tab/>
       </w:r>
       <w:r>
-        <w:t xml:space="preserve">3. نظرة عامة على النظام</w:t>
-      </w:r>
-    </w:p>
-    <w:p>
-      <w:pPr>
-        <w:pStyle w:val="FirstParagraph"/>
-      </w:pPr>
-      <w:r>
-        <w:t xml:space="preserve">يبدأ مسار الطلب (Request Flow) من العميل (Client) ويتدرج كالتالي:</w:t>
-      </w:r>
-      <w:r>
-        <w:t xml:space="preserve"> </w:t>
-      </w:r>
-      <w:r>
-        <w:rPr>
-          <w:b/>
-          <w:bCs/>
+        <w:rPr>
+          <w:rtl/>
+        </w:rPr>
+        <w:t xml:space="preserve">نظرة عامة على النظام</w:t>
+      </w:r>
+    </w:p>
+    <w:p>
+      <w:pPr>
+        <w:bidi/>
+      </w:pPr>
+      <w:r>
+        <w:rPr>
+          <w:rtl/>
+        </w:rPr>
+        <w:t xml:space="preserve">يبدأ مسار الطلب من العميل ويتدرج كالتالي:</w:t>
+      </w:r>
+    </w:p>
+    <w:p>
+      <w:pPr>
+        <w:bidi/>
+      </w:pPr>
+      <w:r>
+        <w:rPr>
+          <w:rtl/>
         </w:rPr>
         <w:t xml:space="preserve">Client</w:t>
       </w:r>
       <w:r>
+        <w:rPr>
+          <w:rtl/>
+        </w:rPr>
         <w:t xml:space="preserve"> </w:t>
       </w:r>
       <m:oMath>
@@ -408,16 +469,21 @@
         </m:r>
       </m:oMath>
       <w:r>
+        <w:rPr>
+          <w:rtl/>
+        </w:rPr>
         <w:t xml:space="preserve"> </w:t>
       </w:r>
       <w:r>
         <w:rPr>
-          <w:b/>
-          <w:bCs/>
+          <w:rtl/>
         </w:rPr>
         <w:t xml:space="preserve">Nginx</w:t>
       </w:r>
       <w:r>
+        <w:rPr>
+          <w:rtl/>
+        </w:rPr>
         <w:t xml:space="preserve"> </w:t>
       </w:r>
       <m:oMath>
@@ -429,16 +495,21 @@
         </m:r>
       </m:oMath>
       <w:r>
+        <w:rPr>
+          <w:rtl/>
+        </w:rPr>
         <w:t xml:space="preserve"> </w:t>
       </w:r>
       <w:r>
         <w:rPr>
-          <w:b/>
-          <w:bCs/>
+          <w:rtl/>
         </w:rPr>
         <w:t xml:space="preserve">Node.js / Express API</w:t>
       </w:r>
       <w:r>
+        <w:rPr>
+          <w:rtl/>
+        </w:rPr>
         <w:t xml:space="preserve"> </w:t>
       </w:r>
       <m:oMath>
@@ -450,12 +521,14 @@
         </m:r>
       </m:oMath>
       <w:r>
+        <w:rPr>
+          <w:rtl/>
+        </w:rPr>
         <w:t xml:space="preserve"> </w:t>
       </w:r>
       <w:r>
         <w:rPr>
-          <w:b/>
-          <w:bCs/>
+          <w:rtl/>
         </w:rPr>
         <w:t xml:space="preserve">PostgreSQL</w:t>
       </w:r>
@@ -465,18 +538,15 @@
         <w:pStyle w:val="Compact"/>
         <w:numPr>
           <w:ilvl w:val="0"/>
-          <w:numId w:val="1001"/>
+          <w:numId w:val="1002"/>
         </w:numPr>
-      </w:pPr>
-      <w:r>
-        <w:rPr>
-          <w:b/>
-          <w:bCs/>
-        </w:rPr>
-        <w:t xml:space="preserve">Nginx</w:t>
-      </w:r>
-      <w:r>
-        <w:t xml:space="preserve">: يستقبل الطلب من خارج النظام ويوجهه للداخل.</w:t>
+        <w:bidi/>
+      </w:pPr>
+      <w:r>
+        <w:rPr>
+          <w:rtl/>
+        </w:rPr>
+        <w:t xml:space="preserve">Nginx: يستقبل الطلب من خارج النظام ويوجهه للداخل.</w:t>
       </w:r>
     </w:p>
     <w:p>
@@ -484,18 +554,15 @@
         <w:pStyle w:val="Compact"/>
         <w:numPr>
           <w:ilvl w:val="0"/>
-          <w:numId w:val="1001"/>
+          <w:numId w:val="1002"/>
         </w:numPr>
-      </w:pPr>
-      <w:r>
-        <w:rPr>
-          <w:b/>
-          <w:bCs/>
-        </w:rPr>
-        <w:t xml:space="preserve">Node.js API</w:t>
-      </w:r>
-      <w:r>
-        <w:t xml:space="preserve">: يستقبل الطلب الموجه، يحلل البيانات، وينفذ منطق العمل (Business Logic).</w:t>
+        <w:bidi/>
+      </w:pPr>
+      <w:r>
+        <w:rPr>
+          <w:rtl/>
+        </w:rPr>
+        <w:t xml:space="preserve">Node.js API: يستقبل الطلب الموجه، يحلل البيانات، وينفذ منطق العمل.</w:t>
       </w:r>
     </w:p>
     <w:p>
@@ -503,18 +570,15 @@
         <w:pStyle w:val="Compact"/>
         <w:numPr>
           <w:ilvl w:val="0"/>
-          <w:numId w:val="1001"/>
+          <w:numId w:val="1002"/>
         </w:numPr>
-      </w:pPr>
-      <w:r>
-        <w:rPr>
-          <w:b/>
-          <w:bCs/>
-        </w:rPr>
-        <w:t xml:space="preserve">PostgreSQL</w:t>
-      </w:r>
-      <w:r>
-        <w:t xml:space="preserve">: ينفذ استعلام قاعدة البيانات لحفظ أو جلب المهام ويُرجع النتيجة ليتم تصديرها للعميل.</w:t>
+        <w:bidi/>
+      </w:pPr>
+      <w:r>
+        <w:rPr>
+          <w:rtl/>
+        </w:rPr>
+        <w:t xml:space="preserve">PostgreSQL: ينفذ استعلام قاعدة البيانات لحفظ أو جلب المهام.</w:t>
       </w:r>
     </w:p>
     <w:bookmarkEnd w:id="11"/>
@@ -522,10 +586,12 @@
     <w:p>
       <w:pPr>
         <w:pStyle w:val="Heading1"/>
+        <w:bidi/>
       </w:pPr>
       <w:r>
         <w:rPr>
           <w:rStyle w:val="SectionNumber"/>
+          <w:rtl/>
         </w:rPr>
         <w:t xml:space="preserve">4</w:t>
       </w:r>
@@ -533,72 +599,69 @@
         <w:tab/>
       </w:r>
       <w:r>
-        <w:t xml:space="preserve">4. معمارية النظام (System Architecture)</w:t>
-      </w:r>
-    </w:p>
-    <w:p>
-      <w:pPr>
-        <w:pStyle w:val="FirstParagraph"/>
-      </w:pPr>
-      <w:r>
+        <w:rPr>
+          <w:rtl/>
+        </w:rPr>
+        <w:t xml:space="preserve">معمارية النظام (System Architecture)</w:t>
+      </w:r>
+    </w:p>
+    <w:p>
+      <w:pPr>
+        <w:bidi/>
+      </w:pPr>
+      <w:r>
+        <w:rPr>
+          <w:rtl/>
+        </w:rPr>
         <w:t xml:space="preserve">يعتمد المشروع على معمارية ثلاثية الطبقات (3-Tier Architecture) معزولة كلياً:</w:t>
       </w:r>
-      <w:r>
-        <w:t xml:space="preserve"> </w:t>
-      </w:r>
-      <w:r>
-        <w:t xml:space="preserve">-</w:t>
-      </w:r>
-      <w:r>
-        <w:t xml:space="preserve"> </w:t>
-      </w:r>
-      <w:r>
-        <w:rPr>
-          <w:b/>
-          <w:bCs/>
-        </w:rPr>
-        <w:t xml:space="preserve">Nginx</w:t>
-      </w:r>
-      <w:r>
-        <w:t xml:space="preserve">: يعمل على المنفذ 80 داخل الحاوية. تم ربطه بمنفذ المضيف (Host) 8080:80 ليكون نقطة الدخول الوحيدة.</w:t>
-      </w:r>
-      <w:r>
-        <w:t xml:space="preserve"> </w:t>
-      </w:r>
-      <w:r>
-        <w:t xml:space="preserve">-</w:t>
-      </w:r>
-      <w:r>
-        <w:t xml:space="preserve"> </w:t>
-      </w:r>
-      <w:r>
-        <w:rPr>
-          <w:b/>
-          <w:bCs/>
-        </w:rPr>
-        <w:t xml:space="preserve">API</w:t>
-      </w:r>
-      <w:r>
-        <w:t xml:space="preserve">: يعمل على المنفذ 3000 داخل شبكة Docker، ولا يتم نشره (Publish) للمضيف. Nginx يتصل به عبر العنوان الداخلي ask-management-api:3000.</w:t>
-      </w:r>
-      <w:r>
-        <w:t xml:space="preserve"> </w:t>
-      </w:r>
-      <w:r>
-        <w:t xml:space="preserve">-</w:t>
-      </w:r>
-      <w:r>
-        <w:t xml:space="preserve"> </w:t>
-      </w:r>
-      <w:r>
-        <w:rPr>
-          <w:b/>
-          <w:bCs/>
-        </w:rPr>
-        <w:t xml:space="preserve">PostgreSQL</w:t>
-      </w:r>
-      <w:r>
-        <w:t xml:space="preserve">: يعمل على المنفذ 5432 داخل شبكة Docker، وهو معزول تماماً عن المضيف ولا يتصل به إلا الـ API عبر العنوان ask-management-db:5432.</w:t>
+    </w:p>
+    <w:p>
+      <w:pPr>
+        <w:pStyle w:val="Compact"/>
+        <w:numPr>
+          <w:ilvl w:val="0"/>
+          <w:numId w:val="1003"/>
+        </w:numPr>
+        <w:bidi/>
+      </w:pPr>
+      <w:r>
+        <w:rPr>
+          <w:rtl/>
+        </w:rPr>
+        <w:t xml:space="preserve">Nginx: يعمل على المنفذ 80 داخل الحاوية. تم ربطه بمنفذ المضيف (Host) 8080:80 ليكون نقطة الدخول الوحيدة للنظام.</w:t>
+      </w:r>
+    </w:p>
+    <w:p>
+      <w:pPr>
+        <w:pStyle w:val="Compact"/>
+        <w:numPr>
+          <w:ilvl w:val="0"/>
+          <w:numId w:val="1003"/>
+        </w:numPr>
+        <w:bidi/>
+      </w:pPr>
+      <w:r>
+        <w:rPr>
+          <w:rtl/>
+        </w:rPr>
+        <w:t xml:space="preserve">API: يعمل على المنفذ 3000 داخل شبكة Docker، ولا يتم نشره للمضيف. يتصل به Nginx عبر العنوان الداخلي ask-management-api:3000.</w:t>
+      </w:r>
+    </w:p>
+    <w:p>
+      <w:pPr>
+        <w:pStyle w:val="Compact"/>
+        <w:numPr>
+          <w:ilvl w:val="0"/>
+          <w:numId w:val="1003"/>
+        </w:numPr>
+        <w:bidi/>
+      </w:pPr>
+      <w:r>
+        <w:rPr>
+          <w:rtl/>
+        </w:rPr>
+        <w:t xml:space="preserve">PostgreSQL: يعمل على المنفذ 5432 داخل شبكة Docker، وهو معزول تماماً عن المضيف ويتصل به الـ API عبر العنوان ask-management-db:5432.</w:t>
       </w:r>
     </w:p>
     <w:bookmarkEnd w:id="12"/>
@@ -606,10 +669,12 @@
     <w:p>
       <w:pPr>
         <w:pStyle w:val="Heading1"/>
+        <w:bidi/>
       </w:pPr>
       <w:r>
         <w:rPr>
           <w:rStyle w:val="SectionNumber"/>
+          <w:rtl/>
         </w:rPr>
         <w:t xml:space="preserve">5</w:t>
       </w:r>
@@ -617,14 +682,20 @@
         <w:tab/>
       </w:r>
       <w:r>
-        <w:t xml:space="preserve">5. REST API وCRUD</w:t>
-      </w:r>
-    </w:p>
-    <w:p>
-      <w:pPr>
-        <w:pStyle w:val="FirstParagraph"/>
-      </w:pPr>
-      <w:r>
+        <w:rPr>
+          <w:rtl/>
+        </w:rPr>
+        <w:t xml:space="preserve">REST API وCRUD</w:t>
+      </w:r>
+    </w:p>
+    <w:p>
+      <w:pPr>
+        <w:bidi/>
+      </w:pPr>
+      <w:r>
+        <w:rPr>
+          <w:rtl/>
+        </w:rPr>
         <w:t xml:space="preserve">واجهة برمجة التطبيقات (REST API) هي حلقة الوصل التي تستقبل طلبات (HTTP Requests) العميل وترد عليها (HTTP Responses). تم تطبيق عمليات CRUD الأساسية كالتالي:</w:t>
       </w:r>
     </w:p>
@@ -648,8 +719,12 @@
           <w:p>
             <w:pPr>
               <w:pStyle w:val="Compact"/>
-            </w:pPr>
-            <w:r>
+              <w:bidi/>
+            </w:pPr>
+            <w:r>
+              <w:rPr>
+                <w:rtl/>
+              </w:rPr>
               <w:t xml:space="preserve">العملية</w:t>
             </w:r>
           </w:p>
@@ -659,8 +734,12 @@
           <w:p>
             <w:pPr>
               <w:pStyle w:val="Compact"/>
-            </w:pPr>
-            <w:r>
+              <w:bidi/>
+            </w:pPr>
+            <w:r>
+              <w:rPr>
+                <w:rtl/>
+              </w:rPr>
               <w:t xml:space="preserve">HTTP Method</w:t>
             </w:r>
           </w:p>
@@ -670,8 +749,12 @@
           <w:p>
             <w:pPr>
               <w:pStyle w:val="Compact"/>
-            </w:pPr>
-            <w:r>
+              <w:bidi/>
+            </w:pPr>
+            <w:r>
+              <w:rPr>
+                <w:rtl/>
+              </w:rPr>
               <w:t xml:space="preserve">Endpoint</w:t>
             </w:r>
           </w:p>
@@ -683,8 +766,12 @@
           <w:p>
             <w:pPr>
               <w:pStyle w:val="Compact"/>
-            </w:pPr>
-            <w:r>
+              <w:bidi/>
+            </w:pPr>
+            <w:r>
+              <w:rPr>
+                <w:rtl/>
+              </w:rPr>
               <w:t xml:space="preserve">إنشاء</w:t>
             </w:r>
           </w:p>
@@ -694,8 +781,12 @@
           <w:p>
             <w:pPr>
               <w:pStyle w:val="Compact"/>
-            </w:pPr>
-            <w:r>
+              <w:bidi/>
+            </w:pPr>
+            <w:r>
+              <w:rPr>
+                <w:rtl/>
+              </w:rPr>
               <w:t xml:space="preserve">POST</w:t>
             </w:r>
           </w:p>
@@ -705,8 +796,12 @@
           <w:p>
             <w:pPr>
               <w:pStyle w:val="Compact"/>
-            </w:pPr>
-            <w:r>
+              <w:bidi/>
+            </w:pPr>
+            <w:r>
+              <w:rPr>
+                <w:rtl/>
+              </w:rPr>
               <w:t xml:space="preserve">/api/tasks</w:t>
             </w:r>
           </w:p>
@@ -718,8 +813,12 @@
           <w:p>
             <w:pPr>
               <w:pStyle w:val="Compact"/>
-            </w:pPr>
-            <w:r>
+              <w:bidi/>
+            </w:pPr>
+            <w:r>
+              <w:rPr>
+                <w:rtl/>
+              </w:rPr>
               <w:t xml:space="preserve">قراءة</w:t>
             </w:r>
           </w:p>
@@ -729,8 +828,12 @@
           <w:p>
             <w:pPr>
               <w:pStyle w:val="Compact"/>
-            </w:pPr>
-            <w:r>
+              <w:bidi/>
+            </w:pPr>
+            <w:r>
+              <w:rPr>
+                <w:rtl/>
+              </w:rPr>
               <w:t xml:space="preserve">GET</w:t>
             </w:r>
           </w:p>
@@ -740,8 +843,12 @@
           <w:p>
             <w:pPr>
               <w:pStyle w:val="Compact"/>
-            </w:pPr>
-            <w:r>
+              <w:bidi/>
+            </w:pPr>
+            <w:r>
+              <w:rPr>
+                <w:rtl/>
+              </w:rPr>
               <w:t xml:space="preserve">/api/tasks</w:t>
             </w:r>
           </w:p>
@@ -753,8 +860,12 @@
           <w:p>
             <w:pPr>
               <w:pStyle w:val="Compact"/>
-            </w:pPr>
-            <w:r>
+              <w:bidi/>
+            </w:pPr>
+            <w:r>
+              <w:rPr>
+                <w:rtl/>
+              </w:rPr>
               <w:t xml:space="preserve">تعديل</w:t>
             </w:r>
           </w:p>
@@ -764,8 +875,12 @@
           <w:p>
             <w:pPr>
               <w:pStyle w:val="Compact"/>
-            </w:pPr>
-            <w:r>
+              <w:bidi/>
+            </w:pPr>
+            <w:r>
+              <w:rPr>
+                <w:rtl/>
+              </w:rPr>
               <w:t xml:space="preserve">PUT</w:t>
             </w:r>
           </w:p>
@@ -775,8 +890,12 @@
           <w:p>
             <w:pPr>
               <w:pStyle w:val="Compact"/>
-            </w:pPr>
-            <w:r>
+              <w:bidi/>
+            </w:pPr>
+            <w:r>
+              <w:rPr>
+                <w:rtl/>
+              </w:rPr>
               <w:t xml:space="preserve">/api/tasks/:id</w:t>
             </w:r>
           </w:p>
@@ -788,8 +907,12 @@
           <w:p>
             <w:pPr>
               <w:pStyle w:val="Compact"/>
-            </w:pPr>
-            <w:r>
+              <w:bidi/>
+            </w:pPr>
+            <w:r>
+              <w:rPr>
+                <w:rtl/>
+              </w:rPr>
               <w:t xml:space="preserve">حذف</w:t>
             </w:r>
           </w:p>
@@ -799,8 +922,12 @@
           <w:p>
             <w:pPr>
               <w:pStyle w:val="Compact"/>
-            </w:pPr>
-            <w:r>
+              <w:bidi/>
+            </w:pPr>
+            <w:r>
+              <w:rPr>
+                <w:rtl/>
+              </w:rPr>
               <w:t xml:space="preserve">DELETE</w:t>
             </w:r>
           </w:p>
@@ -810,8 +937,12 @@
           <w:p>
             <w:pPr>
               <w:pStyle w:val="Compact"/>
-            </w:pPr>
-            <w:r>
+              <w:bidi/>
+            </w:pPr>
+            <w:r>
+              <w:rPr>
+                <w:rtl/>
+              </w:rPr>
               <w:t xml:space="preserve">/api/tasks/:id</w:t>
             </w:r>
           </w:p>
@@ -823,10 +954,12 @@
     <w:p>
       <w:pPr>
         <w:pStyle w:val="Heading1"/>
+        <w:bidi/>
       </w:pPr>
       <w:r>
         <w:rPr>
           <w:rStyle w:val="SectionNumber"/>
+          <w:rtl/>
         </w:rPr>
         <w:t xml:space="preserve">6</w:t>
       </w:r>
@@ -834,15 +967,21 @@
         <w:tab/>
       </w:r>
       <w:r>
-        <w:t xml:space="preserve">6. قاعدة البيانات PostgreSQL</w:t>
-      </w:r>
-    </w:p>
-    <w:p>
-      <w:pPr>
-        <w:pStyle w:val="FirstParagraph"/>
-      </w:pPr>
-      <w:r>
-        <w:t xml:space="preserve">تم اختيار PostgreSQL لقوتها كقاعدة بيانات علائقية. يتكون النظام من قاعدة بيانات (Database) تحت اسم askdb تحتوي على جدول (Table) يسمى asks. كل مهمة تمثل صفاً (Row) يتكون من أعمدة (Columns) مثل id (كمفتاح أساسي Primary Key)، و itle، و status. يتم التواصل معها عبر أوامر SQL ويرتبط بها الـ API عبر اسم الخدمة الداخلي ask-management-db:5432.</w:t>
+        <w:rPr>
+          <w:rtl/>
+        </w:rPr>
+        <w:t xml:space="preserve">قاعدة البيانات PostgreSQL</w:t>
+      </w:r>
+    </w:p>
+    <w:p>
+      <w:pPr>
+        <w:bidi/>
+      </w:pPr>
+      <w:r>
+        <w:rPr>
+          <w:rtl/>
+        </w:rPr>
+        <w:t xml:space="preserve">تم اختيار PostgreSQL لقوتها كقاعدة بيانات علائقية. يتكون النظام من قاعدة بيانات (Database) تحت اسم askdb تحتوي على جدول (Table) يسمى asks. كل مهمة تمثل صفاً (Row) يتكون من أعمدة (Columns) مثل id (كمفتاح أساسي Primary Key)، و itle، و status. يتم التواصل معها عبر أوامر SQL ويرتبط بها الـ API عبر اسم خدمة Docker الداخلي: ask-management-db:5432.</w:t>
       </w:r>
     </w:p>
     <w:bookmarkEnd w:id="14"/>
@@ -850,10 +989,12 @@
     <w:p>
       <w:pPr>
         <w:pStyle w:val="Heading1"/>
+        <w:bidi/>
       </w:pPr>
       <w:r>
         <w:rPr>
           <w:rStyle w:val="SectionNumber"/>
+          <w:rtl/>
         </w:rPr>
         <w:t xml:space="preserve">7</w:t>
       </w:r>
@@ -861,14 +1002,20 @@
         <w:tab/>
       </w:r>
       <w:r>
-        <w:t xml:space="preserve">7. Virtualization vs Containerization</w:t>
-      </w:r>
-    </w:p>
-    <w:p>
-      <w:pPr>
-        <w:pStyle w:val="FirstParagraph"/>
-      </w:pPr>
-      <w:r>
+        <w:rPr>
+          <w:rtl/>
+        </w:rPr>
+        <w:t xml:space="preserve">Virtualization vs Containerization</w:t>
+      </w:r>
+    </w:p>
+    <w:p>
+      <w:pPr>
+        <w:bidi/>
+      </w:pPr>
+      <w:r>
+        <w:rPr>
+          <w:rtl/>
+        </w:rPr>
         <w:t xml:space="preserve">لإثبات كفاءة معماريتنا، نوضح الفرق بين الأجهزة الافتراضية والحاويات:</w:t>
       </w:r>
     </w:p>
@@ -893,8 +1040,12 @@
           <w:p>
             <w:pPr>
               <w:pStyle w:val="Compact"/>
-            </w:pPr>
-            <w:r>
+              <w:bidi/>
+            </w:pPr>
+            <w:r>
+              <w:rPr>
+                <w:rtl/>
+              </w:rPr>
               <w:t xml:space="preserve">الخاصية</w:t>
             </w:r>
           </w:p>
@@ -904,8 +1055,12 @@
           <w:p>
             <w:pPr>
               <w:pStyle w:val="Compact"/>
-            </w:pPr>
-            <w:r>
+              <w:bidi/>
+            </w:pPr>
+            <w:r>
+              <w:rPr>
+                <w:rtl/>
+              </w:rPr>
               <w:t xml:space="preserve">Virtual Machine</w:t>
             </w:r>
           </w:p>
@@ -915,8 +1070,12 @@
           <w:p>
             <w:pPr>
               <w:pStyle w:val="Compact"/>
-            </w:pPr>
-            <w:r>
+              <w:bidi/>
+            </w:pPr>
+            <w:r>
+              <w:rPr>
+                <w:rtl/>
+              </w:rPr>
               <w:t xml:space="preserve">Container</w:t>
             </w:r>
           </w:p>
@@ -928,8 +1087,12 @@
           <w:p>
             <w:pPr>
               <w:pStyle w:val="Compact"/>
-            </w:pPr>
-            <w:r>
+              <w:bidi/>
+            </w:pPr>
+            <w:r>
+              <w:rPr>
+                <w:rtl/>
+              </w:rPr>
               <w:t xml:space="preserve">Guest OS</w:t>
             </w:r>
           </w:p>
@@ -939,8 +1102,12 @@
           <w:p>
             <w:pPr>
               <w:pStyle w:val="Compact"/>
-            </w:pPr>
-            <w:r>
+              <w:bidi/>
+            </w:pPr>
+            <w:r>
+              <w:rPr>
+                <w:rtl/>
+              </w:rPr>
               <w:t xml:space="preserve">يتطلب نظام تشغيل كامل لكل آلة</w:t>
             </w:r>
           </w:p>
@@ -950,8 +1117,12 @@
           <w:p>
             <w:pPr>
               <w:pStyle w:val="Compact"/>
-            </w:pPr>
-            <w:r>
+              <w:bidi/>
+            </w:pPr>
+            <w:r>
+              <w:rPr>
+                <w:rtl/>
+              </w:rPr>
               <w:t xml:space="preserve">لا يوجد، تشارك نواة المضيف (Host Kernel)</w:t>
             </w:r>
           </w:p>
@@ -963,8 +1134,12 @@
           <w:p>
             <w:pPr>
               <w:pStyle w:val="Compact"/>
-            </w:pPr>
-            <w:r>
+              <w:bidi/>
+            </w:pPr>
+            <w:r>
+              <w:rPr>
+                <w:rtl/>
+              </w:rPr>
               <w:t xml:space="preserve">الموارد</w:t>
             </w:r>
           </w:p>
@@ -974,8 +1149,12 @@
           <w:p>
             <w:pPr>
               <w:pStyle w:val="Compact"/>
-            </w:pPr>
-            <w:r>
+              <w:bidi/>
+            </w:pPr>
+            <w:r>
+              <w:rPr>
+                <w:rtl/>
+              </w:rPr>
               <w:t xml:space="preserve">ثقيلة وتستهلك RAM/CPU مقتطعة</w:t>
             </w:r>
           </w:p>
@@ -985,8 +1164,12 @@
           <w:p>
             <w:pPr>
               <w:pStyle w:val="Compact"/>
-            </w:pPr>
-            <w:r>
+              <w:bidi/>
+            </w:pPr>
+            <w:r>
+              <w:rPr>
+                <w:rtl/>
+              </w:rPr>
               <w:t xml:space="preserve">خفيفة جداً تستهلك موارد حسب الحاجة</w:t>
             </w:r>
           </w:p>
@@ -998,8 +1181,12 @@
           <w:p>
             <w:pPr>
               <w:pStyle w:val="Compact"/>
-            </w:pPr>
-            <w:r>
+              <w:bidi/>
+            </w:pPr>
+            <w:r>
+              <w:rPr>
+                <w:rtl/>
+              </w:rPr>
               <w:t xml:space="preserve">Startup Time</w:t>
             </w:r>
           </w:p>
@@ -1009,8 +1196,12 @@
           <w:p>
             <w:pPr>
               <w:pStyle w:val="Compact"/>
-            </w:pPr>
-            <w:r>
+              <w:bidi/>
+            </w:pPr>
+            <w:r>
+              <w:rPr>
+                <w:rtl/>
+              </w:rPr>
               <w:t xml:space="preserve">دقائق</w:t>
             </w:r>
           </w:p>
@@ -1020,8 +1211,12 @@
           <w:p>
             <w:pPr>
               <w:pStyle w:val="Compact"/>
-            </w:pPr>
-            <w:r>
+              <w:bidi/>
+            </w:pPr>
+            <w:r>
+              <w:rPr>
+                <w:rtl/>
+              </w:rPr>
               <w:t xml:space="preserve">أجزاء من الثانية (Milliseconds)</w:t>
             </w:r>
           </w:p>
@@ -1033,8 +1228,12 @@
           <w:p>
             <w:pPr>
               <w:pStyle w:val="Compact"/>
-            </w:pPr>
-            <w:r>
+              <w:bidi/>
+            </w:pPr>
+            <w:r>
+              <w:rPr>
+                <w:rtl/>
+              </w:rPr>
               <w:t xml:space="preserve">Isolation</w:t>
             </w:r>
           </w:p>
@@ -1044,8 +1243,12 @@
           <w:p>
             <w:pPr>
               <w:pStyle w:val="Compact"/>
-            </w:pPr>
-            <w:r>
+              <w:bidi/>
+            </w:pPr>
+            <w:r>
+              <w:rPr>
+                <w:rtl/>
+              </w:rPr>
               <w:t xml:space="preserve">عزل قوي (Hardware Level)</w:t>
             </w:r>
           </w:p>
@@ -1055,8 +1258,12 @@
           <w:p>
             <w:pPr>
               <w:pStyle w:val="Compact"/>
-            </w:pPr>
-            <w:r>
+              <w:bidi/>
+            </w:pPr>
+            <w:r>
+              <w:rPr>
+                <w:rtl/>
+              </w:rPr>
               <w:t xml:space="preserve">عزل على مستوى العمليات (Process Level)</w:t>
             </w:r>
           </w:p>
@@ -1068,8 +1275,12 @@
           <w:p>
             <w:pPr>
               <w:pStyle w:val="Compact"/>
-            </w:pPr>
-            <w:r>
+              <w:bidi/>
+            </w:pPr>
+            <w:r>
+              <w:rPr>
+                <w:rtl/>
+              </w:rPr>
               <w:t xml:space="preserve">Portability</w:t>
             </w:r>
           </w:p>
@@ -1079,8 +1290,12 @@
           <w:p>
             <w:pPr>
               <w:pStyle w:val="Compact"/>
-            </w:pPr>
-            <w:r>
+              <w:bidi/>
+            </w:pPr>
+            <w:r>
+              <w:rPr>
+                <w:rtl/>
+              </w:rPr>
               <w:t xml:space="preserve">صعبة النقل (ملفات بحجم جيجابايت)</w:t>
             </w:r>
           </w:p>
@@ -1090,9 +1305,154 @@
           <w:p>
             <w:pPr>
               <w:pStyle w:val="Compact"/>
-            </w:pPr>
-            <w:r>
+              <w:bidi/>
+            </w:pPr>
+            <w:r>
+              <w:rPr>
+                <w:rtl/>
+              </w:rPr>
               <w:t xml:space="preserve">سهلة النقل والتوزيع (ميجابايت)</w:t>
+            </w:r>
+          </w:p>
+        </w:tc>
+      </w:tr>
+      <w:tr>
+        <w:tc>
+          <w:tcPr/>
+          <w:p>
+            <w:pPr>
+              <w:pStyle w:val="Compact"/>
+              <w:bidi/>
+            </w:pPr>
+            <w:r>
+              <w:rPr>
+                <w:rtl/>
+              </w:rPr>
+              <w:t xml:space="preserve">Image</w:t>
+            </w:r>
+          </w:p>
+        </w:tc>
+        <w:tc>
+          <w:tcPr/>
+          <w:p>
+            <w:pPr>
+              <w:pStyle w:val="Compact"/>
+              <w:bidi/>
+            </w:pPr>
+            <w:r>
+              <w:rPr>
+                <w:rtl/>
+              </w:rPr>
+              <w:t xml:space="preserve">ملفات كبيرة (VHD/VMDK)</w:t>
+            </w:r>
+          </w:p>
+        </w:tc>
+        <w:tc>
+          <w:tcPr/>
+          <w:p>
+            <w:pPr>
+              <w:pStyle w:val="Compact"/>
+              <w:bidi/>
+            </w:pPr>
+            <w:r>
+              <w:rPr>
+                <w:rtl/>
+              </w:rPr>
+              <w:t xml:space="preserve">صور مبنية كطبقات خفيفة</w:t>
+            </w:r>
+          </w:p>
+        </w:tc>
+      </w:tr>
+      <w:tr>
+        <w:tc>
+          <w:tcPr/>
+          <w:p>
+            <w:pPr>
+              <w:pStyle w:val="Compact"/>
+              <w:bidi/>
+            </w:pPr>
+            <w:r>
+              <w:rPr>
+                <w:rtl/>
+              </w:rPr>
+              <w:t xml:space="preserve">Deployment</w:t>
+            </w:r>
+          </w:p>
+        </w:tc>
+        <w:tc>
+          <w:tcPr/>
+          <w:p>
+            <w:pPr>
+              <w:pStyle w:val="Compact"/>
+              <w:bidi/>
+            </w:pPr>
+            <w:r>
+              <w:rPr>
+                <w:rtl/>
+              </w:rPr>
+              <w:t xml:space="preserve">يتطلب إعدادات بنية تحتية معقدة</w:t>
+            </w:r>
+          </w:p>
+        </w:tc>
+        <w:tc>
+          <w:tcPr/>
+          <w:p>
+            <w:pPr>
+              <w:pStyle w:val="Compact"/>
+              <w:bidi/>
+            </w:pPr>
+            <w:r>
+              <w:rPr>
+                <w:rtl/>
+              </w:rPr>
+              <w:t xml:space="preserve">سريع باستخدام Dockerfile</w:t>
+            </w:r>
+          </w:p>
+        </w:tc>
+      </w:tr>
+      <w:tr>
+        <w:tc>
+          <w:tcPr/>
+          <w:p>
+            <w:pPr>
+              <w:pStyle w:val="Compact"/>
+              <w:bidi/>
+            </w:pPr>
+            <w:r>
+              <w:rPr>
+                <w:rtl/>
+              </w:rPr>
+              <w:t xml:space="preserve">Scalability</w:t>
+            </w:r>
+          </w:p>
+        </w:tc>
+        <w:tc>
+          <w:tcPr/>
+          <w:p>
+            <w:pPr>
+              <w:pStyle w:val="Compact"/>
+              <w:bidi/>
+            </w:pPr>
+            <w:r>
+              <w:rPr>
+                <w:rtl/>
+              </w:rPr>
+              <w:t xml:space="preserve">بطيء في التوسع</w:t>
+            </w:r>
+          </w:p>
+        </w:tc>
+        <w:tc>
+          <w:tcPr/>
+          <w:p>
+            <w:pPr>
+              <w:pStyle w:val="Compact"/>
+              <w:bidi/>
+            </w:pPr>
+            <w:r>
+              <w:rPr>
+                <w:rtl/>
+              </w:rPr>
+              <w:t xml:space="preserve">سريع جداً في إنشاء حاويات جديدة</w:t>
             </w:r>
           </w:p>
         </w:tc>
@@ -1100,10 +1460,13 @@
     </w:tbl>
     <w:p>
       <w:pPr>
-        <w:pStyle w:val="BodyText"/>
-      </w:pPr>
-      <w:r>
-        <w:t xml:space="preserve">يعتبر Docker الخيار الأمثل لهذا المشروع لأنه يسمح بتشغيل الثلاث طبقات على نفس الجهاز باستهلاك موارد ضئيل وبسرعة فائقة.</w:t>
+        <w:bidi/>
+      </w:pPr>
+      <w:r>
+        <w:rPr>
+          <w:rtl/>
+        </w:rPr>
+        <w:t xml:space="preserve">يعتبر Docker الخيار الأمثل لهذا المشروع لأنه يسمح بتشغيل الطبقات الثلاث على نفس الجهاز باستهلاك موارد ضئيل وبسرعة فائقة.</w:t>
       </w:r>
     </w:p>
     <w:bookmarkEnd w:id="15"/>
@@ -1111,10 +1474,12 @@
     <w:p>
       <w:pPr>
         <w:pStyle w:val="Heading1"/>
+        <w:bidi/>
       </w:pPr>
       <w:r>
         <w:rPr>
           <w:rStyle w:val="SectionNumber"/>
+          <w:rtl/>
         </w:rPr>
         <w:t xml:space="preserve">8</w:t>
       </w:r>
@@ -1122,149 +1487,195 @@
         <w:tab/>
       </w:r>
       <w:r>
-        <w:t xml:space="preserve">8. Dockerfile وتحسين الطبقات</w:t>
-      </w:r>
-    </w:p>
-    <w:p>
-      <w:pPr>
-        <w:pStyle w:val="FirstParagraph"/>
-      </w:pPr>
-      <w:r>
+        <w:rPr>
+          <w:rtl/>
+        </w:rPr>
+        <w:t xml:space="preserve">Dockerfile وتحسين الطبقات</w:t>
+      </w:r>
+    </w:p>
+    <w:p>
+      <w:pPr>
+        <w:bidi/>
+      </w:pPr>
+      <w:r>
+        <w:rPr>
+          <w:rtl/>
+        </w:rPr>
         <w:t xml:space="preserve">إليك ملف Dockerfile المستخدم لبرمجة صورة الـ API:</w:t>
       </w:r>
     </w:p>
     <w:p>
       <w:pPr>
-        <w:pStyle w:val="BodyText"/>
+        <w:bidi/>
       </w:pPr>
       <w:r>
         <w:rPr>
           <w:rStyle w:val="VerbatimChar"/>
+          <w:rtl/>
         </w:rPr>
         <w:t xml:space="preserve">dockerfile FROM node:24-alpine WORKDIR /usr/src/app COPY package*.json ./ RUN npm install --omit=dev COPY . . USER node EXPOSE 3000 CMD ["npm", "start"]</w:t>
       </w:r>
-      <w:r>
+    </w:p>
+    <w:p>
+      <w:pPr>
+        <w:pStyle w:val="Compact"/>
+        <w:numPr>
+          <w:ilvl w:val="0"/>
+          <w:numId w:val="1004"/>
+        </w:numPr>
+        <w:bidi/>
+      </w:pPr>
+      <w:r>
+        <w:rPr>
+          <w:rtl/>
+        </w:rPr>
+        <w:t xml:space="preserve">FROM: يعتمد على صورة مصغرة lpine لتخفيف الحجم.</w:t>
+      </w:r>
+    </w:p>
+    <w:p>
+      <w:pPr>
+        <w:pStyle w:val="Compact"/>
+        <w:numPr>
+          <w:ilvl w:val="0"/>
+          <w:numId w:val="1004"/>
+        </w:numPr>
+        <w:bidi/>
+      </w:pPr>
+      <w:r>
+        <w:rPr>
+          <w:rtl/>
+        </w:rPr>
+        <w:t xml:space="preserve">WORKDIR: يحدد مجلد العمل داخل الحاوية.</w:t>
+      </w:r>
+    </w:p>
+    <w:p>
+      <w:pPr>
+        <w:pStyle w:val="Compact"/>
+        <w:numPr>
+          <w:ilvl w:val="0"/>
+          <w:numId w:val="1004"/>
+        </w:numPr>
+        <w:bidi/>
+      </w:pPr>
+      <w:r>
+        <w:rPr>
+          <w:rtl/>
+        </w:rPr>
+        <w:t xml:space="preserve">COPY package*.json ./: تم وضع هذا الأمر متبوعاً بـ</w:t>
+      </w:r>
+      <w:r>
+        <w:rPr>
+          <w:rtl/>
+        </w:rPr>
         <w:t xml:space="preserve"> </w:t>
       </w:r>
       <w:r>
-        <w:t xml:space="preserve">-</w:t>
-      </w:r>
-      <w:r>
+        <w:rPr>
+          <w:rtl/>
+        </w:rPr>
+        <w:t xml:space="preserve">pm install</w:t>
+      </w:r>
+      <w:r>
+        <w:rPr>
+          <w:rtl/>
+        </w:rPr>
         <w:t xml:space="preserve"> </w:t>
       </w:r>
       <w:r>
         <w:rPr>
           <w:b/>
           <w:bCs/>
-        </w:rPr>
-        <w:t xml:space="preserve">FROM</w:t>
-      </w:r>
-      <w:r>
-        <w:t xml:space="preserve">: يعتمد على صورة مصغرة lpine لتخفيف الحجم.</w:t>
-      </w:r>
-      <w:r>
+          <w:rtl/>
+        </w:rPr>
+        <w:t xml:space="preserve">قبل</w:t>
+      </w:r>
+      <w:r>
+        <w:rPr>
+          <w:rtl/>
+        </w:rPr>
         <w:t xml:space="preserve"> </w:t>
       </w:r>
       <w:r>
-        <w:t xml:space="preserve">-</w:t>
-      </w:r>
-      <w:r>
+        <w:rPr>
+          <w:rtl/>
+        </w:rPr>
+        <w:t xml:space="preserve">نسخ باقي الكود المصدري COPY . .. هذا يسمح بالاستفادة القصوى من (Layer Caching) لضمان عدم إعادة التثبيت إلا إذا تغيرت المكتبات.</w:t>
+      </w:r>
+    </w:p>
+    <w:p>
+      <w:pPr>
+        <w:pStyle w:val="Compact"/>
+        <w:numPr>
+          <w:ilvl w:val="0"/>
+          <w:numId w:val="1004"/>
+        </w:numPr>
+        <w:bidi/>
+      </w:pPr>
+      <w:r>
+        <w:rPr>
+          <w:rtl/>
+        </w:rPr>
+        <w:t xml:space="preserve">pm install –omit=dev: يثبت حزم الإنتاج فقط لتقليل الحجم وتحسين الأمان.</w:t>
+      </w:r>
+    </w:p>
+    <w:p>
+      <w:pPr>
+        <w:pStyle w:val="Compact"/>
+        <w:numPr>
+          <w:ilvl w:val="0"/>
+          <w:numId w:val="1004"/>
+        </w:numPr>
+        <w:bidi/>
+      </w:pPr>
+      <w:r>
+        <w:rPr>
+          <w:rtl/>
+        </w:rPr>
+        <w:t xml:space="preserve">USER node: يحول المستخدم من oot إلى</w:t>
+      </w:r>
+      <w:r>
+        <w:rPr>
+          <w:rtl/>
+        </w:rPr>
         <w:t xml:space="preserve"> </w:t>
       </w:r>
       <w:r>
         <w:rPr>
-          <w:b/>
-          <w:bCs/>
-        </w:rPr>
-        <w:t xml:space="preserve">WORKDIR</w:t>
-      </w:r>
-      <w:r>
-        <w:t xml:space="preserve">: يحدد مجلد العمل داخل الحاوية.</w:t>
-      </w:r>
-      <w:r>
-        <w:t xml:space="preserve"> </w:t>
-      </w:r>
-      <w:r>
-        <w:t xml:space="preserve">-</w:t>
-      </w:r>
-      <w:r>
-        <w:t xml:space="preserve"> </w:t>
-      </w:r>
-      <w:r>
-        <w:rPr>
-          <w:b/>
-          <w:bCs/>
-        </w:rPr>
-        <w:t xml:space="preserve">Layer Caching</w:t>
-      </w:r>
-      <w:r>
-        <w:t xml:space="preserve">: تم وضع COPY package*.json ./ متبوعاً بـ</w:t>
-      </w:r>
-      <w:r>
-        <w:t xml:space="preserve"> </w:t>
-      </w:r>
-      <w:r>
-        <w:t xml:space="preserve">pm install</w:t>
-      </w:r>
-      <w:r>
-        <w:t xml:space="preserve"> </w:t>
-      </w:r>
-      <w:r>
-        <w:rPr>
-          <w:b/>
-          <w:bCs/>
-        </w:rPr>
-        <w:t xml:space="preserve">قبل</w:t>
-      </w:r>
-      <w:r>
-        <w:t xml:space="preserve"> </w:t>
-      </w:r>
-      <w:r>
-        <w:t xml:space="preserve">أمر COPY . .. هذا يضمن عدم إعادة تنزيل المكتبات إذا تم تعديل الكود المصدري فقط، مما يسرّع البناء.</w:t>
-      </w:r>
-      <w:r>
-        <w:t xml:space="preserve"> </w:t>
-      </w:r>
-      <w:r>
-        <w:t xml:space="preserve">-</w:t>
-      </w:r>
-      <w:r>
-        <w:t xml:space="preserve"> </w:t>
-      </w:r>
-      <w:r>
-        <w:rPr>
-          <w:b/>
-          <w:bCs/>
-        </w:rPr>
-        <w:t xml:space="preserve">USER</w:t>
-      </w:r>
-      <w:r>
-        <w:t xml:space="preserve">: يحول المستخدم من oot إلى</w:t>
-      </w:r>
-      <w:r>
-        <w:t xml:space="preserve"> </w:t>
-      </w:r>
-      <w:r>
-        <w:t xml:space="preserve">ode لتعزيز الأمان (Least Privilege).</w:t>
-      </w:r>
-      <w:r>
-        <w:t xml:space="preserve"> </w:t>
-      </w:r>
-      <w:r>
-        <w:t xml:space="preserve">-</w:t>
-      </w:r>
-      <w:r>
-        <w:t xml:space="preserve"> </w:t>
-      </w:r>
-      <w:r>
-        <w:rPr>
-          <w:b/>
-          <w:bCs/>
-        </w:rPr>
-        <w:t xml:space="preserve">EXPOSE</w:t>
-      </w:r>
-      <w:r>
-        <w:t xml:space="preserve">: يوثق أن المنفذ 3000 مستخدم داخلياً، ولكنه لا يفتحه على المضيف.</w:t>
+          <w:rtl/>
+        </w:rPr>
+        <w:t xml:space="preserve">ode لتعزيز الأمان.</w:t>
+      </w:r>
+    </w:p>
+    <w:p>
+      <w:pPr>
+        <w:pStyle w:val="Compact"/>
+        <w:numPr>
+          <w:ilvl w:val="0"/>
+          <w:numId w:val="1004"/>
+        </w:numPr>
+        <w:bidi/>
+      </w:pPr>
+      <w:r>
+        <w:rPr>
+          <w:rtl/>
+        </w:rPr>
+        <w:t xml:space="preserve">EXPOSE 3000: يوثق أن المنفذ 3000 مستخدم داخلياً، ولكنه لا يفتحه على المضيف.</w:t>
+      </w:r>
+    </w:p>
+    <w:p>
+      <w:pPr>
+        <w:pStyle w:val="Compact"/>
+        <w:numPr>
+          <w:ilvl w:val="0"/>
+          <w:numId w:val="1004"/>
+        </w:numPr>
+        <w:bidi/>
+      </w:pPr>
+      <w:r>
+        <w:rPr>
+          <w:rtl/>
+        </w:rPr>
+        <w:t xml:space="preserve">CMD: يحدد الأمر الافتراضي لتشغيل الخدمة.</w:t>
       </w:r>
     </w:p>
     <w:bookmarkEnd w:id="16"/>
@@ -1272,10 +1683,12 @@
     <w:p>
       <w:pPr>
         <w:pStyle w:val="Heading1"/>
+        <w:bidi/>
       </w:pPr>
       <w:r>
         <w:rPr>
           <w:rStyle w:val="SectionNumber"/>
+          <w:rtl/>
         </w:rPr>
         <w:t xml:space="preserve">9</w:t>
       </w:r>
@@ -1283,45 +1696,92 @@
         <w:tab/>
       </w:r>
       <w:r>
-        <w:t xml:space="preserve">9. Docker Compose</w:t>
-      </w:r>
-    </w:p>
-    <w:p>
-      <w:pPr>
-        <w:pStyle w:val="FirstParagraph"/>
-      </w:pPr>
-      <w:r>
+        <w:rPr>
+          <w:rtl/>
+        </w:rPr>
+        <w:t xml:space="preserve">Docker Compose</w:t>
+      </w:r>
+    </w:p>
+    <w:p>
+      <w:pPr>
+        <w:bidi/>
+      </w:pPr>
+      <w:r>
+        <w:rPr>
+          <w:rtl/>
+        </w:rPr>
         <w:t xml:space="preserve">ملف compose.yaml هو القلب النابض للنظام، حيث يعرّف الخدمات:</w:t>
       </w:r>
-      <w:r>
+    </w:p>
+    <w:p>
+      <w:pPr>
+        <w:pStyle w:val="Compact"/>
+        <w:numPr>
+          <w:ilvl w:val="0"/>
+          <w:numId w:val="1005"/>
+        </w:numPr>
+        <w:bidi/>
+      </w:pPr>
+      <w:r>
+        <w:rPr>
+          <w:rtl/>
+        </w:rPr>
+        <w:t xml:space="preserve">ask-management-db</w:t>
+      </w:r>
+    </w:p>
+    <w:p>
+      <w:pPr>
+        <w:pStyle w:val="Compact"/>
+        <w:numPr>
+          <w:ilvl w:val="0"/>
+          <w:numId w:val="1005"/>
+        </w:numPr>
+        <w:bidi/>
+      </w:pPr>
+      <w:r>
+        <w:rPr>
+          <w:rtl/>
+        </w:rPr>
+        <w:t xml:space="preserve">ask-management-api</w:t>
+      </w:r>
+    </w:p>
+    <w:p>
+      <w:pPr>
+        <w:pStyle w:val="Compact"/>
+        <w:numPr>
+          <w:ilvl w:val="0"/>
+          <w:numId w:val="1005"/>
+        </w:numPr>
+        <w:bidi/>
+      </w:pPr>
+      <w:r>
+        <w:rPr>
+          <w:rtl/>
+        </w:rPr>
+        <w:t xml:space="preserve">ask-management-nginx</w:t>
+      </w:r>
+    </w:p>
+    <w:p>
+      <w:pPr>
+        <w:bidi/>
+      </w:pPr>
+      <w:r>
+        <w:rPr>
+          <w:rtl/>
+        </w:rPr>
+        <w:t xml:space="preserve">استخدمنا depends_on مع healthcheck لضمان عدم عمل الـ API إلا بعد جاهزية قاعدة البيانات تماماً. وُضعت المتغيرات الأمنية في قسم environment، وتم ربط الجميع في</w:t>
+      </w:r>
+      <w:r>
+        <w:rPr>
+          <w:rtl/>
+        </w:rPr>
         <w:t xml:space="preserve"> </w:t>
       </w:r>
       <w:r>
-        <w:t xml:space="preserve">- ask-management-db</w:t>
-      </w:r>
-      <w:r>
-        <w:t xml:space="preserve"> </w:t>
-      </w:r>
-      <w:r>
-        <w:t xml:space="preserve">- ask-management-api</w:t>
-      </w:r>
-      <w:r>
-        <w:t xml:space="preserve"> </w:t>
-      </w:r>
-      <w:r>
-        <w:t xml:space="preserve">- ask-management-nginx</w:t>
-      </w:r>
-      <w:r>
-        <w:t xml:space="preserve"> </w:t>
-      </w:r>
-      <w:r>
-        <w:t xml:space="preserve">استخدمنا depends_on مع healthcheck لضمان عدم عمل الـ API إلا بعد جاهزية قاعدة البيانات تماماً. وُضعت المتغيرات الأمنية في قسم environment، وتم ربط الجميع في</w:t>
-      </w:r>
-      <w:r>
-        <w:t xml:space="preserve"> </w:t>
-      </w:r>
-      <w:r>
-        <w:t xml:space="preserve">etworks. تم تخصيص ports لحاوية Nginx فقط (8080:80) لإبقاء الـ API وقاعدة البيانات مخفيتين تماماً.</w:t>
+        <w:rPr>
+          <w:rtl/>
+        </w:rPr>
+        <w:t xml:space="preserve">etworks. تم تخصيص ports لحاوية Nginx فقط لإبقاء الـ API و PostgreSQL مخفيين تماماً.</w:t>
       </w:r>
     </w:p>
     <w:bookmarkEnd w:id="17"/>
@@ -1329,10 +1789,12 @@
     <w:p>
       <w:pPr>
         <w:pStyle w:val="Heading1"/>
+        <w:bidi/>
       </w:pPr>
       <w:r>
         <w:rPr>
           <w:rStyle w:val="SectionNumber"/>
+          <w:rtl/>
         </w:rPr>
         <w:t xml:space="preserve">10</w:t>
       </w:r>
@@ -1340,15 +1802,21 @@
         <w:tab/>
       </w:r>
       <w:r>
-        <w:t xml:space="preserve">10. Network Architecture</w:t>
-      </w:r>
-    </w:p>
-    <w:p>
-      <w:pPr>
-        <w:pStyle w:val="FirstParagraph"/>
-      </w:pPr>
-      <w:r>
-        <w:t xml:space="preserve">يعتمد المشروع على شبكة من نوع Bridge Network تسمى ask-management-network. هذه الشبكة توفر خدمة نظام أسماء النطاقات الداخلي (Internal DNS) واكتشاف الخدمات (Service Discovery). بفضل هذا، يمكن لحاوية الـ API التحدث مع قاعدة البيانات بمجرد استخدام اسمها ask-management-db دون الحاجة لمعرفة عنوان الـ IP المتغير الخاص بها.</w:t>
+        <w:rPr>
+          <w:rtl/>
+        </w:rPr>
+        <w:t xml:space="preserve">Network Architecture</w:t>
+      </w:r>
+    </w:p>
+    <w:p>
+      <w:pPr>
+        <w:bidi/>
+      </w:pPr>
+      <w:r>
+        <w:rPr>
+          <w:rtl/>
+        </w:rPr>
+        <w:t xml:space="preserve">يعتمد المشروع على شبكة من نوع Bridge Network تسمى ask-management-network. هذه الشبكة توفر خدمة نظام أسماء النطاقات الداخلي (Internal DNS) واكتشاف الخدمات (Service Discovery). بفضل هذا، يمكن لحاوية الـ API التحدث مع قاعدة البيانات بمجرد استخدام اسم الخدمة ask-management-db دون الحاجة لمعرفة عنوان الـ IP المتغير الخاص بها.</w:t>
       </w:r>
     </w:p>
     <w:bookmarkEnd w:id="18"/>
@@ -1356,10 +1824,12 @@
     <w:p>
       <w:pPr>
         <w:pStyle w:val="Heading1"/>
+        <w:bidi/>
       </w:pPr>
       <w:r>
         <w:rPr>
           <w:rStyle w:val="SectionNumber"/>
+          <w:rtl/>
         </w:rPr>
         <w:t xml:space="preserve">11</w:t>
       </w:r>
@@ -1367,23 +1837,37 @@
         <w:tab/>
       </w:r>
       <w:r>
-        <w:t xml:space="preserve">11. Nginx Reverse Proxy</w:t>
-      </w:r>
-    </w:p>
-    <w:p>
-      <w:pPr>
-        <w:pStyle w:val="FirstParagraph"/>
-      </w:pPr>
-      <w:r>
+        <w:rPr>
+          <w:rtl/>
+        </w:rPr>
+        <w:t xml:space="preserve">Nginx Reverse Proxy</w:t>
+      </w:r>
+    </w:p>
+    <w:p>
+      <w:pPr>
+        <w:bidi/>
+      </w:pPr>
+      <w:r>
+        <w:rPr>
+          <w:rtl/>
+        </w:rPr>
         <w:t xml:space="preserve">يعمل Nginx كوكيل عكسي (Reverse Proxy). مسار الطلب الفعلي هو:</w:t>
       </w:r>
-      <w:r>
-        <w:t xml:space="preserve"> </w:t>
-      </w:r>
-      <w:r>
+    </w:p>
+    <w:p>
+      <w:pPr>
+        <w:bidi/>
+      </w:pPr>
+      <w:r>
+        <w:rPr>
+          <w:rtl/>
+        </w:rPr>
         <w:t xml:space="preserve">Client</w:t>
       </w:r>
       <w:r>
+        <w:rPr>
+          <w:rtl/>
+        </w:rPr>
         <w:t xml:space="preserve"> </w:t>
       </w:r>
       <m:oMath>
@@ -1391,16 +1875,25 @@
           <m:rPr>
             <m:sty m:val="p"/>
           </m:rPr>
-          <m:t>→</m:t>
+          <m:t>↓</m:t>
         </m:r>
       </m:oMath>
       <w:r>
+        <w:rPr>
+          <w:rtl/>
+        </w:rPr>
         <w:t xml:space="preserve"> </w:t>
       </w:r>
       <w:r>
+        <w:rPr>
+          <w:rtl/>
+        </w:rPr>
         <w:t xml:space="preserve">localhost:8080</w:t>
       </w:r>
       <w:r>
+        <w:rPr>
+          <w:rtl/>
+        </w:rPr>
         <w:t xml:space="preserve"> </w:t>
       </w:r>
       <m:oMath>
@@ -1408,16 +1901,25 @@
           <m:rPr>
             <m:sty m:val="p"/>
           </m:rPr>
-          <m:t>→</m:t>
+          <m:t>↓</m:t>
         </m:r>
       </m:oMath>
       <w:r>
+        <w:rPr>
+          <w:rtl/>
+        </w:rPr>
         <w:t xml:space="preserve"> </w:t>
       </w:r>
       <w:r>
-        <w:t xml:space="preserve">Nginx 80</w:t>
-      </w:r>
-      <w:r>
+        <w:rPr>
+          <w:rtl/>
+        </w:rPr>
+        <w:t xml:space="preserve">Nginx container :80</w:t>
+      </w:r>
+      <w:r>
+        <w:rPr>
+          <w:rtl/>
+        </w:rPr>
         <w:t xml:space="preserve"> </w:t>
       </w:r>
       <m:oMath>
@@ -1425,16 +1927,25 @@
           <m:rPr>
             <m:sty m:val="p"/>
           </m:rPr>
-          <m:t>→</m:t>
+          <m:t>↓</m:t>
         </m:r>
       </m:oMath>
       <w:r>
+        <w:rPr>
+          <w:rtl/>
+        </w:rPr>
         <w:t xml:space="preserve"> </w:t>
       </w:r>
       <w:r>
+        <w:rPr>
+          <w:rtl/>
+        </w:rPr>
         <w:t xml:space="preserve">ask-management-api:3000</w:t>
       </w:r>
       <w:r>
+        <w:rPr>
+          <w:rtl/>
+        </w:rPr>
         <w:t xml:space="preserve"> </w:t>
       </w:r>
       <m:oMath>
@@ -1442,20 +1953,79 @@
           <m:rPr>
             <m:sty m:val="p"/>
           </m:rPr>
-          <m:t>→</m:t>
+          <m:t>↓</m:t>
         </m:r>
       </m:oMath>
       <w:r>
+        <w:rPr>
+          <w:rtl/>
+        </w:rPr>
         <w:t xml:space="preserve"> </w:t>
       </w:r>
       <w:r>
-        <w:t xml:space="preserve">PostgreSQL 5432</w:t>
-      </w:r>
-      <w:r>
+        <w:rPr>
+          <w:rtl/>
+        </w:rPr>
+        <w:t xml:space="preserve">ask-management-db:5432</w:t>
+      </w:r>
+    </w:p>
+    <w:p>
+      <w:pPr>
+        <w:bidi/>
+      </w:pPr>
+      <w:r>
+        <w:rPr>
+          <w:rtl/>
+        </w:rPr>
+        <w:t xml:space="preserve">يحقق هذا فوائد هامة:</w:t>
+      </w:r>
+      <w:r>
+        <w:rPr>
+          <w:rtl/>
+        </w:rPr>
         <w:t xml:space="preserve"> </w:t>
       </w:r>
       <w:r>
-        <w:t xml:space="preserve">يحقق هذا أماناً عالياً (Network Isolation)، ويوفر نقطة دخول واحدة مركزية لتنظيم حركة المرور (Traffic Routing).</w:t>
+        <w:rPr>
+          <w:rtl/>
+        </w:rPr>
+        <w:t xml:space="preserve">* نقطة دخول واحدة للمشروع بأكمله.</w:t>
+      </w:r>
+      <w:r>
+        <w:rPr>
+          <w:rtl/>
+        </w:rPr>
+        <w:t xml:space="preserve"> </w:t>
+      </w:r>
+      <w:r>
+        <w:rPr>
+          <w:rtl/>
+        </w:rPr>
+        <w:t xml:space="preserve">* إخفاء واجهة الـ API عن المضيف تماماً.</w:t>
+      </w:r>
+      <w:r>
+        <w:rPr>
+          <w:rtl/>
+        </w:rPr>
+        <w:t xml:space="preserve"> </w:t>
+      </w:r>
+      <w:r>
+        <w:rPr>
+          <w:rtl/>
+        </w:rPr>
+        <w:t xml:space="preserve">* عزل شبكي كامل (Network Isolation).</w:t>
+      </w:r>
+      <w:r>
+        <w:rPr>
+          <w:rtl/>
+        </w:rPr>
+        <w:t xml:space="preserve"> </w:t>
+      </w:r>
+      <w:r>
+        <w:rPr>
+          <w:rtl/>
+        </w:rPr>
+        <w:t xml:space="preserve">* تنظيم وحماية حركة المرور.</w:t>
       </w:r>
     </w:p>
     <w:bookmarkEnd w:id="19"/>
@@ -1463,10 +2033,12 @@
     <w:p>
       <w:pPr>
         <w:pStyle w:val="Heading1"/>
+        <w:bidi/>
       </w:pPr>
       <w:r>
         <w:rPr>
           <w:rStyle w:val="SectionNumber"/>
+          <w:rtl/>
         </w:rPr>
         <w:t xml:space="preserve">12</w:t>
       </w:r>
@@ -1474,15 +2046,45 @@
         <w:tab/>
       </w:r>
       <w:r>
-        <w:t xml:space="preserve">12. Storage Architecture وPersistence</w:t>
-      </w:r>
-    </w:p>
-    <w:p>
-      <w:pPr>
-        <w:pStyle w:val="FirstParagraph"/>
-      </w:pPr>
-      <w:r>
-        <w:t xml:space="preserve">بشكل افتراضي، نظام ملفات الحاوية (Container filesystem) هو نظام مؤقت يُمحى بمجرد حذف الحاوية. لضمان بقاء البيانات، استخدمنا وحدة تخزين مسماة (Named Volume) تدعى ask-management-db-data وتم ربطها بمسار قاعدة البيانات /var/lib/postgresql/data. هذا يفصل دورة حياة البيانات عن دورة حياة الحاويات.</w:t>
+        <w:rPr>
+          <w:rtl/>
+        </w:rPr>
+        <w:t xml:space="preserve">Storage Architecture وPersistence</w:t>
+      </w:r>
+    </w:p>
+    <w:p>
+      <w:pPr>
+        <w:bidi/>
+      </w:pPr>
+      <w:r>
+        <w:rPr>
+          <w:rtl/>
+        </w:rPr>
+        <w:t xml:space="preserve">نظام ملفات الحاوية (Container filesystem) هو نظام مؤقت يُمحى بمجرد إيقاف الحاوية. لضمان بقاء البيانات، استخدمنا وحدة تخزين مسماة (Named Volume) تدعى ask-management-db-data وتم ربطها بمسار PostgreSQL:</w:t>
+      </w:r>
+      <w:r>
+        <w:rPr>
+          <w:rtl/>
+        </w:rPr>
+        <w:t xml:space="preserve"> </w:t>
+      </w:r>
+      <w:r>
+        <w:rPr>
+          <w:rtl/>
+        </w:rPr>
+        <w:t xml:space="preserve">/var/lib/postgresql/data</w:t>
+      </w:r>
+      <w:r>
+        <w:rPr>
+          <w:rtl/>
+        </w:rPr>
+        <w:t xml:space="preserve"> </w:t>
+      </w:r>
+      <w:r>
+        <w:rPr>
+          <w:rtl/>
+        </w:rPr>
+        <w:t xml:space="preserve">هذا يفصل دورة حياة البيانات عن دورة حياة الحاويات لضمان عدم ضياع المهام.</w:t>
       </w:r>
     </w:p>
     <w:bookmarkEnd w:id="20"/>
@@ -1490,10 +2092,12 @@
     <w:p>
       <w:pPr>
         <w:pStyle w:val="Heading1"/>
+        <w:bidi/>
       </w:pPr>
       <w:r>
         <w:rPr>
           <w:rStyle w:val="SectionNumber"/>
+          <w:rtl/>
         </w:rPr>
         <w:t xml:space="preserve">13</w:t>
       </w:r>
@@ -1501,21 +2105,81 @@
         <w:tab/>
       </w:r>
       <w:r>
-        <w:t xml:space="preserve">13. إثبات Persistence</w:t>
-      </w:r>
-    </w:p>
-    <w:p>
-      <w:pPr>
-        <w:pStyle w:val="FirstParagraph"/>
-      </w:pPr>
-      <w:r>
-        <w:t xml:space="preserve">للتأكد من استمرارية البيانات، قمنا بإنشاء مهمة (Task) جديدة ثم إيقاف النظام بأمر docker compose down. وعند تشغيل النظام مجدداً بـ docker compose up -d وطلب البيانات، وُجدت المهمة كما هي.</w:t>
-      </w:r>
-      <w:r>
+        <w:rPr>
+          <w:rtl/>
+        </w:rPr>
+        <w:t xml:space="preserve">إثبات Persistence</w:t>
+      </w:r>
+    </w:p>
+    <w:p>
+      <w:pPr>
+        <w:bidi/>
+      </w:pPr>
+      <w:r>
+        <w:rPr>
+          <w:rtl/>
+        </w:rPr>
+        <w:t xml:space="preserve">تم إجراء اختبار فعلي لاستمرارية البيانات كالتالي:</w:t>
+      </w:r>
+      <w:r>
+        <w:rPr>
+          <w:rtl/>
+        </w:rPr>
         <w:t xml:space="preserve"> </w:t>
       </w:r>
       <w:r>
-        <w:t xml:space="preserve">تحذير: لا ينبغي أبداً استخدام docker compose down -v لأنه يقوم بتدمير الـ named volumes ويمسح البيانات نهائياً.</w:t>
+        <w:rPr>
+          <w:rtl/>
+        </w:rPr>
+        <w:t xml:space="preserve">1. إنشاء مهمة (Task) جديدة.</w:t>
+      </w:r>
+      <w:r>
+        <w:rPr>
+          <w:rtl/>
+        </w:rPr>
+        <w:t xml:space="preserve"> </w:t>
+      </w:r>
+      <w:r>
+        <w:rPr>
+          <w:rtl/>
+        </w:rPr>
+        <w:t xml:space="preserve">2. تنفيذ أمر docker compose down.</w:t>
+      </w:r>
+      <w:r>
+        <w:rPr>
+          <w:rtl/>
+        </w:rPr>
+        <w:t xml:space="preserve"> </w:t>
+      </w:r>
+      <w:r>
+        <w:rPr>
+          <w:rtl/>
+        </w:rPr>
+        <w:t xml:space="preserve">3. تنفيذ أمر docker compose up -d.</w:t>
+      </w:r>
+      <w:r>
+        <w:rPr>
+          <w:rtl/>
+        </w:rPr>
+        <w:t xml:space="preserve"> </w:t>
+      </w:r>
+      <w:r>
+        <w:rPr>
+          <w:rtl/>
+        </w:rPr>
+        <w:t xml:space="preserve">4. استرجاع البيانات بأمر GET والتأكد من بقاء المهمة التي تم إنشاؤها.</w:t>
+      </w:r>
+    </w:p>
+    <w:p>
+      <w:pPr>
+        <w:pStyle w:val="BlockText"/>
+        <w:bidi/>
+      </w:pPr>
+      <w:r>
+        <w:rPr>
+          <w:rtl/>
+        </w:rPr>
+        <w:t xml:space="preserve">تحذير: أمر docker compose down يوقف النظام بأمان، بينما أمر docker compose down -v يقوم بحذف وحدات التخزين المسماة ويمسح جميع البيانات نهائياً.</w:t>
       </w:r>
     </w:p>
     <w:bookmarkEnd w:id="21"/>
@@ -1523,10 +2187,12 @@
     <w:p>
       <w:pPr>
         <w:pStyle w:val="Heading1"/>
+        <w:bidi/>
       </w:pPr>
       <w:r>
         <w:rPr>
           <w:rStyle w:val="SectionNumber"/>
+          <w:rtl/>
         </w:rPr>
         <w:t xml:space="preserve">14</w:t>
       </w:r>
@@ -1534,45 +2200,117 @@
         <w:tab/>
       </w:r>
       <w:r>
-        <w:t xml:space="preserve">14. Security Practices</w:t>
-      </w:r>
-    </w:p>
-    <w:p>
-      <w:pPr>
-        <w:pStyle w:val="FirstParagraph"/>
-      </w:pPr>
-      <w:r>
-        <w:t xml:space="preserve">ركزنا على الجوانب الأمنية من خلال:</w:t>
-      </w:r>
-      <w:r>
+        <w:rPr>
+          <w:rtl/>
+        </w:rPr>
+        <w:t xml:space="preserve">Security Practices</w:t>
+      </w:r>
+    </w:p>
+    <w:p>
+      <w:pPr>
+        <w:bidi/>
+      </w:pPr>
+      <w:r>
+        <w:rPr>
+          <w:rtl/>
+        </w:rPr>
+        <w:t xml:space="preserve">ركزنا على الجوانب الأمنية من خلال تطبيق الإجراءات التالية:</w:t>
+      </w:r>
+      <w:r>
+        <w:rPr>
+          <w:rtl/>
+        </w:rPr>
         <w:t xml:space="preserve"> </w:t>
       </w:r>
       <w:r>
-        <w:t xml:space="preserve">- تشغيل الـ API بمستخدم غير جذري USER node.</w:t>
-      </w:r>
-      <w:r>
+        <w:rPr>
+          <w:rtl/>
+        </w:rPr>
+        <w:t xml:space="preserve">* تشغيل API باستخدام USER node.</w:t>
+      </w:r>
+      <w:r>
+        <w:rPr>
+          <w:rtl/>
+        </w:rPr>
         <w:t xml:space="preserve"> </w:t>
       </w:r>
       <w:r>
-        <w:t xml:space="preserve">- إخفاء المنافذ 3000 و 5432 عن المضيف تماماً.</w:t>
-      </w:r>
-      <w:r>
+        <w:rPr>
+          <w:rtl/>
+        </w:rPr>
+        <w:t xml:space="preserve">* عدم نشر port 3000 على Host.</w:t>
+      </w:r>
+      <w:r>
+        <w:rPr>
+          <w:rtl/>
+        </w:rPr>
         <w:t xml:space="preserve"> </w:t>
       </w:r>
       <w:r>
-        <w:t xml:space="preserve">- الاعتماد على Nginx كمدخل خارجي وحيد.</w:t>
-      </w:r>
-      <w:r>
+        <w:rPr>
+          <w:rtl/>
+        </w:rPr>
+        <w:t xml:space="preserve">* عدم نشر port 5432 على Host.</w:t>
+      </w:r>
+      <w:r>
+        <w:rPr>
+          <w:rtl/>
+        </w:rPr>
         <w:t xml:space="preserve"> </w:t>
       </w:r>
       <w:r>
-        <w:t xml:space="preserve">- استخدام ملفات .gitignore و .dockerignore لمنع رفع الملفات الحساسة (Secrets) أو الكبيرة (node_modules) إلى GitHub والسجل.</w:t>
-      </w:r>
-      <w:r>
+        <w:rPr>
+          <w:rtl/>
+        </w:rPr>
+        <w:t xml:space="preserve">* استخدام Nginx كنقطة الدخول الخارجية الوحيدة.</w:t>
+      </w:r>
+      <w:r>
+        <w:rPr>
+          <w:rtl/>
+        </w:rPr>
         <w:t xml:space="preserve"> </w:t>
       </w:r>
       <w:r>
-        <w:t xml:space="preserve">- تثبيت حزم الإنتاج فقط عبر –omit=dev.</w:t>
+        <w:rPr>
+          <w:rtl/>
+        </w:rPr>
+        <w:t xml:space="preserve">* استخدام .gitignore.</w:t>
+      </w:r>
+      <w:r>
+        <w:rPr>
+          <w:rtl/>
+        </w:rPr>
+        <w:t xml:space="preserve"> </w:t>
+      </w:r>
+      <w:r>
+        <w:rPr>
+          <w:rtl/>
+        </w:rPr>
+        <w:t xml:space="preserve">* استخدام .dockerignore.</w:t>
+      </w:r>
+      <w:r>
+        <w:rPr>
+          <w:rtl/>
+        </w:rPr>
+        <w:t xml:space="preserve"> </w:t>
+      </w:r>
+      <w:r>
+        <w:rPr>
+          <w:rtl/>
+        </w:rPr>
+        <w:t xml:space="preserve">* عدم رفع secrets إلى GitHub.</w:t>
+      </w:r>
+      <w:r>
+        <w:rPr>
+          <w:rtl/>
+        </w:rPr>
+        <w:t xml:space="preserve"> </w:t>
+      </w:r>
+      <w:r>
+        <w:rPr>
+          <w:rtl/>
+        </w:rPr>
+        <w:t xml:space="preserve">* تثبيت Production Dependencies فقط عبر –omit=dev.</w:t>
       </w:r>
     </w:p>
     <w:bookmarkEnd w:id="22"/>
@@ -1580,10 +2318,12 @@
     <w:p>
       <w:pPr>
         <w:pStyle w:val="Heading1"/>
+        <w:bidi/>
       </w:pPr>
       <w:r>
         <w:rPr>
           <w:rStyle w:val="SectionNumber"/>
+          <w:rtl/>
         </w:rPr>
         <w:t xml:space="preserve">15</w:t>
       </w:r>
@@ -1591,15 +2331,21 @@
         <w:tab/>
       </w:r>
       <w:r>
-        <w:t xml:space="preserve">15. Failure Mode Scenarios</w:t>
-      </w:r>
-    </w:p>
-    <w:p>
-      <w:pPr>
-        <w:pStyle w:val="FirstParagraph"/>
-      </w:pPr>
-      <w:r>
-        <w:t xml:space="preserve">تمت محاكاة انهيار النظام للتأكد من قدرته على التعامل مع الأخطاء:</w:t>
+        <w:rPr>
+          <w:rtl/>
+        </w:rPr>
+        <w:t xml:space="preserve">Failure Mode Scenarios</w:t>
+      </w:r>
+    </w:p>
+    <w:p>
+      <w:pPr>
+        <w:bidi/>
+      </w:pPr>
+      <w:r>
+        <w:rPr>
+          <w:rtl/>
+        </w:rPr>
+        <w:t xml:space="preserve">تمت محاكاة انهيار النظام للتأكد من قدرته على التعامل مع الأخطاء (بناءً على الاختبارات الفعلية للمشروع):</w:t>
       </w:r>
     </w:p>
     <w:tbl>
@@ -1623,8 +2369,12 @@
           <w:p>
             <w:pPr>
               <w:pStyle w:val="Compact"/>
-            </w:pPr>
-            <w:r>
+              <w:bidi/>
+            </w:pPr>
+            <w:r>
+              <w:rPr>
+                <w:rtl/>
+              </w:rPr>
               <w:t xml:space="preserve">الحالة</w:t>
             </w:r>
           </w:p>
@@ -1634,8 +2384,12 @@
           <w:p>
             <w:pPr>
               <w:pStyle w:val="Compact"/>
-            </w:pPr>
-            <w:r>
+              <w:bidi/>
+            </w:pPr>
+            <w:r>
+              <w:rPr>
+                <w:rtl/>
+              </w:rPr>
               <w:t xml:space="preserve">النتيجة</w:t>
             </w:r>
           </w:p>
@@ -1645,8 +2399,12 @@
           <w:p>
             <w:pPr>
               <w:pStyle w:val="Compact"/>
-            </w:pPr>
-            <w:r>
+              <w:bidi/>
+            </w:pPr>
+            <w:r>
+              <w:rPr>
+                <w:rtl/>
+              </w:rPr>
               <w:t xml:space="preserve">التفسير</w:t>
             </w:r>
           </w:p>
@@ -1658,8 +2416,12 @@
           <w:p>
             <w:pPr>
               <w:pStyle w:val="Compact"/>
-            </w:pPr>
-            <w:r>
+              <w:bidi/>
+            </w:pPr>
+            <w:r>
+              <w:rPr>
+                <w:rtl/>
+              </w:rPr>
               <w:t xml:space="preserve">توقف API</w:t>
             </w:r>
           </w:p>
@@ -1669,8 +2431,12 @@
           <w:p>
             <w:pPr>
               <w:pStyle w:val="Compact"/>
-            </w:pPr>
-            <w:r>
+              <w:bidi/>
+            </w:pPr>
+            <w:r>
+              <w:rPr>
+                <w:rtl/>
+              </w:rPr>
               <w:t xml:space="preserve">502 Bad Gateway</w:t>
             </w:r>
           </w:p>
@@ -1680,9 +2446,13 @@
           <w:p>
             <w:pPr>
               <w:pStyle w:val="Compact"/>
-            </w:pPr>
-            <w:r>
-              <w:t xml:space="preserve">Nginx يعمل لكنه لا يجد الخادم الخلفي.</w:t>
+              <w:bidi/>
+            </w:pPr>
+            <w:r>
+              <w:rPr>
+                <w:rtl/>
+              </w:rPr>
+              <w:t xml:space="preserve">Nginx لا يستطيع الوصول إلى API</w:t>
             </w:r>
           </w:p>
         </w:tc>
@@ -1693,8 +2463,12 @@
           <w:p>
             <w:pPr>
               <w:pStyle w:val="Compact"/>
-            </w:pPr>
-            <w:r>
+              <w:bidi/>
+            </w:pPr>
+            <w:r>
+              <w:rPr>
+                <w:rtl/>
+              </w:rPr>
               <w:t xml:space="preserve">توقف Database</w:t>
             </w:r>
           </w:p>
@@ -1704,8 +2478,12 @@
           <w:p>
             <w:pPr>
               <w:pStyle w:val="Compact"/>
-            </w:pPr>
-            <w:r>
+              <w:bidi/>
+            </w:pPr>
+            <w:r>
+              <w:rPr>
+                <w:rtl/>
+              </w:rPr>
               <w:t xml:space="preserve">500 Internal Server Error</w:t>
             </w:r>
           </w:p>
@@ -1715,9 +2493,13 @@
           <w:p>
             <w:pPr>
               <w:pStyle w:val="Compact"/>
-            </w:pPr>
-            <w:r>
-              <w:t xml:space="preserve">الـ API يعمل لكنه يفشل في تنفيذ الاستعلامات.</w:t>
+              <w:bidi/>
+            </w:pPr>
+            <w:r>
+              <w:rPr>
+                <w:rtl/>
+              </w:rPr>
+              <w:t xml:space="preserve">API لا يستطيع تنفيذ استعلامات قاعدة البيانات</w:t>
             </w:r>
           </w:p>
         </w:tc>
@@ -1728,8 +2510,12 @@
           <w:p>
             <w:pPr>
               <w:pStyle w:val="Compact"/>
-            </w:pPr>
-            <w:r>
+              <w:bidi/>
+            </w:pPr>
+            <w:r>
+              <w:rPr>
+                <w:rtl/>
+              </w:rPr>
               <w:t xml:space="preserve">توقف Nginx</w:t>
             </w:r>
           </w:p>
@@ -1739,8 +2525,12 @@
           <w:p>
             <w:pPr>
               <w:pStyle w:val="Compact"/>
-            </w:pPr>
-            <w:r>
+              <w:bidi/>
+            </w:pPr>
+            <w:r>
+              <w:rPr>
+                <w:rtl/>
+              </w:rPr>
               <w:t xml:space="preserve">Connection Refused</w:t>
             </w:r>
           </w:p>
@@ -1750,9 +2540,13 @@
           <w:p>
             <w:pPr>
               <w:pStyle w:val="Compact"/>
-            </w:pPr>
-            <w:r>
-              <w:t xml:space="preserve">نقطة الدخول متوقفة كلياً.</w:t>
+              <w:bidi/>
+            </w:pPr>
+            <w:r>
+              <w:rPr>
+                <w:rtl/>
+              </w:rPr>
+              <w:t xml:space="preserve">نقطة الدخول الخارجية متوقفة</w:t>
             </w:r>
           </w:p>
         </w:tc>
@@ -1763,8 +2557,12 @@
           <w:p>
             <w:pPr>
               <w:pStyle w:val="Compact"/>
-            </w:pPr>
-            <w:r>
+              <w:bidi/>
+            </w:pPr>
+            <w:r>
+              <w:rPr>
+                <w:rtl/>
+              </w:rPr>
               <w:t xml:space="preserve">Task ID غير موجود</w:t>
             </w:r>
           </w:p>
@@ -1774,8 +2572,12 @@
           <w:p>
             <w:pPr>
               <w:pStyle w:val="Compact"/>
-            </w:pPr>
-            <w:r>
+              <w:bidi/>
+            </w:pPr>
+            <w:r>
+              <w:rPr>
+                <w:rtl/>
+              </w:rPr>
               <w:t xml:space="preserve">404 Not Found</w:t>
             </w:r>
           </w:p>
@@ -1785,9 +2587,13 @@
           <w:p>
             <w:pPr>
               <w:pStyle w:val="Compact"/>
-            </w:pPr>
-            <w:r>
-              <w:t xml:space="preserve">الـ API يعالج الطلب ويرد برمز خطأ سليم.</w:t>
+              <w:bidi/>
+            </w:pPr>
+            <w:r>
+              <w:rPr>
+                <w:rtl/>
+              </w:rPr>
+              <w:t xml:space="preserve">API يعالج الطلب بشكل صحيح</w:t>
             </w:r>
           </w:p>
         </w:tc>
@@ -1798,8 +2604,12 @@
           <w:p>
             <w:pPr>
               <w:pStyle w:val="Compact"/>
-            </w:pPr>
-            <w:r>
+              <w:bidi/>
+            </w:pPr>
+            <w:r>
+              <w:rPr>
+                <w:rtl/>
+              </w:rPr>
               <w:t xml:space="preserve">POST ببيانات خاطئة</w:t>
             </w:r>
           </w:p>
@@ -1809,8 +2619,12 @@
           <w:p>
             <w:pPr>
               <w:pStyle w:val="Compact"/>
-            </w:pPr>
-            <w:r>
+              <w:bidi/>
+            </w:pPr>
+            <w:r>
+              <w:rPr>
+                <w:rtl/>
+              </w:rPr>
               <w:t xml:space="preserve">400 Bad Request</w:t>
             </w:r>
           </w:p>
@@ -1820,9 +2634,13 @@
           <w:p>
             <w:pPr>
               <w:pStyle w:val="Compact"/>
-            </w:pPr>
-            <w:r>
-              <w:t xml:space="preserve">الـ API يرفض البيانات لعدم مطابقتها للشروط.</w:t>
+              <w:bidi/>
+            </w:pPr>
+            <w:r>
+              <w:rPr>
+                <w:rtl/>
+              </w:rPr>
+              <w:t xml:space="preserve">API يرفض البيانات غير الصحيحة</w:t>
             </w:r>
           </w:p>
         </w:tc>
@@ -1833,10 +2651,12 @@
     <w:p>
       <w:pPr>
         <w:pStyle w:val="Heading1"/>
+        <w:bidi/>
       </w:pPr>
       <w:r>
         <w:rPr>
           <w:rStyle w:val="SectionNumber"/>
+          <w:rtl/>
         </w:rPr>
         <w:t xml:space="preserve">16</w:t>
       </w:r>
@@ -1844,53 +2664,71 @@
         <w:tab/>
       </w:r>
       <w:r>
-        <w:t xml:space="preserve">16. Testing Evidence</w:t>
-      </w:r>
-    </w:p>
-    <w:p>
-      <w:pPr>
-        <w:pStyle w:val="FirstParagraph"/>
-      </w:pPr>
-      <w:r>
-        <w:t xml:space="preserve">تم تنفيذ الاختبارات على مستويين:</w:t>
-      </w:r>
-      <w:r>
-        <w:t xml:space="preserve"> </w:t>
-      </w:r>
-      <w:r>
-        <w:t xml:space="preserve">-</w:t>
-      </w:r>
-      <w:r>
-        <w:t xml:space="preserve"> </w:t>
-      </w:r>
+        <w:rPr>
+          <w:rtl/>
+        </w:rPr>
+        <w:t xml:space="preserve">Testing Evidence</w:t>
+      </w:r>
+    </w:p>
+    <w:p>
+      <w:pPr>
+        <w:bidi/>
+      </w:pPr>
+      <w:r>
+        <w:rPr>
+          <w:rtl/>
+        </w:rPr>
+        <w:t xml:space="preserve">تم تنفيذ الاختبارات على مستويين، وفقاً للمتاح في بيئة المشروع الحقيقية:</w:t>
+      </w:r>
+    </w:p>
+    <w:p>
+      <w:pPr>
+        <w:bidi/>
+      </w:pPr>
       <w:r>
         <w:rPr>
           <w:b/>
           <w:bCs/>
+          <w:rtl/>
         </w:rPr>
         <w:t xml:space="preserve">Automated Testing</w:t>
       </w:r>
       <w:r>
-        <w:t xml:space="preserve">: ملف pi/tests/test.js يقوم تلقائياً بطلب GET للتأكد من عمل الـ API.</w:t>
-      </w:r>
-      <w:r>
+        <w:rPr>
+          <w:rtl/>
+        </w:rPr>
         <w:t xml:space="preserve"> </w:t>
       </w:r>
       <w:r>
-        <w:t xml:space="preserve">-</w:t>
-      </w:r>
-      <w:r>
-        <w:t xml:space="preserve"> </w:t>
-      </w:r>
+        <w:rPr>
+          <w:rtl/>
+        </w:rPr>
+        <w:t xml:space="preserve">ملف pi/tests/test.js يغطي اختبار GET للتأكد من استجابة الـ API آلياً.</w:t>
+      </w:r>
+    </w:p>
+    <w:p>
+      <w:pPr>
+        <w:bidi/>
+      </w:pPr>
       <w:r>
         <w:rPr>
           <w:b/>
           <w:bCs/>
+          <w:rtl/>
         </w:rPr>
         <w:t xml:space="preserve">Manual Runtime Testing</w:t>
       </w:r>
       <w:r>
-        <w:t xml:space="preserve">: تم اختبار وظائف POST و PUT و DELETE، بالإضافة لسيناريوهات الفشل المختلفة، يدوياً أثناء التشغيل للتأكد من الموثوقية الشاملة.</w:t>
+        <w:rPr>
+          <w:rtl/>
+        </w:rPr>
+        <w:t xml:space="preserve"> </w:t>
+      </w:r>
+      <w:r>
+        <w:rPr>
+          <w:rtl/>
+        </w:rPr>
+        <w:t xml:space="preserve">تم التحقق من وظائف POST و PUT و DELETE واختبارات Failure Modes يدوياً أثناء التشغيل للتأكد من الموثوقية.</w:t>
       </w:r>
     </w:p>
     <w:bookmarkEnd w:id="24"/>
@@ -1898,10 +2736,12 @@
     <w:p>
       <w:pPr>
         <w:pStyle w:val="Heading1"/>
+        <w:bidi/>
       </w:pPr>
       <w:r>
         <w:rPr>
           <w:rStyle w:val="SectionNumber"/>
+          <w:rtl/>
         </w:rPr>
         <w:t xml:space="preserve">17</w:t>
       </w:r>
@@ -1909,39 +2749,64 @@
         <w:tab/>
       </w:r>
       <w:r>
-        <w:t xml:space="preserve">17. Docker Hub / Registry &amp; Versioning</w:t>
-      </w:r>
-    </w:p>
-    <w:p>
-      <w:pPr>
-        <w:pStyle w:val="FirstParagraph"/>
-      </w:pPr>
-      <w:r>
-        <w:t xml:space="preserve">تم بناء ورفع صورة (Image) المشروع إلى السجل (Docker Registry) في موقع Docker Hub.</w:t>
-      </w:r>
-      <w:r>
-        <w:t xml:space="preserve"> </w:t>
-      </w:r>
-      <w:r>
-        <w:t xml:space="preserve">- المستودع: hishamdiv/task-management-api</w:t>
-      </w:r>
-      <w:r>
-        <w:t xml:space="preserve"> </w:t>
-      </w:r>
-      <w:r>
-        <w:t xml:space="preserve">تم استخدام علامات (Tags) تعتمد على (Semantic Versioning):</w:t>
-      </w:r>
-      <w:r>
-        <w:t xml:space="preserve"> </w:t>
-      </w:r>
-      <w:r>
-        <w:t xml:space="preserve">- 1.0.0: لتجميد إصدار مستقر لا يتغير.</w:t>
-      </w:r>
-      <w:r>
-        <w:t xml:space="preserve"> </w:t>
-      </w:r>
-      <w:r>
-        <w:t xml:space="preserve">- latest: ليكون مؤشراً لأحدث نسخة متوفرة.</w:t>
+        <w:rPr>
+          <w:rtl/>
+        </w:rPr>
+        <w:t xml:space="preserve">Docker Hub / Registry &amp; Versioning</w:t>
+      </w:r>
+    </w:p>
+    <w:p>
+      <w:pPr>
+        <w:bidi/>
+      </w:pPr>
+      <w:r>
+        <w:rPr>
+          <w:rtl/>
+        </w:rPr>
+        <w:t xml:space="preserve">تم استخدام سجل حاويات (Docker Registry) في موقع Docker Hub لرفع وتوثيق الصورة الخاصة بـ API.</w:t>
+      </w:r>
+    </w:p>
+    <w:p>
+      <w:pPr>
+        <w:pStyle w:val="Compact"/>
+        <w:numPr>
+          <w:ilvl w:val="0"/>
+          <w:numId w:val="1006"/>
+        </w:numPr>
+        <w:bidi/>
+      </w:pPr>
+      <w:r>
+        <w:rPr>
+          <w:rtl/>
+        </w:rPr>
+        <w:t xml:space="preserve">Repository: hishamdiv/task-management-api</w:t>
+      </w:r>
+    </w:p>
+    <w:p>
+      <w:pPr>
+        <w:pStyle w:val="Compact"/>
+        <w:numPr>
+          <w:ilvl w:val="0"/>
+          <w:numId w:val="1006"/>
+        </w:numPr>
+        <w:bidi/>
+      </w:pPr>
+      <w:r>
+        <w:rPr>
+          <w:rtl/>
+        </w:rPr>
+        <w:t xml:space="preserve">Tags: تم استخدام 1.0.0 (كنسخة ثابتة) و latest (كأحدث نسخة متوفرة).</w:t>
+      </w:r>
+    </w:p>
+    <w:p>
+      <w:pPr>
+        <w:bidi/>
+      </w:pPr>
+      <w:r>
+        <w:rPr>
+          <w:rtl/>
+        </w:rPr>
+        <w:t xml:space="preserve">تم تطبيق إدارة الإصدارات الدلالية (Semantic Versioning) لتنظيم التحديثات وضمان استقرار عمليات السحب (Pulling).</w:t>
       </w:r>
     </w:p>
     <w:bookmarkEnd w:id="25"/>
@@ -1949,10 +2814,12 @@
     <w:p>
       <w:pPr>
         <w:pStyle w:val="Heading1"/>
+        <w:bidi/>
       </w:pPr>
       <w:r>
         <w:rPr>
           <w:rStyle w:val="SectionNumber"/>
+          <w:rtl/>
         </w:rPr>
         <w:t xml:space="preserve">18</w:t>
       </w:r>
@@ -1960,30 +2827,44 @@
         <w:tab/>
       </w:r>
       <w:r>
-        <w:t xml:space="preserve">18. Reproducible Deployment</w:t>
-      </w:r>
-    </w:p>
-    <w:p>
-      <w:pPr>
-        <w:pStyle w:val="FirstParagraph"/>
-      </w:pPr>
-      <w:r>
-        <w:t xml:space="preserve">يمكن لأي شخص الآن إعادة تشغيل النظام بكفاءة وفي ثوانٍ عبر الأوامر:</w:t>
-      </w:r>
-      <w:r>
-        <w:t xml:space="preserve"> </w:t>
-      </w:r>
+        <w:rPr>
+          <w:rtl/>
+        </w:rPr>
+        <w:t xml:space="preserve">Reproducible Deployment</w:t>
+      </w:r>
+    </w:p>
+    <w:p>
+      <w:pPr>
+        <w:bidi/>
+      </w:pPr>
+      <w:r>
+        <w:rPr>
+          <w:rtl/>
+        </w:rPr>
+        <w:t xml:space="preserve">يمكن لأي مستخدم آخر تشغيل المشروع بنجاح على جهازه عبر سلسلة الأوامر التالية:</w:t>
+      </w:r>
+    </w:p>
+    <w:p>
+      <w:pPr>
+        <w:bidi/>
+      </w:pPr>
       <w:r>
         <w:rPr>
           <w:rStyle w:val="VerbatimChar"/>
-        </w:rPr>
-        <w:t xml:space="preserve">ext git clone [repository-url] cd task-management-api docker compose up -d</w:t>
-      </w:r>
-      <w:r>
-        <w:t xml:space="preserve"> </w:t>
-      </w:r>
-      <w:r>
-        <w:t xml:space="preserve">يضمن هذا التوافق الكامل عبر الأجهزة المختلفة بفضل الـ Dockerfile وصور Docker Hub.</w:t>
+          <w:rtl/>
+        </w:rPr>
+        <w:t xml:space="preserve">powershell git clone cd task-management-api docker compose up -d</w:t>
+      </w:r>
+    </w:p>
+    <w:p>
+      <w:pPr>
+        <w:bidi/>
+      </w:pPr>
+      <w:r>
+        <w:rPr>
+          <w:rtl/>
+        </w:rPr>
+        <w:t xml:space="preserve">يتحقق هذا بفضل الاعتماد على Dockerfile و compose.yaml وصور Docker Hub التي توفر بنية تحتية متطابقة في كل مرة.</w:t>
       </w:r>
     </w:p>
     <w:bookmarkEnd w:id="26"/>
@@ -1991,10 +2872,12 @@
     <w:p>
       <w:pPr>
         <w:pStyle w:val="Heading1"/>
+        <w:bidi/>
       </w:pPr>
       <w:r>
         <w:rPr>
           <w:rStyle w:val="SectionNumber"/>
+          <w:rtl/>
         </w:rPr>
         <w:t xml:space="preserve">19</w:t>
       </w:r>
@@ -2002,15 +2885,33 @@
         <w:tab/>
       </w:r>
       <w:r>
-        <w:t xml:space="preserve">19. Git وGitHub</w:t>
-      </w:r>
-    </w:p>
-    <w:p>
-      <w:pPr>
-        <w:pStyle w:val="FirstParagraph"/>
-      </w:pPr>
-      <w:r>
-        <w:t xml:space="preserve">تم تتبع التغييرات باستخدام نظام Git من خلال التزام (Commit) وحفظ الفروع (Branch) مثل main. تم رفع المشروع إلى الخادم البعيد (Remote) على موقع GitHub، مما يعزز أمان الكود وسهولة الوصول إليه.</w:t>
+        <w:rPr>
+          <w:rtl/>
+        </w:rPr>
+        <w:t xml:space="preserve">Git وGitHub</w:t>
+      </w:r>
+    </w:p>
+    <w:p>
+      <w:pPr>
+        <w:bidi/>
+      </w:pPr>
+      <w:r>
+        <w:rPr>
+          <w:rtl/>
+        </w:rPr>
+        <w:t xml:space="preserve">تم رفع المشروع إلى مستودع التحكم بالإصدار (Repository) على GitHub.</w:t>
+      </w:r>
+      <w:r>
+        <w:rPr>
+          <w:rtl/>
+        </w:rPr>
+        <w:t xml:space="preserve"> </w:t>
+      </w:r>
+      <w:r>
+        <w:rPr>
+          <w:rtl/>
+        </w:rPr>
+        <w:t xml:space="preserve">تمت إدارة التغييرات عبر لقطات (Commits) على الفرع الأساسي (Branch) المسمى main، ومن ثم دفعها إلى الخادم البعيد (Remote).</w:t>
       </w:r>
     </w:p>
     <w:bookmarkEnd w:id="27"/>
@@ -2018,10 +2919,12 @@
     <w:p>
       <w:pPr>
         <w:pStyle w:val="Heading1"/>
+        <w:bidi/>
       </w:pPr>
       <w:r>
         <w:rPr>
           <w:rStyle w:val="SectionNumber"/>
+          <w:rtl/>
         </w:rPr>
         <w:t xml:space="preserve">20</w:t>
       </w:r>
@@ -2029,7 +2932,10 @@
         <w:tab/>
       </w:r>
       <w:r>
-        <w:t xml:space="preserve">20. Team Contributions</w:t>
+        <w:rPr>
+          <w:rtl/>
+        </w:rPr>
+        <w:t xml:space="preserve">Team Contributions</w:t>
       </w:r>
     </w:p>
     <w:tbl>
@@ -2051,8 +2957,12 @@
           <w:p>
             <w:pPr>
               <w:pStyle w:val="Compact"/>
-            </w:pPr>
-            <w:r>
+              <w:bidi/>
+            </w:pPr>
+            <w:r>
+              <w:rPr>
+                <w:rtl/>
+              </w:rPr>
               <w:t xml:space="preserve">عضو الفريق</w:t>
             </w:r>
           </w:p>
@@ -2062,8 +2972,12 @@
           <w:p>
             <w:pPr>
               <w:pStyle w:val="Compact"/>
-            </w:pPr>
-            <w:r>
+              <w:bidi/>
+            </w:pPr>
+            <w:r>
+              <w:rPr>
+                <w:rtl/>
+              </w:rPr>
               <w:t xml:space="preserve">المسؤوليات</w:t>
             </w:r>
           </w:p>
@@ -2075,8 +2989,12 @@
           <w:p>
             <w:pPr>
               <w:pStyle w:val="Compact"/>
-            </w:pPr>
-            <w:r>
+              <w:bidi/>
+            </w:pPr>
+            <w:r>
+              <w:rPr>
+                <w:rtl/>
+              </w:rPr>
               <w:t xml:space="preserve">[اسم عضو الفريق الأول]</w:t>
             </w:r>
           </w:p>
@@ -2086,8 +3004,12 @@
           <w:p>
             <w:pPr>
               <w:pStyle w:val="Compact"/>
-            </w:pPr>
-            <w:r>
+              <w:bidi/>
+            </w:pPr>
+            <w:r>
+              <w:rPr>
+                <w:rtl/>
+              </w:rPr>
               <w:t xml:space="preserve">Backend Development &amp; Containerization</w:t>
             </w:r>
           </w:p>
@@ -2099,8 +3021,12 @@
           <w:p>
             <w:pPr>
               <w:pStyle w:val="Compact"/>
-            </w:pPr>
-            <w:r>
+              <w:bidi/>
+            </w:pPr>
+            <w:r>
+              <w:rPr>
+                <w:rtl/>
+              </w:rPr>
               <w:t xml:space="preserve">[اسم عضو الفريق الثاني]</w:t>
             </w:r>
           </w:p>
@@ -2110,8 +3036,12 @@
           <w:p>
             <w:pPr>
               <w:pStyle w:val="Compact"/>
-            </w:pPr>
-            <w:r>
+              <w:bidi/>
+            </w:pPr>
+            <w:r>
+              <w:rPr>
+                <w:rtl/>
+              </w:rPr>
               <w:t xml:space="preserve">Reverse Proxy &amp; Security</w:t>
             </w:r>
           </w:p>
@@ -2123,8 +3053,12 @@
           <w:p>
             <w:pPr>
               <w:pStyle w:val="Compact"/>
-            </w:pPr>
-            <w:r>
+              <w:bidi/>
+            </w:pPr>
+            <w:r>
+              <w:rPr>
+                <w:rtl/>
+              </w:rPr>
               <w:t xml:space="preserve">[اسم عضو الفريق الثالث]</w:t>
             </w:r>
           </w:p>
@@ -2134,8 +3068,12 @@
           <w:p>
             <w:pPr>
               <w:pStyle w:val="Compact"/>
-            </w:pPr>
-            <w:r>
+              <w:bidi/>
+            </w:pPr>
+            <w:r>
+              <w:rPr>
+                <w:rtl/>
+              </w:rPr>
               <w:t xml:space="preserve">Database &amp; Storage</w:t>
             </w:r>
           </w:p>
@@ -2147,8 +3085,12 @@
           <w:p>
             <w:pPr>
               <w:pStyle w:val="Compact"/>
-            </w:pPr>
-            <w:r>
+              <w:bidi/>
+            </w:pPr>
+            <w:r>
+              <w:rPr>
+                <w:rtl/>
+              </w:rPr>
               <w:t xml:space="preserve">[اسم عضو الفريق الرابع]</w:t>
             </w:r>
           </w:p>
@@ -2158,8 +3100,12 @@
           <w:p>
             <w:pPr>
               <w:pStyle w:val="Compact"/>
-            </w:pPr>
-            <w:r>
+              <w:bidi/>
+            </w:pPr>
+            <w:r>
+              <w:rPr>
+                <w:rtl/>
+              </w:rPr>
               <w:t xml:space="preserve">Testing &amp; Documentation</w:t>
             </w:r>
           </w:p>
@@ -2171,10 +3117,12 @@
     <w:p>
       <w:pPr>
         <w:pStyle w:val="Heading1"/>
+        <w:bidi/>
       </w:pPr>
       <w:r>
         <w:rPr>
           <w:rStyle w:val="SectionNumber"/>
+          <w:rtl/>
         </w:rPr>
         <w:t xml:space="preserve">21</w:t>
       </w:r>
@@ -2182,24 +3130,56 @@
         <w:tab/>
       </w:r>
       <w:r>
-        <w:t xml:space="preserve">21. خطوات تشغيل المشروع</w:t>
-      </w:r>
-    </w:p>
-    <w:p>
-      <w:pPr>
-        <w:pStyle w:val="FirstParagraph"/>
-      </w:pPr>
-      <w:r>
-        <w:t xml:space="preserve">للتحقق العملي من النظام، يمكنك تنفيذ الأوامر التالية:</w:t>
-      </w:r>
-      <w:r>
-        <w:t xml:space="preserve"> </w:t>
-      </w:r>
+        <w:rPr>
+          <w:rtl/>
+        </w:rPr>
+        <w:t xml:space="preserve">خطوات تشغيل المشروع</w:t>
+      </w:r>
+    </w:p>
+    <w:p>
+      <w:pPr>
+        <w:bidi/>
+      </w:pPr>
+      <w:r>
+        <w:rPr>
+          <w:rtl/>
+        </w:rPr>
+        <w:t xml:space="preserve">الأوامر الأساسية لتشغيل واختبار المشروع محلياً:</w:t>
+      </w:r>
+    </w:p>
+    <w:p>
+      <w:pPr>
+        <w:bidi/>
+      </w:pPr>
       <w:r>
         <w:rPr>
           <w:rStyle w:val="VerbatimChar"/>
-        </w:rPr>
-        <w:t xml:space="preserve">powershell cd "C:\Users\NOMAN\Projects\task-management-api" docker compose config docker compose up -d --build docker compose ps Invoke-RestMethod -Uri "http://localhost:8080/api/tasks" -Method GET</w:t>
+          <w:rtl/>
+        </w:rPr>
+        <w:t xml:space="preserve">powershell cd "C:\Users\NOMAN\Projects\task-management-api" docker compose config docker compose up -d --build docker compose ps</w:t>
+      </w:r>
+    </w:p>
+    <w:p>
+      <w:pPr>
+        <w:bidi/>
+      </w:pPr>
+      <w:r>
+        <w:rPr>
+          <w:rtl/>
+        </w:rPr>
+        <w:t xml:space="preserve">وللتحقق من نجاح التشغيل:</w:t>
+      </w:r>
+    </w:p>
+    <w:p>
+      <w:pPr>
+        <w:bidi/>
+      </w:pPr>
+      <w:r>
+        <w:rPr>
+          <w:rStyle w:val="VerbatimChar"/>
+          <w:rtl/>
+        </w:rPr>
+        <w:t xml:space="preserve">powershell Invoke-RestMethod -Uri "http://localhost:8080/api/tasks" -Method GET</w:t>
       </w:r>
     </w:p>
     <w:bookmarkEnd w:id="29"/>
@@ -2207,10 +3187,12 @@
     <w:p>
       <w:pPr>
         <w:pStyle w:val="Heading1"/>
+        <w:bidi/>
       </w:pPr>
       <w:r>
         <w:rPr>
           <w:rStyle w:val="SectionNumber"/>
+          <w:rtl/>
         </w:rPr>
         <w:t xml:space="preserve">22</w:t>
       </w:r>
@@ -2218,26 +3200,34 @@
         <w:tab/>
       </w:r>
       <w:r>
-        <w:t xml:space="preserve">22. الخاتمة</w:t>
-      </w:r>
-    </w:p>
-    <w:p>
-      <w:pPr>
-        <w:pStyle w:val="FirstParagraph"/>
-      </w:pPr>
-      <w:r>
-        <w:t xml:space="preserve">أثبت هذا المشروع نجاحه في تقديم معمارية قوية ومرنة باستخدام حاويات Docker. تم بناء واجهة تطبيقات مستقرة ومعزولة شبكياً ومحمية بواسطة وكيل عكسي. مع ضمان استمرارية البيانات وإدارة الانهيارات بطريقة سليمة، نكون قد حققنا كافة متطلبات النشر السحابي الحديث.</w:t>
+        <w:rPr>
+          <w:rtl/>
+        </w:rPr>
+        <w:t xml:space="preserve">الخاتمة</w:t>
+      </w:r>
+    </w:p>
+    <w:p>
+      <w:pPr>
+        <w:bidi/>
+      </w:pPr>
+      <w:r>
+        <w:rPr>
+          <w:rtl/>
+        </w:rPr>
+        <w:t xml:space="preserve">أثبت هذا المشروع نجاحه في تقديم معمارية قوية ومرنة تعتمد على حاويات Docker، حيث تم بناء واجهة تطبيقات مستقرة ومعزولة شبكياً ومحمية بواسطة وكيل عكسي. مع ضمان استمرارية البيانات وإدارة الانهيارات بطريقة سليمة، يحقق المشروع المتطلبات الأساسية للنشر السحابي الحديث.</w:t>
       </w:r>
     </w:p>
     <w:bookmarkEnd w:id="30"/>
-    <w:bookmarkStart w:id="31" w:name="جدول-verification-status"/>
+    <w:bookmarkStart w:id="31" w:name="verification-status"/>
     <w:p>
       <w:pPr>
         <w:pStyle w:val="Heading1"/>
+        <w:bidi/>
       </w:pPr>
       <w:r>
         <w:rPr>
           <w:rStyle w:val="SectionNumber"/>
+          <w:rtl/>
         </w:rPr>
         <w:t xml:space="preserve">23</w:t>
       </w:r>
@@ -2245,7 +3235,10 @@
         <w:tab/>
       </w:r>
       <w:r>
-        <w:t xml:space="preserve">جدول Verification Status</w:t>
+        <w:rPr>
+          <w:rtl/>
+        </w:rPr>
+        <w:t xml:space="preserve">Verification Status</w:t>
       </w:r>
     </w:p>
     <w:tbl>
@@ -2267,8 +3260,12 @@
           <w:p>
             <w:pPr>
               <w:pStyle w:val="Compact"/>
-            </w:pPr>
-            <w:r>
+              <w:bidi/>
+            </w:pPr>
+            <w:r>
+              <w:rPr>
+                <w:rtl/>
+              </w:rPr>
               <w:t xml:space="preserve">العنصر</w:t>
             </w:r>
           </w:p>
@@ -2278,8 +3275,12 @@
           <w:p>
             <w:pPr>
               <w:pStyle w:val="Compact"/>
-            </w:pPr>
-            <w:r>
+              <w:bidi/>
+            </w:pPr>
+            <w:r>
+              <w:rPr>
+                <w:rtl/>
+              </w:rPr>
               <w:t xml:space="preserve">الحالة</w:t>
             </w:r>
           </w:p>
@@ -2291,8 +3292,12 @@
           <w:p>
             <w:pPr>
               <w:pStyle w:val="Compact"/>
-            </w:pPr>
-            <w:r>
+              <w:bidi/>
+            </w:pPr>
+            <w:r>
+              <w:rPr>
+                <w:rtl/>
+              </w:rPr>
               <w:t xml:space="preserve">Docker Compose</w:t>
             </w:r>
           </w:p>
@@ -2302,8 +3307,12 @@
           <w:p>
             <w:pPr>
               <w:pStyle w:val="Compact"/>
-            </w:pPr>
-            <w:r>
+              <w:bidi/>
+            </w:pPr>
+            <w:r>
+              <w:rPr>
+                <w:rtl/>
+              </w:rPr>
               <w:t xml:space="preserve">RUNTIME VERIFIED</w:t>
             </w:r>
           </w:p>
@@ -2315,8 +3324,12 @@
           <w:p>
             <w:pPr>
               <w:pStyle w:val="Compact"/>
-            </w:pPr>
-            <w:r>
+              <w:bidi/>
+            </w:pPr>
+            <w:r>
+              <w:rPr>
+                <w:rtl/>
+              </w:rPr>
               <w:t xml:space="preserve">API</w:t>
             </w:r>
           </w:p>
@@ -2326,8 +3339,12 @@
           <w:p>
             <w:pPr>
               <w:pStyle w:val="Compact"/>
-            </w:pPr>
-            <w:r>
+              <w:bidi/>
+            </w:pPr>
+            <w:r>
+              <w:rPr>
+                <w:rtl/>
+              </w:rPr>
               <w:t xml:space="preserve">RUNTIME VERIFIED</w:t>
             </w:r>
           </w:p>
@@ -2339,8 +3356,12 @@
           <w:p>
             <w:pPr>
               <w:pStyle w:val="Compact"/>
-            </w:pPr>
-            <w:r>
+              <w:bidi/>
+            </w:pPr>
+            <w:r>
+              <w:rPr>
+                <w:rtl/>
+              </w:rPr>
               <w:t xml:space="preserve">PostgreSQL</w:t>
             </w:r>
           </w:p>
@@ -2350,8 +3371,12 @@
           <w:p>
             <w:pPr>
               <w:pStyle w:val="Compact"/>
-            </w:pPr>
-            <w:r>
+              <w:bidi/>
+            </w:pPr>
+            <w:r>
+              <w:rPr>
+                <w:rtl/>
+              </w:rPr>
               <w:t xml:space="preserve">RUNTIME VERIFIED</w:t>
             </w:r>
           </w:p>
@@ -2363,8 +3388,12 @@
           <w:p>
             <w:pPr>
               <w:pStyle w:val="Compact"/>
-            </w:pPr>
-            <w:r>
+              <w:bidi/>
+            </w:pPr>
+            <w:r>
+              <w:rPr>
+                <w:rtl/>
+              </w:rPr>
               <w:t xml:space="preserve">Nginx</w:t>
             </w:r>
           </w:p>
@@ -2374,8 +3403,12 @@
           <w:p>
             <w:pPr>
               <w:pStyle w:val="Compact"/>
-            </w:pPr>
-            <w:r>
+              <w:bidi/>
+            </w:pPr>
+            <w:r>
+              <w:rPr>
+                <w:rtl/>
+              </w:rPr>
               <w:t xml:space="preserve">RUNTIME VERIFIED</w:t>
             </w:r>
           </w:p>
@@ -2387,8 +3420,12 @@
           <w:p>
             <w:pPr>
               <w:pStyle w:val="Compact"/>
-            </w:pPr>
-            <w:r>
+              <w:bidi/>
+            </w:pPr>
+            <w:r>
+              <w:rPr>
+                <w:rtl/>
+              </w:rPr>
               <w:t xml:space="preserve">Network Isolation</w:t>
             </w:r>
           </w:p>
@@ -2398,8 +3435,12 @@
           <w:p>
             <w:pPr>
               <w:pStyle w:val="Compact"/>
-            </w:pPr>
-            <w:r>
+              <w:bidi/>
+            </w:pPr>
+            <w:r>
+              <w:rPr>
+                <w:rtl/>
+              </w:rPr>
               <w:t xml:space="preserve">RUNTIME VERIFIED</w:t>
             </w:r>
           </w:p>
@@ -2411,8 +3452,12 @@
           <w:p>
             <w:pPr>
               <w:pStyle w:val="Compact"/>
-            </w:pPr>
-            <w:r>
+              <w:bidi/>
+            </w:pPr>
+            <w:r>
+              <w:rPr>
+                <w:rtl/>
+              </w:rPr>
               <w:t xml:space="preserve">Persistence</w:t>
             </w:r>
           </w:p>
@@ -2422,8 +3467,12 @@
           <w:p>
             <w:pPr>
               <w:pStyle w:val="Compact"/>
-            </w:pPr>
-            <w:r>
+              <w:bidi/>
+            </w:pPr>
+            <w:r>
+              <w:rPr>
+                <w:rtl/>
+              </w:rPr>
               <w:t xml:space="preserve">RUNTIME VERIFIED</w:t>
             </w:r>
           </w:p>
@@ -2435,8 +3484,12 @@
           <w:p>
             <w:pPr>
               <w:pStyle w:val="Compact"/>
-            </w:pPr>
-            <w:r>
+              <w:bidi/>
+            </w:pPr>
+            <w:r>
+              <w:rPr>
+                <w:rtl/>
+              </w:rPr>
               <w:t xml:space="preserve">CRUD</w:t>
             </w:r>
           </w:p>
@@ -2446,8 +3499,12 @@
           <w:p>
             <w:pPr>
               <w:pStyle w:val="Compact"/>
-            </w:pPr>
-            <w:r>
+              <w:bidi/>
+            </w:pPr>
+            <w:r>
+              <w:rPr>
+                <w:rtl/>
+              </w:rPr>
               <w:t xml:space="preserve">RUNTIME VERIFIED</w:t>
             </w:r>
           </w:p>
@@ -2459,8 +3516,12 @@
           <w:p>
             <w:pPr>
               <w:pStyle w:val="Compact"/>
-            </w:pPr>
-            <w:r>
+              <w:bidi/>
+            </w:pPr>
+            <w:r>
+              <w:rPr>
+                <w:rtl/>
+              </w:rPr>
               <w:t xml:space="preserve">Docker Hub</w:t>
             </w:r>
           </w:p>
@@ -2470,8 +3531,12 @@
           <w:p>
             <w:pPr>
               <w:pStyle w:val="Compact"/>
-            </w:pPr>
-            <w:r>
+              <w:bidi/>
+            </w:pPr>
+            <w:r>
+              <w:rPr>
+                <w:rtl/>
+              </w:rPr>
               <w:t xml:space="preserve">RUNTIME VERIFIED</w:t>
             </w:r>
           </w:p>
@@ -2483,8 +3548,12 @@
           <w:p>
             <w:pPr>
               <w:pStyle w:val="Compact"/>
-            </w:pPr>
-            <w:r>
+              <w:bidi/>
+            </w:pPr>
+            <w:r>
+              <w:rPr>
+                <w:rtl/>
+              </w:rPr>
               <w:t xml:space="preserve">Failure Modes</w:t>
             </w:r>
           </w:p>
@@ -2494,8 +3563,12 @@
           <w:p>
             <w:pPr>
               <w:pStyle w:val="Compact"/>
-            </w:pPr>
-            <w:r>
+              <w:bidi/>
+            </w:pPr>
+            <w:r>
+              <w:rPr>
+                <w:rtl/>
+              </w:rPr>
               <w:t xml:space="preserve">RUNTIME VERIFIED</w:t>
             </w:r>
           </w:p>
@@ -2507,8 +3580,12 @@
           <w:p>
             <w:pPr>
               <w:pStyle w:val="Compact"/>
-            </w:pPr>
-            <w:r>
+              <w:bidi/>
+            </w:pPr>
+            <w:r>
+              <w:rPr>
+                <w:rtl/>
+              </w:rPr>
               <w:t xml:space="preserve">Automated GET Test</w:t>
             </w:r>
           </w:p>
@@ -2518,8 +3595,12 @@
           <w:p>
             <w:pPr>
               <w:pStyle w:val="Compact"/>
-            </w:pPr>
-            <w:r>
+              <w:bidi/>
+            </w:pPr>
+            <w:r>
+              <w:rPr>
+                <w:rtl/>
+              </w:rPr>
               <w:t xml:space="preserve">RUNTIME VERIFIED</w:t>
             </w:r>
           </w:p>
@@ -2531,8 +3612,12 @@
           <w:p>
             <w:pPr>
               <w:pStyle w:val="Compact"/>
-            </w:pPr>
-            <w:r>
+              <w:bidi/>
+            </w:pPr>
+            <w:r>
+              <w:rPr>
+                <w:rtl/>
+              </w:rPr>
               <w:t xml:space="preserve">Full Automated CRUD Suite</w:t>
             </w:r>
           </w:p>
@@ -2542,8 +3627,12 @@
           <w:p>
             <w:pPr>
               <w:pStyle w:val="Compact"/>
-            </w:pPr>
-            <w:r>
+              <w:bidi/>
+            </w:pPr>
+            <w:r>
+              <w:rPr>
+                <w:rtl/>
+              </w:rPr>
               <w:t xml:space="preserve">NOT IMPLEMENTED / NOT CLAIMED</w:t>
             </w:r>
           </w:p>
@@ -2661,6 +3750,109 @@
       </w:pPr>
     </w:lvl>
   </w:abstractNum>
+  <w:abstractNum w:abstractNumId="991">
+    <w:nsid w:val="0000A991"/>
+    <w:multiLevelType w:val="multilevel"/>
+    <w:lvl w:ilvl="0">
+      <w:numFmt w:val="bullet"/>
+      <w:lvlText w:val=""/>
+      <w:lvlJc w:val="left"/>
+      <w:pPr>
+        <w:ind w:left="720" w:hanging="360"/>
+      </w:pPr>
+      <w:rPr>
+        <w:rFonts w:ascii="Symbol" w:hAnsi="Symbol" w:cs="Symbol" w:hint="default"/>
+      </w:rPr>
+    </w:lvl>
+    <w:lvl w:ilvl="1">
+      <w:numFmt w:val="bullet"/>
+      <w:lvlText w:val="o"/>
+      <w:lvlJc w:val="left"/>
+      <w:pPr>
+        <w:ind w:left="1440" w:hanging="360"/>
+      </w:pPr>
+      <w:rPr>
+        <w:rFonts w:ascii="Courier New" w:hAnsi="Courier New" w:cs="Courier New" w:hint="default"/>
+      </w:rPr>
+    </w:lvl>
+    <w:lvl w:ilvl="2">
+      <w:numFmt w:val="bullet"/>
+      <w:lvlText w:val=""/>
+      <w:lvlJc w:val="left"/>
+      <w:pPr>
+        <w:ind w:left="2160" w:hanging="360"/>
+      </w:pPr>
+      <w:rPr>
+        <w:rFonts w:ascii="Wingdings" w:hAnsi="Wingdings" w:cs="Wingdings" w:hint="default"/>
+      </w:rPr>
+    </w:lvl>
+    <w:lvl w:ilvl="3">
+      <w:numFmt w:val="bullet"/>
+      <w:lvlText w:val=""/>
+      <w:lvlJc w:val="left"/>
+      <w:pPr>
+        <w:ind w:left="2880" w:hanging="360"/>
+      </w:pPr>
+      <w:rPr>
+        <w:rFonts w:ascii="Symbol" w:hAnsi="Symbol" w:cs="Symbol" w:hint="default"/>
+      </w:rPr>
+    </w:lvl>
+    <w:lvl w:ilvl="4">
+      <w:numFmt w:val="bullet"/>
+      <w:lvlText w:val="o"/>
+      <w:lvlJc w:val="left"/>
+      <w:pPr>
+        <w:ind w:left="3600" w:hanging="360"/>
+      </w:pPr>
+      <w:rPr>
+        <w:rFonts w:ascii="Courier New" w:hAnsi="Courier New" w:cs="Courier New" w:hint="default"/>
+      </w:rPr>
+    </w:lvl>
+    <w:lvl w:ilvl="5">
+      <w:numFmt w:val="bullet"/>
+      <w:lvlText w:val=""/>
+      <w:lvlJc w:val="left"/>
+      <w:pPr>
+        <w:ind w:left="4320" w:hanging="360"/>
+      </w:pPr>
+      <w:rPr>
+        <w:rFonts w:ascii="Wingdings" w:hAnsi="Wingdings" w:cs="Wingdings" w:hint="default"/>
+      </w:rPr>
+    </w:lvl>
+    <w:lvl w:ilvl="6">
+      <w:numFmt w:val="bullet"/>
+      <w:lvlText w:val=""/>
+      <w:lvlJc w:val="left"/>
+      <w:pPr>
+        <w:ind w:left="5040" w:hanging="360"/>
+      </w:pPr>
+      <w:rPr>
+        <w:rFonts w:ascii="Symbol" w:hAnsi="Symbol" w:cs="Symbol" w:hint="default"/>
+      </w:rPr>
+    </w:lvl>
+    <w:lvl w:ilvl="7">
+      <w:numFmt w:val="bullet"/>
+      <w:lvlText w:val="o"/>
+      <w:lvlJc w:val="left"/>
+      <w:pPr>
+        <w:ind w:left="5760" w:hanging="360"/>
+      </w:pPr>
+      <w:rPr>
+        <w:rFonts w:ascii="Courier New" w:hAnsi="Courier New" w:cs="Courier New" w:hint="default"/>
+      </w:rPr>
+    </w:lvl>
+    <w:lvl w:ilvl="8">
+      <w:numFmt w:val="bullet"/>
+      <w:lvlText w:val=""/>
+      <w:lvlJc w:val="left"/>
+      <w:pPr>
+        <w:ind w:left="6480" w:hanging="360"/>
+      </w:pPr>
+      <w:rPr>
+        <w:rFonts w:ascii="Wingdings" w:hAnsi="Wingdings" w:cs="Wingdings" w:hint="default"/>
+      </w:rPr>
+    </w:lvl>
+  </w:abstractNum>
   <w:abstractNum w:abstractNumId="99411">
     <w:nsid w:val="00A99411"/>
     <w:multiLevelType w:val="multilevel"/>
@@ -2750,6 +3942,9 @@
     <w:abstractNumId w:val="990"/>
   </w:num>
   <w:num w:numId="1001">
+    <w:abstractNumId w:val="991"/>
+  </w:num>
+  <w:num w:numId="1002">
     <w:abstractNumId w:val="99411"/>
     <w:lvlOverride w:ilvl="0">
       <w:startOverride w:val="1"/>
@@ -2778,6 +3973,18 @@
     <w:lvlOverride w:ilvl="8">
       <w:startOverride w:val="1"/>
     </w:lvlOverride>
+  </w:num>
+  <w:num w:numId="1003">
+    <w:abstractNumId w:val="991"/>
+  </w:num>
+  <w:num w:numId="1004">
+    <w:abstractNumId w:val="991"/>
+  </w:num>
+  <w:num w:numId="1005">
+    <w:abstractNumId w:val="991"/>
+  </w:num>
+  <w:num w:numId="1006">
+    <w:abstractNumId w:val="991"/>
   </w:num>
 </w:numbering>
 </file>

</xml_diff>